<commit_message>
Updated favicon and commented out education section
</commit_message>
<xml_diff>
--- a/public/JARED MOGONCHI CV.docx
+++ b/public/JARED MOGONCHI CV.docx
@@ -3,6 +3,12 @@
 <w:document xmlns:wpc="http://schemas.microsoft.com/office/word/2010/wordprocessingCanvas" xmlns:cx="http://schemas.microsoft.com/office/drawing/2014/chartex" xmlns:cx1="http://schemas.microsoft.com/office/drawing/2015/9/8/chartex" xmlns:cx2="http://schemas.microsoft.com/office/drawing/2015/10/21/chartex" xmlns:cx3="http://schemas.microsoft.com/office/drawing/2016/5/9/chartex" xmlns:cx4="http://schemas.microsoft.com/office/drawing/2016/5/10/chartex" xmlns:cx5="http://schemas.microsoft.com/office/drawing/2016/5/11/chartex" xmlns:cx6="http://schemas.microsoft.com/office/drawing/2016/5/12/chartex" xmlns:cx7="http://schemas.microsoft.com/office/drawing/2016/5/13/chartex" xmlns:cx8="http://schemas.microsoft.com/office/drawing/2016/5/14/chartex" xmlns:mc="http://schemas.openxmlformats.org/markup-compatibility/2006" xmlns:aink="http://schemas.microsoft.com/office/drawing/2016/ink" xmlns:am3d="http://schemas.microsoft.com/office/drawing/2017/model3d" xmlns:o="urn:schemas-microsoft-com:office:office" xmlns:oel="http://schemas.microsoft.com/office/2019/extlst" xmlns:r="http://schemas.openxmlformats.org/officeDocument/2006/relationships" xmlns:m="http://schemas.openxmlformats.org/officeDocument/2006/math" xmlns:v="urn:schemas-microsoft-com:vml" xmlns:wp14="http://schemas.microsoft.com/office/word/2010/wordprocessingDrawing" xmlns:wp="http://schemas.openxmlformats.org/drawingml/2006/wordprocessingDrawing" xmlns:w10="urn:schemas-microsoft-com:office:word" xmlns:w="http://schemas.openxmlformats.org/wordprocessingml/2006/main" xmlns:w14="http://schemas.microsoft.com/office/word/2010/wordml" xmlns:w15="http://schemas.microsoft.com/office/word/2012/wordml" xmlns:w16cex="http://schemas.microsoft.com/office/word/2018/wordml/cex" xmlns:w16cid="http://schemas.microsoft.com/office/word/2016/wordml/cid" xmlns:w16="http://schemas.microsoft.com/office/word/2018/wordml" xmlns:w16du="http://schemas.microsoft.com/office/word/2023/wordml/word16du" xmlns:w16sdtdh="http://schemas.microsoft.com/office/word/2020/wordml/sdtdatahash" xmlns:w16sdtfl="http://schemas.microsoft.com/office/word/2024/wordml/sdtformatlock" xmlns:w16se="http://schemas.microsoft.com/office/word/2015/wordml/symex" xmlns:wpg="http://schemas.microsoft.com/office/word/2010/wordprocessingGroup" xmlns:wpi="http://schemas.microsoft.com/office/word/2010/wordprocessingInk" xmlns:wne="http://schemas.microsoft.com/office/word/2006/wordml" xmlns:wps="http://schemas.microsoft.com/office/word/2010/wordprocessingShape" mc:Ignorable="w14 w15 w16se w16cid w16 w16cex w16sdtdh w16sdtfl w16du wp14">
   <w:body>
     <w:p>
+      <w:pPr>
+        <w:rPr>
+          <w:b/>
+          <w:bCs/>
+        </w:rPr>
+      </w:pPr>
       <w:r>
         <w:rPr>
           <w:b/>
@@ -10,17 +16,35 @@
         </w:rPr>
         <w:t>JARED MOGONCHI</w:t>
       </w:r>
+    </w:p>
+    <w:p>
+      <w:r>
+        <w:t>Full-Stack Software Engineer | HealthTech &amp; Production Systems</w:t>
+      </w:r>
       <w:r>
         <w:br/>
         <w:t>Nairobi, Kenya</w:t>
       </w:r>
       <w:r>
         <w:br/>
-        <w:t>Email: ombongijared2@gmail.com</w:t>
-      </w:r>
-      <w:r>
-        <w:br/>
-        <w:t>Phone: 0710464858</w:t>
+      </w:r>
+      <w:r>
+        <w:rPr>
+          <w:rFonts w:ascii="Segoe UI Emoji" w:hAnsi="Segoe UI Emoji" w:cs="Segoe UI Emoji"/>
+        </w:rPr>
+        <w:t>📧</w:t>
+      </w:r>
+      <w:r>
+        <w:t xml:space="preserve"> ombongijared2@gmail.com | </w:t>
+      </w:r>
+      <w:r>
+        <w:rPr>
+          <w:rFonts w:ascii="Segoe UI Emoji" w:hAnsi="Segoe UI Emoji" w:cs="Segoe UI Emoji"/>
+        </w:rPr>
+        <w:t>📞</w:t>
+      </w:r>
+      <w:r>
+        <w:t xml:space="preserve"> 0710 464 858</w:t>
       </w:r>
       <w:r>
         <w:br/>
@@ -38,260 +62,568 @@
         <w:br/>
         <w:t>LinkedIn: linkedin.com/in/jared-ombongi-b9187127b</w:t>
       </w:r>
+      <w:r>
+        <w:br/>
+        <w:t xml:space="preserve">Portfolio: </w:t>
+      </w:r>
+      <w:hyperlink r:id="rId5" w:tgtFrame="_new" w:history="1">
+        <w:r>
+          <w:rPr>
+            <w:rStyle w:val="Hyperlink"/>
+          </w:rPr>
+          <w:t>https://folio-psi-flame.vercel.app</w:t>
+        </w:r>
+      </w:hyperlink>
     </w:p>
+    <w:p/>
     <w:p>
-      <w:r>
-        <w:pict w14:anchorId="64B19BF4">
-          <v:rect id="_x0000_i1055" style="width:0;height:1.5pt" o:hralign="center" o:hrstd="t" o:hr="t" fillcolor="#a0a0a0" stroked="f"/>
-        </w:pict>
-      </w:r>
-    </w:p>
-    <w:p>
-      <w:r>
+      <w:pPr>
         <w:rPr>
           <w:b/>
           <w:bCs/>
         </w:rPr>
-        <w:t>SUMMARY</w:t>
-      </w:r>
-      <w:r>
-        <w:br/>
-        <w:t>Full-stack developer skilled in React, Django, Node.js &amp; Express.js, and Python. Experienced in building real-world applications including ecommerce backends, rental systems, school management systems, and freelance client projects. Strong problem-solving ability and committed to delivering clean, efficient, and scalable solutions.</w:t>
-      </w:r>
-    </w:p>
-    <w:p>
-      <w:r>
-        <w:pict w14:anchorId="0CB8D129">
-          <v:rect id="_x0000_i1056" style="width:0;height:1.5pt" o:hralign="center" o:hrstd="t" o:hr="t" fillcolor="#a0a0a0" stroked="f"/>
-        </w:pict>
-      </w:r>
-    </w:p>
-    <w:p>
+      </w:pPr>
       <w:r>
         <w:rPr>
           <w:b/>
           <w:bCs/>
         </w:rPr>
-        <w:t>EDUCATION</w:t>
-      </w:r>
-      <w:r>
-        <w:br/>
-        <w:t>2025: Diploma in Information Technology - Kasarani Technical and Vocational College</w:t>
-      </w:r>
-      <w:r>
-        <w:br/>
-        <w:t>2022: KCSE - Huduma School</w:t>
+        <w:t>PROFESSIONAL SUMMARY</w:t>
       </w:r>
     </w:p>
     <w:p>
       <w:r>
-        <w:pict w14:anchorId="293CCC7D">
-          <v:rect id="_x0000_i1057" style="width:0;height:1.5pt" o:hralign="center" o:hrstd="t" o:hr="t" fillcolor="#a0a0a0" stroked="f"/>
-        </w:pict>
-      </w:r>
-    </w:p>
-    <w:p>
+        <w:t xml:space="preserve">Full-Stack Software Engineer with hands-on experience building </w:t>
+      </w:r>
       <w:r>
         <w:rPr>
           <w:b/>
           <w:bCs/>
         </w:rPr>
-        <w:t>SKILLS</w:t>
+        <w:t>secure, scalable, and production-grade systems</w:t>
+      </w:r>
+      <w:r>
+        <w:t xml:space="preserve"> across HealthTech, fintech, and business automation. Currently contributing to a blockchain-integrated healthcare platform, developing backend and frontend systems using </w:t>
+      </w:r>
+      <w:r>
+        <w:rPr>
+          <w:b/>
+          <w:bCs/>
+        </w:rPr>
+        <w:t>Spring Boot, Django, Node.js, and React</w:t>
+      </w:r>
+      <w:r>
+        <w:t>.</w:t>
       </w:r>
     </w:p>
     <w:p>
+      <w:r>
+        <w:t xml:space="preserve">Strong in </w:t>
+      </w:r>
+      <w:r>
+        <w:rPr>
+          <w:b/>
+          <w:bCs/>
+        </w:rPr>
+        <w:t>REST API design, system security, and production deployment</w:t>
+      </w:r>
+      <w:r>
+        <w:t xml:space="preserve">, with proven ability to design and maintain systems supporting multiple concurrent users while ensuring </w:t>
+      </w:r>
+      <w:r>
+        <w:rPr>
+          <w:b/>
+          <w:bCs/>
+        </w:rPr>
+        <w:t>performance, reliability, and data integrity</w:t>
+      </w:r>
+      <w:r>
+        <w:t>.</w:t>
+      </w:r>
+    </w:p>
+    <w:p/>
+    <w:p>
+      <w:pPr>
+        <w:rPr>
+          <w:b/>
+          <w:bCs/>
+        </w:rPr>
+      </w:pPr>
+      <w:r>
+        <w:rPr>
+          <w:b/>
+          <w:bCs/>
+        </w:rPr>
+        <w:t>TECHNICAL SKILLS</w:t>
+      </w:r>
+    </w:p>
+    <w:p>
+      <w:r>
+        <w:rPr>
+          <w:b/>
+          <w:bCs/>
+        </w:rPr>
+        <w:t>1. Frontend Development</w:t>
+      </w:r>
+      <w:r>
+        <w:br/>
+        <w:t>React.js (Advanced), JavaScript (ES6+), HTML5, CSS3</w:t>
+      </w:r>
+    </w:p>
+    <w:p>
       <w:pPr>
         <w:numPr>
           <w:ilvl w:val="0"/>
-          <w:numId w:val="1"/>
+          <w:numId w:val="20"/>
         </w:numPr>
       </w:pPr>
       <w:r>
-        <w:t>React</w:t>
+        <w:t xml:space="preserve">Build dynamic, responsive single-page applications </w:t>
       </w:r>
     </w:p>
     <w:p>
       <w:pPr>
         <w:numPr>
           <w:ilvl w:val="0"/>
-          <w:numId w:val="1"/>
+          <w:numId w:val="20"/>
         </w:numPr>
       </w:pPr>
       <w:r>
-        <w:t>Django</w:t>
+        <w:t xml:space="preserve">Create clean, user-friendly interfaces </w:t>
       </w:r>
     </w:p>
     <w:p>
+      <w:r>
+        <w:rPr>
+          <w:b/>
+          <w:bCs/>
+        </w:rPr>
+        <w:t>2. Backend &amp; Database</w:t>
+      </w:r>
+      <w:r>
+        <w:br/>
+        <w:t xml:space="preserve">Django (Advanced), </w:t>
+      </w:r>
+      <w:r>
+        <w:rPr>
+          <w:b/>
+          <w:bCs/>
+        </w:rPr>
+        <w:t>Spring Boot (Java)</w:t>
+      </w:r>
+      <w:r>
+        <w:t>, Node.js, Express.js, MySQL</w:t>
+      </w:r>
+    </w:p>
+    <w:p>
       <w:pPr>
         <w:numPr>
           <w:ilvl w:val="0"/>
-          <w:numId w:val="1"/>
+          <w:numId w:val="21"/>
         </w:numPr>
       </w:pPr>
       <w:r>
-        <w:t>Node.js &amp; Express.js</w:t>
+        <w:t xml:space="preserve">Design and develop secure REST APIs (Django &amp; Spring Boot) </w:t>
       </w:r>
     </w:p>
     <w:p>
       <w:pPr>
         <w:numPr>
           <w:ilvl w:val="0"/>
-          <w:numId w:val="1"/>
+          <w:numId w:val="21"/>
         </w:numPr>
       </w:pPr>
       <w:r>
-        <w:t>Python</w:t>
+        <w:t xml:space="preserve">Implement JWT authentication and role-based access control (RBAC) </w:t>
       </w:r>
     </w:p>
     <w:p>
       <w:pPr>
         <w:numPr>
           <w:ilvl w:val="0"/>
-          <w:numId w:val="1"/>
+          <w:numId w:val="21"/>
         </w:numPr>
       </w:pPr>
       <w:r>
-        <w:t>MySQL</w:t>
+        <w:t xml:space="preserve">Build scalable backend services for production systems </w:t>
       </w:r>
     </w:p>
     <w:p>
       <w:pPr>
         <w:numPr>
           <w:ilvl w:val="0"/>
-          <w:numId w:val="1"/>
+          <w:numId w:val="21"/>
         </w:numPr>
       </w:pPr>
       <w:r>
-        <w:t>REST APIs</w:t>
+        <w:t xml:space="preserve">Optimize database queries for performance </w:t>
       </w:r>
     </w:p>
     <w:p>
+      <w:r>
+        <w:rPr>
+          <w:b/>
+          <w:bCs/>
+        </w:rPr>
+        <w:t>3. Deployment &amp; Security</w:t>
+      </w:r>
+      <w:r>
+        <w:br/>
+        <w:t>VPS/Cloud Deployment, Linux, SSL/HTTPS, DNS Management</w:t>
+      </w:r>
+    </w:p>
+    <w:p>
       <w:pPr>
         <w:numPr>
           <w:ilvl w:val="0"/>
-          <w:numId w:val="1"/>
+          <w:numId w:val="22"/>
         </w:numPr>
       </w:pPr>
       <w:r>
-        <w:t>HTML &amp; CSS</w:t>
+        <w:lastRenderedPageBreak/>
+        <w:t xml:space="preserve">Deploy and maintain production systems </w:t>
       </w:r>
     </w:p>
     <w:p>
       <w:pPr>
         <w:numPr>
           <w:ilvl w:val="0"/>
-          <w:numId w:val="1"/>
+          <w:numId w:val="22"/>
         </w:numPr>
       </w:pPr>
       <w:r>
-        <w:t>Git</w:t>
+        <w:t xml:space="preserve">Implement secure access control and audit logging </w:t>
       </w:r>
     </w:p>
     <w:p>
+      <w:r>
+        <w:rPr>
+          <w:b/>
+          <w:bCs/>
+        </w:rPr>
+        <w:t>4. Additional Skills</w:t>
+      </w:r>
+      <w:r>
+        <w:br/>
+        <w:t>M-Pesa Integration, Blockchain Basics (Ethereum/Hyperledger), Git, Postman, Unit Testing</w:t>
+      </w:r>
+    </w:p>
+    <w:p>
       <w:pPr>
         <w:numPr>
           <w:ilvl w:val="0"/>
-          <w:numId w:val="1"/>
+          <w:numId w:val="23"/>
         </w:numPr>
       </w:pPr>
       <w:r>
-        <w:t>Deployment (cPanel, DNS, SSL)</w:t>
+        <w:t xml:space="preserve">Payment integrations and API testing </w:t>
       </w:r>
     </w:p>
     <w:p>
       <w:pPr>
         <w:numPr>
           <w:ilvl w:val="0"/>
-          <w:numId w:val="1"/>
+          <w:numId w:val="23"/>
         </w:numPr>
       </w:pPr>
       <w:r>
-        <w:t>Problem solving &amp; teamwork</w:t>
+        <w:t xml:space="preserve">Collaboration in team environments </w:t>
+      </w:r>
+    </w:p>
+    <w:p/>
+    <w:p>
+      <w:pPr>
+        <w:rPr>
+          <w:b/>
+          <w:bCs/>
+        </w:rPr>
+      </w:pPr>
+      <w:r>
+        <w:rPr>
+          <w:b/>
+          <w:bCs/>
+        </w:rPr>
+        <w:t>PROFESSIONAL EXPERIENCE</w:t>
       </w:r>
     </w:p>
     <w:p>
       <w:r>
-        <w:pict w14:anchorId="1C7DB2E6">
-          <v:rect id="_x0000_i1058" style="width:0;height:1.5pt" o:hralign="center" o:hrstd="t" o:hr="t" fillcolor="#a0a0a0" stroked="f"/>
-        </w:pict>
+        <w:rPr>
+          <w:b/>
+          <w:bCs/>
+        </w:rPr>
+        <w:t>Full-Stack Developer</w:t>
+      </w:r>
+      <w:r>
+        <w:br/>
+      </w:r>
+      <w:proofErr w:type="spellStart"/>
+      <w:r>
+        <w:rPr>
+          <w:i/>
+          <w:iCs/>
+        </w:rPr>
+        <w:t>MedicinaChain</w:t>
+      </w:r>
+      <w:proofErr w:type="spellEnd"/>
+      <w:r>
+        <w:rPr>
+          <w:i/>
+          <w:iCs/>
+        </w:rPr>
+        <w:t xml:space="preserve"> – HealthTech Startup | Nairobi, Kenya</w:t>
+      </w:r>
+      <w:r>
+        <w:br/>
+      </w:r>
+      <w:r>
+        <w:rPr>
+          <w:b/>
+          <w:bCs/>
+        </w:rPr>
+        <w:t>Jan 2026 – Present</w:t>
       </w:r>
     </w:p>
     <w:p>
+      <w:pPr>
+        <w:numPr>
+          <w:ilvl w:val="0"/>
+          <w:numId w:val="24"/>
+        </w:numPr>
+      </w:pPr>
+      <w:r>
+        <w:t xml:space="preserve">Contribute to development of a secure healthcare platform connecting patients, providers, and pharmacies </w:t>
+      </w:r>
+    </w:p>
+    <w:p>
+      <w:pPr>
+        <w:numPr>
+          <w:ilvl w:val="0"/>
+          <w:numId w:val="24"/>
+        </w:numPr>
+      </w:pPr>
+      <w:r>
+        <w:t xml:space="preserve">Build responsive frontend modules using React.js </w:t>
+      </w:r>
+    </w:p>
+    <w:p>
+      <w:pPr>
+        <w:numPr>
+          <w:ilvl w:val="0"/>
+          <w:numId w:val="24"/>
+        </w:numPr>
+      </w:pPr>
+      <w:r>
+        <w:t xml:space="preserve">Design and implement RESTful APIs using </w:t>
+      </w:r>
+      <w:r>
+        <w:rPr>
+          <w:b/>
+          <w:bCs/>
+        </w:rPr>
+        <w:t>Spring Boot, Django, and Node.js</w:t>
+      </w:r>
+      <w:r>
+        <w:t xml:space="preserve"> </w:t>
+      </w:r>
+    </w:p>
+    <w:p>
+      <w:pPr>
+        <w:numPr>
+          <w:ilvl w:val="0"/>
+          <w:numId w:val="24"/>
+        </w:numPr>
+      </w:pPr>
+      <w:r>
+        <w:t xml:space="preserve">Implement JWT-based authentication and role-based access control </w:t>
+      </w:r>
+    </w:p>
+    <w:p>
+      <w:pPr>
+        <w:numPr>
+          <w:ilvl w:val="0"/>
+          <w:numId w:val="24"/>
+        </w:numPr>
+      </w:pPr>
+      <w:r>
+        <w:t xml:space="preserve">Optimize backend performance for multi-user environments </w:t>
+      </w:r>
+    </w:p>
+    <w:p>
+      <w:pPr>
+        <w:numPr>
+          <w:ilvl w:val="0"/>
+          <w:numId w:val="24"/>
+        </w:numPr>
+      </w:pPr>
+      <w:r>
+        <w:t xml:space="preserve">Develop Python-based log monitoring tools for proactive error detection </w:t>
+      </w:r>
+    </w:p>
+    <w:p>
+      <w:pPr>
+        <w:numPr>
+          <w:ilvl w:val="0"/>
+          <w:numId w:val="24"/>
+        </w:numPr>
+      </w:pPr>
+      <w:r>
+        <w:t xml:space="preserve">Support production deployment, SSL configuration, and Linux server maintenance </w:t>
+      </w:r>
+    </w:p>
+    <w:p>
+      <w:pPr>
+        <w:numPr>
+          <w:ilvl w:val="0"/>
+          <w:numId w:val="24"/>
+        </w:numPr>
+      </w:pPr>
+      <w:r>
+        <w:t xml:space="preserve">Debug production issues and improve system reliability </w:t>
+      </w:r>
+    </w:p>
+    <w:p>
+      <w:r>
+        <w:rPr>
+          <w:b/>
+          <w:bCs/>
+        </w:rPr>
+        <w:t>Tech Stack:</w:t>
+      </w:r>
+      <w:r>
+        <w:t xml:space="preserve"> React.js, Django, </w:t>
+      </w:r>
+      <w:r>
+        <w:rPr>
+          <w:b/>
+          <w:bCs/>
+        </w:rPr>
+        <w:t>Spring Boot</w:t>
+      </w:r>
+      <w:r>
+        <w:t>, Node.js, MySQL, JWT, Linux</w:t>
+      </w:r>
+    </w:p>
+    <w:p/>
+    <w:p>
+      <w:r>
+        <w:rPr>
+          <w:b/>
+          <w:bCs/>
+        </w:rPr>
+        <w:t>Independent Full-Stack Developer</w:t>
+      </w:r>
+      <w:r>
+        <w:br/>
+      </w:r>
+      <w:r>
+        <w:rPr>
+          <w:i/>
+          <w:iCs/>
+        </w:rPr>
+        <w:t>Freelance &amp; Contract Projects</w:t>
+      </w:r>
+      <w:r>
+        <w:br/>
+      </w:r>
+      <w:r>
+        <w:rPr>
+          <w:b/>
+          <w:bCs/>
+        </w:rPr>
+        <w:t>Jan 2023 – Oct 2025</w:t>
+      </w:r>
+    </w:p>
+    <w:p>
+      <w:proofErr w:type="spellStart"/>
+      <w:r>
+        <w:rPr>
+          <w:b/>
+          <w:bCs/>
+        </w:rPr>
+        <w:t>NyumbaLink</w:t>
+      </w:r>
+      <w:proofErr w:type="spellEnd"/>
+      <w:r>
+        <w:rPr>
+          <w:b/>
+          <w:bCs/>
+        </w:rPr>
+        <w:t xml:space="preserve"> – Rental Management Platform</w:t>
+      </w:r>
+    </w:p>
+    <w:p>
+      <w:pPr>
+        <w:numPr>
+          <w:ilvl w:val="0"/>
+          <w:numId w:val="25"/>
+        </w:numPr>
+      </w:pPr>
+      <w:r>
+        <w:t xml:space="preserve">Architected and developed a full property management system </w:t>
+      </w:r>
+    </w:p>
+    <w:p>
+      <w:pPr>
+        <w:numPr>
+          <w:ilvl w:val="0"/>
+          <w:numId w:val="25"/>
+        </w:numPr>
+      </w:pPr>
+      <w:r>
+        <w:t xml:space="preserve">Implemented role-based access control and secure REST APIs </w:t>
+      </w:r>
+    </w:p>
+    <w:p>
+      <w:proofErr w:type="spellStart"/>
       <w:r>
         <w:rPr>
           <w:b/>
           <w:bCs/>
         </w:rPr>
         <w:lastRenderedPageBreak/>
-        <w:t>WORK HISTORY</w:t>
-      </w:r>
-    </w:p>
-    <w:p>
+        <w:t>Omilife</w:t>
+      </w:r>
+      <w:proofErr w:type="spellEnd"/>
       <w:r>
         <w:rPr>
           <w:b/>
           <w:bCs/>
         </w:rPr>
-        <w:t>Freelance Full Stack Developer</w:t>
-      </w:r>
-      <w:r>
-        <w:br/>
-        <w:t>2023 - Present</w:t>
+        <w:t xml:space="preserve"> Web Platform</w:t>
       </w:r>
     </w:p>
     <w:p>
       <w:pPr>
         <w:numPr>
           <w:ilvl w:val="0"/>
-          <w:numId w:val="2"/>
+          <w:numId w:val="26"/>
         </w:numPr>
       </w:pPr>
       <w:r>
-        <w:t>Developed custom systems for clients</w:t>
+        <w:t xml:space="preserve">Built a production-ready e-commerce and automation platform </w:t>
       </w:r>
     </w:p>
     <w:p>
       <w:pPr>
         <w:numPr>
           <w:ilvl w:val="0"/>
-          <w:numId w:val="2"/>
+          <w:numId w:val="26"/>
         </w:numPr>
       </w:pPr>
       <w:r>
-        <w:t>Built full-stack apps using React, Django, Node.js, MySQL</w:t>
+        <w:t xml:space="preserve">Developed authentication systems and automated workflows </w:t>
       </w:r>
     </w:p>
     <w:p>
       <w:pPr>
         <w:numPr>
           <w:ilvl w:val="0"/>
-          <w:numId w:val="2"/>
+          <w:numId w:val="26"/>
         </w:numPr>
       </w:pPr>
       <w:r>
-        <w:t>Deployed projects on cPanel</w:t>
-      </w:r>
-    </w:p>
-    <w:p>
-      <w:pPr>
-        <w:numPr>
-          <w:ilvl w:val="0"/>
-          <w:numId w:val="2"/>
-        </w:numPr>
-      </w:pPr>
-      <w:r>
-        <w:t>Troubleshot frontend and backend issues</w:t>
-      </w:r>
-    </w:p>
-    <w:p>
-      <w:pPr>
-        <w:numPr>
-          <w:ilvl w:val="0"/>
-          <w:numId w:val="2"/>
-        </w:numPr>
-      </w:pPr>
-      <w:r>
-        <w:t>Delivered functional, client-ready solutions</w:t>
+        <w:t xml:space="preserve">Created REST APIs for internal and third-party integrations </w:t>
       </w:r>
     </w:p>
     <w:p>
@@ -300,228 +632,183 @@
           <w:b/>
           <w:bCs/>
         </w:rPr>
-        <w:t xml:space="preserve">Backend Developer - </w:t>
-      </w:r>
-      <w:proofErr w:type="spellStart"/>
+        <w:t>Hardware Store POS &amp; Inventory Management System</w:t>
+      </w:r>
+    </w:p>
+    <w:p>
+      <w:pPr>
+        <w:numPr>
+          <w:ilvl w:val="0"/>
+          <w:numId w:val="27"/>
+        </w:numPr>
+      </w:pPr>
+      <w:r>
+        <w:t xml:space="preserve">Engineered an offline-first POS with inventory tracking and stock automation </w:t>
+      </w:r>
+    </w:p>
+    <w:p>
+      <w:pPr>
+        <w:numPr>
+          <w:ilvl w:val="0"/>
+          <w:numId w:val="27"/>
+        </w:numPr>
+      </w:pPr>
+      <w:r>
+        <w:t xml:space="preserve">Integrated M-Pesa Till payment verification for transaction reconciliation </w:t>
+      </w:r>
+    </w:p>
+    <w:p>
+      <w:pPr>
+        <w:numPr>
+          <w:ilvl w:val="0"/>
+          <w:numId w:val="27"/>
+        </w:numPr>
+      </w:pPr>
+      <w:r>
+        <w:t xml:space="preserve">Implemented multi-branch reporting, user roles, and audit logging </w:t>
+      </w:r>
+    </w:p>
+    <w:p>
       <w:r>
         <w:rPr>
           <w:b/>
           <w:bCs/>
         </w:rPr>
-        <w:t>Omilife</w:t>
-      </w:r>
-      <w:proofErr w:type="spellEnd"/>
-      <w:r>
+        <w:t>Tech Stack:</w:t>
+      </w:r>
+      <w:r>
+        <w:t xml:space="preserve"> React.js, Django, Node.js, Python, MySQL, REST APIs</w:t>
+      </w:r>
+    </w:p>
+    <w:p/>
+    <w:p>
+      <w:pPr>
         <w:rPr>
           <w:b/>
           <w:bCs/>
         </w:rPr>
-        <w:t xml:space="preserve"> (Django API)</w:t>
-      </w:r>
-      <w:r>
-        <w:br/>
-        <w:t>2024 - 2025</w:t>
-      </w:r>
-    </w:p>
-    <w:p>
-      <w:pPr>
-        <w:numPr>
-          <w:ilvl w:val="0"/>
-          <w:numId w:val="3"/>
-        </w:numPr>
-      </w:pPr>
-      <w:r>
-        <w:t>Built and deployed Django backend</w:t>
-      </w:r>
-    </w:p>
-    <w:p>
-      <w:pPr>
-        <w:numPr>
-          <w:ilvl w:val="0"/>
-          <w:numId w:val="3"/>
-        </w:numPr>
-      </w:pPr>
-      <w:r>
-        <w:t>Created APIs for orders and notifications</w:t>
-      </w:r>
-    </w:p>
-    <w:p>
-      <w:pPr>
-        <w:numPr>
-          <w:ilvl w:val="0"/>
-          <w:numId w:val="3"/>
-        </w:numPr>
-      </w:pPr>
-      <w:r>
-        <w:t>Fixed 503, DNS, SSL, and routing issues</w:t>
-      </w:r>
-    </w:p>
-    <w:p>
-      <w:pPr>
-        <w:numPr>
-          <w:ilvl w:val="0"/>
-          <w:numId w:val="3"/>
-        </w:numPr>
-      </w:pPr>
-      <w:r>
-        <w:t>Improved API stability and communication</w:t>
-      </w:r>
-    </w:p>
-    <w:p>
+      </w:pPr>
       <w:r>
         <w:rPr>
           <w:b/>
           <w:bCs/>
         </w:rPr>
-        <w:t xml:space="preserve">Full Stack Developer - </w:t>
-      </w:r>
-      <w:proofErr w:type="spellStart"/>
-      <w:r>
+        <w:t>KEY ACHIEVEMENTS</w:t>
+      </w:r>
+    </w:p>
+    <w:p>
+      <w:pPr>
+        <w:numPr>
+          <w:ilvl w:val="0"/>
+          <w:numId w:val="28"/>
+        </w:numPr>
+      </w:pPr>
+      <w:r>
+        <w:t xml:space="preserve">Transitioned from freelance developer to full-time HealthTech engineer </w:t>
+      </w:r>
+    </w:p>
+    <w:p>
+      <w:pPr>
+        <w:numPr>
+          <w:ilvl w:val="0"/>
+          <w:numId w:val="28"/>
+        </w:numPr>
+      </w:pPr>
+      <w:r>
+        <w:t xml:space="preserve">Contributed to blockchain-enabled healthcare systems with secure architecture </w:t>
+      </w:r>
+    </w:p>
+    <w:p>
+      <w:pPr>
+        <w:numPr>
+          <w:ilvl w:val="0"/>
+          <w:numId w:val="28"/>
+        </w:numPr>
+      </w:pPr>
+      <w:r>
+        <w:t xml:space="preserve">Built and deployed multiple production-grade full-stack applications independently </w:t>
+      </w:r>
+    </w:p>
+    <w:p>
+      <w:pPr>
+        <w:numPr>
+          <w:ilvl w:val="0"/>
+          <w:numId w:val="28"/>
+        </w:numPr>
+      </w:pPr>
+      <w:r>
+        <w:t xml:space="preserve">Integrated M-Pesa payment systems into commercial platforms </w:t>
+      </w:r>
+    </w:p>
+    <w:p>
+      <w:pPr>
+        <w:numPr>
+          <w:ilvl w:val="0"/>
+          <w:numId w:val="28"/>
+        </w:numPr>
+      </w:pPr>
+      <w:r>
+        <w:t xml:space="preserve">Maintained high-availability production environments </w:t>
+      </w:r>
+    </w:p>
+    <w:p/>
+    <w:p>
+      <w:pPr>
         <w:rPr>
           <w:b/>
           <w:bCs/>
         </w:rPr>
-        <w:t>NyumbaLink</w:t>
-      </w:r>
-      <w:proofErr w:type="spellEnd"/>
+      </w:pPr>
       <w:r>
         <w:rPr>
           <w:b/>
           <w:bCs/>
         </w:rPr>
-        <w:t xml:space="preserve"> System</w:t>
-      </w:r>
-      <w:r>
-        <w:br/>
-        <w:t>2024 - Present</w:t>
+        <w:t>EDUCATION &amp; CERTIFICATIONS</w:t>
       </w:r>
     </w:p>
     <w:p>
-      <w:pPr>
-        <w:numPr>
-          <w:ilvl w:val="0"/>
-          <w:numId w:val="4"/>
-        </w:numPr>
-      </w:pPr>
-      <w:r>
-        <w:t>Built rental/property management platform</w:t>
+      <w:r>
+        <w:t>Diploma in Information Technology – Kasarani Technical and Vocational College (2025)</w:t>
+      </w:r>
+      <w:r>
+        <w:br/>
+        <w:t>Cybersecurity Fundamentals – Cisco Networking Academy (2024)</w:t>
+      </w:r>
+      <w:r>
+        <w:br/>
+        <w:t>Kenya Certificate of Secondary Education (KCSE) – Huduma School (2021)</w:t>
       </w:r>
     </w:p>
+    <w:p/>
     <w:p>
       <w:pPr>
-        <w:numPr>
-          <w:ilvl w:val="0"/>
-          <w:numId w:val="4"/>
-        </w:numPr>
-      </w:pPr>
-      <w:r>
-        <w:t>Implemented CRUD for rentals, tenants, payments</w:t>
-      </w:r>
-    </w:p>
-    <w:p>
-      <w:pPr>
-        <w:numPr>
-          <w:ilvl w:val="0"/>
-          <w:numId w:val="4"/>
-        </w:numPr>
-      </w:pPr>
-      <w:r>
-        <w:t>Developed frontend and backend API integration</w:t>
-      </w:r>
-    </w:p>
-    <w:p>
-      <w:pPr>
-        <w:numPr>
-          <w:ilvl w:val="0"/>
-          <w:numId w:val="4"/>
-        </w:numPr>
-      </w:pPr>
-      <w:r>
-        <w:t>Enhanced system usability and performance</w:t>
-      </w:r>
-    </w:p>
-    <w:p>
-      <w:r>
         <w:rPr>
           <w:b/>
           <w:bCs/>
         </w:rPr>
-        <w:t>Full Stack Developer - School Management System</w:t>
-      </w:r>
-      <w:r>
-        <w:br/>
-        <w:t>202</w:t>
-      </w:r>
-      <w:r>
-        <w:t>5</w:t>
-      </w:r>
-      <w:r>
-        <w:t xml:space="preserve"> </w:t>
-      </w:r>
-    </w:p>
-    <w:p>
-      <w:pPr>
-        <w:numPr>
-          <w:ilvl w:val="0"/>
-          <w:numId w:val="5"/>
-        </w:numPr>
-      </w:pPr>
-      <w:r>
-        <w:t>Built student registration and records module</w:t>
-      </w:r>
-    </w:p>
-    <w:p>
-      <w:pPr>
-        <w:numPr>
-          <w:ilvl w:val="0"/>
-          <w:numId w:val="5"/>
-        </w:numPr>
-      </w:pPr>
-      <w:r>
-        <w:t>Developed fee tracking and class management</w:t>
-      </w:r>
-    </w:p>
-    <w:p>
-      <w:pPr>
-        <w:numPr>
-          <w:ilvl w:val="0"/>
-          <w:numId w:val="5"/>
-        </w:numPr>
-      </w:pPr>
-      <w:r>
-        <w:t>Created admin and teacher dashboards</w:t>
-      </w:r>
-    </w:p>
-    <w:p>
-      <w:pPr>
-        <w:numPr>
-          <w:ilvl w:val="0"/>
-          <w:numId w:val="5"/>
-        </w:numPr>
-      </w:pPr>
-      <w:r>
-        <w:t>Improved school data organization</w:t>
-      </w:r>
-    </w:p>
-    <w:p>
-      <w:r>
-        <w:pict w14:anchorId="1D44F314">
-          <v:rect id="_x0000_i1059" style="width:0;height:1.5pt" o:hralign="center" o:hrstd="t" o:hr="t" fillcolor="#a0a0a0" stroked="f"/>
-        </w:pict>
-      </w:r>
-    </w:p>
-    <w:p>
+      </w:pPr>
       <w:r>
         <w:rPr>
           <w:b/>
           <w:bCs/>
         </w:rPr>
-        <w:lastRenderedPageBreak/>
-        <w:t>REFEREES</w:t>
-      </w:r>
-      <w:r>
-        <w:br/>
-        <w:t>Available upon request</w:t>
+        <w:t>CAREER OBJECTIVE</w:t>
+      </w:r>
+    </w:p>
+    <w:p>
+      <w:r>
+        <w:t xml:space="preserve">To architect and deliver secure, scalable, and high-performance systems that solve real-world healthcare and business challenges, while advancing expertise in </w:t>
+      </w:r>
+      <w:r>
+        <w:rPr>
+          <w:b/>
+          <w:bCs/>
+        </w:rPr>
+        <w:t>full-stack engineering, Spring Boot enterprise systems, infrastructure, and secure system architecture</w:t>
+      </w:r>
+      <w:r>
+        <w:t>.</w:t>
       </w:r>
     </w:p>
     <w:p/>
@@ -538,9 +825,9 @@
 <file path=word/numbering.xml><?xml version="1.0" encoding="utf-8"?>
 <w:numbering xmlns:wpc="http://schemas.microsoft.com/office/word/2010/wordprocessingCanvas" xmlns:cx="http://schemas.microsoft.com/office/drawing/2014/chartex" xmlns:cx1="http://schemas.microsoft.com/office/drawing/2015/9/8/chartex" xmlns:cx2="http://schemas.microsoft.com/office/drawing/2015/10/21/chartex" xmlns:cx3="http://schemas.microsoft.com/office/drawing/2016/5/9/chartex" xmlns:cx4="http://schemas.microsoft.com/office/drawing/2016/5/10/chartex" xmlns:cx5="http://schemas.microsoft.com/office/drawing/2016/5/11/chartex" xmlns:cx6="http://schemas.microsoft.com/office/drawing/2016/5/12/chartex" xmlns:cx7="http://schemas.microsoft.com/office/drawing/2016/5/13/chartex" xmlns:cx8="http://schemas.microsoft.com/office/drawing/2016/5/14/chartex" xmlns:mc="http://schemas.openxmlformats.org/markup-compatibility/2006" xmlns:aink="http://schemas.microsoft.com/office/drawing/2016/ink" xmlns:am3d="http://schemas.microsoft.com/office/drawing/2017/model3d" xmlns:o="urn:schemas-microsoft-com:office:office" xmlns:oel="http://schemas.microsoft.com/office/2019/extlst" xmlns:r="http://schemas.openxmlformats.org/officeDocument/2006/relationships" xmlns:m="http://schemas.openxmlformats.org/officeDocument/2006/math" xmlns:v="urn:schemas-microsoft-com:vml" xmlns:wp14="http://schemas.microsoft.com/office/word/2010/wordprocessingDrawing" xmlns:wp="http://schemas.openxmlformats.org/drawingml/2006/wordprocessingDrawing" xmlns:w10="urn:schemas-microsoft-com:office:word" xmlns:w="http://schemas.openxmlformats.org/wordprocessingml/2006/main" xmlns:w14="http://schemas.microsoft.com/office/word/2010/wordml" xmlns:w15="http://schemas.microsoft.com/office/word/2012/wordml" xmlns:w16cex="http://schemas.microsoft.com/office/word/2018/wordml/cex" xmlns:w16cid="http://schemas.microsoft.com/office/word/2016/wordml/cid" xmlns:w16="http://schemas.microsoft.com/office/word/2018/wordml" xmlns:w16du="http://schemas.microsoft.com/office/word/2023/wordml/word16du" xmlns:w16sdtdh="http://schemas.microsoft.com/office/word/2020/wordml/sdtdatahash" xmlns:w16sdtfl="http://schemas.microsoft.com/office/word/2024/wordml/sdtformatlock" xmlns:w16se="http://schemas.microsoft.com/office/word/2015/wordml/symex" xmlns:wpg="http://schemas.microsoft.com/office/word/2010/wordprocessingGroup" xmlns:wpi="http://schemas.microsoft.com/office/word/2010/wordprocessingInk" xmlns:wne="http://schemas.microsoft.com/office/word/2006/wordml" xmlns:wps="http://schemas.microsoft.com/office/word/2010/wordprocessingShape" mc:Ignorable="w14 w15 w16se w16cid w16 w16cex w16sdtdh w16sdtfl w16du wp14">
   <w:abstractNum w:abstractNumId="0" w15:restartNumberingAfterBreak="0">
-    <w:nsid w:val="139E44A9"/>
+    <w:nsid w:val="00671E43"/>
     <w:multiLevelType w:val="multilevel"/>
-    <w:tmpl w:val="B038F748"/>
+    <w:tmpl w:val="58FE8B7A"/>
     <w:lvl w:ilvl="0">
       <w:start w:val="1"/>
       <w:numFmt w:val="bullet"/>
@@ -687,9 +974,9 @@
     </w:lvl>
   </w:abstractNum>
   <w:abstractNum w:abstractNumId="1" w15:restartNumberingAfterBreak="0">
-    <w:nsid w:val="27EB1F6F"/>
+    <w:nsid w:val="051A699B"/>
     <w:multiLevelType w:val="multilevel"/>
-    <w:tmpl w:val="5B9E18AA"/>
+    <w:tmpl w:val="630C5C42"/>
     <w:lvl w:ilvl="0">
       <w:start w:val="1"/>
       <w:numFmt w:val="bullet"/>
@@ -836,9 +1123,9 @@
     </w:lvl>
   </w:abstractNum>
   <w:abstractNum w:abstractNumId="2" w15:restartNumberingAfterBreak="0">
-    <w:nsid w:val="6AE8175A"/>
+    <w:nsid w:val="0A1F05BF"/>
     <w:multiLevelType w:val="multilevel"/>
-    <w:tmpl w:val="1EA065E8"/>
+    <w:tmpl w:val="4A228CFC"/>
     <w:lvl w:ilvl="0">
       <w:start w:val="1"/>
       <w:numFmt w:val="bullet"/>
@@ -985,9 +1272,9 @@
     </w:lvl>
   </w:abstractNum>
   <w:abstractNum w:abstractNumId="3" w15:restartNumberingAfterBreak="0">
-    <w:nsid w:val="7A7E0EC9"/>
+    <w:nsid w:val="0A324A4B"/>
     <w:multiLevelType w:val="multilevel"/>
-    <w:tmpl w:val="B8169D62"/>
+    <w:tmpl w:val="E9EEDC5A"/>
     <w:lvl w:ilvl="0">
       <w:start w:val="1"/>
       <w:numFmt w:val="bullet"/>
@@ -1134,9 +1421,9 @@
     </w:lvl>
   </w:abstractNum>
   <w:abstractNum w:abstractNumId="4" w15:restartNumberingAfterBreak="0">
-    <w:nsid w:val="7D1E320A"/>
+    <w:nsid w:val="0F585933"/>
     <w:multiLevelType w:val="multilevel"/>
-    <w:tmpl w:val="DA3019C4"/>
+    <w:tmpl w:val="86BC72C4"/>
     <w:lvl w:ilvl="0">
       <w:start w:val="1"/>
       <w:numFmt w:val="bullet"/>
@@ -1282,20 +1569,3516 @@
       </w:rPr>
     </w:lvl>
   </w:abstractNum>
-  <w:num w:numId="1" w16cid:durableId="288322273">
+  <w:abstractNum w:abstractNumId="5" w15:restartNumberingAfterBreak="0">
+    <w:nsid w:val="119C2EBA"/>
+    <w:multiLevelType w:val="multilevel"/>
+    <w:tmpl w:val="ABB857C4"/>
+    <w:lvl w:ilvl="0">
+      <w:start w:val="1"/>
+      <w:numFmt w:val="bullet"/>
+      <w:lvlText w:val=""/>
+      <w:lvlJc w:val="left"/>
+      <w:pPr>
+        <w:tabs>
+          <w:tab w:val="num" w:pos="720"/>
+        </w:tabs>
+        <w:ind w:left="720" w:hanging="360"/>
+      </w:pPr>
+      <w:rPr>
+        <w:rFonts w:ascii="Symbol" w:hAnsi="Symbol" w:hint="default"/>
+        <w:sz w:val="20"/>
+      </w:rPr>
+    </w:lvl>
+    <w:lvl w:ilvl="1" w:tentative="1">
+      <w:start w:val="1"/>
+      <w:numFmt w:val="bullet"/>
+      <w:lvlText w:val="o"/>
+      <w:lvlJc w:val="left"/>
+      <w:pPr>
+        <w:tabs>
+          <w:tab w:val="num" w:pos="1440"/>
+        </w:tabs>
+        <w:ind w:left="1440" w:hanging="360"/>
+      </w:pPr>
+      <w:rPr>
+        <w:rFonts w:ascii="Courier New" w:hAnsi="Courier New" w:hint="default"/>
+        <w:sz w:val="20"/>
+      </w:rPr>
+    </w:lvl>
+    <w:lvl w:ilvl="2" w:tentative="1">
+      <w:start w:val="1"/>
+      <w:numFmt w:val="bullet"/>
+      <w:lvlText w:val=""/>
+      <w:lvlJc w:val="left"/>
+      <w:pPr>
+        <w:tabs>
+          <w:tab w:val="num" w:pos="2160"/>
+        </w:tabs>
+        <w:ind w:left="2160" w:hanging="360"/>
+      </w:pPr>
+      <w:rPr>
+        <w:rFonts w:ascii="Wingdings" w:hAnsi="Wingdings" w:hint="default"/>
+        <w:sz w:val="20"/>
+      </w:rPr>
+    </w:lvl>
+    <w:lvl w:ilvl="3" w:tentative="1">
+      <w:start w:val="1"/>
+      <w:numFmt w:val="bullet"/>
+      <w:lvlText w:val=""/>
+      <w:lvlJc w:val="left"/>
+      <w:pPr>
+        <w:tabs>
+          <w:tab w:val="num" w:pos="2880"/>
+        </w:tabs>
+        <w:ind w:left="2880" w:hanging="360"/>
+      </w:pPr>
+      <w:rPr>
+        <w:rFonts w:ascii="Wingdings" w:hAnsi="Wingdings" w:hint="default"/>
+        <w:sz w:val="20"/>
+      </w:rPr>
+    </w:lvl>
+    <w:lvl w:ilvl="4" w:tentative="1">
+      <w:start w:val="1"/>
+      <w:numFmt w:val="bullet"/>
+      <w:lvlText w:val=""/>
+      <w:lvlJc w:val="left"/>
+      <w:pPr>
+        <w:tabs>
+          <w:tab w:val="num" w:pos="3600"/>
+        </w:tabs>
+        <w:ind w:left="3600" w:hanging="360"/>
+      </w:pPr>
+      <w:rPr>
+        <w:rFonts w:ascii="Wingdings" w:hAnsi="Wingdings" w:hint="default"/>
+        <w:sz w:val="20"/>
+      </w:rPr>
+    </w:lvl>
+    <w:lvl w:ilvl="5" w:tentative="1">
+      <w:start w:val="1"/>
+      <w:numFmt w:val="bullet"/>
+      <w:lvlText w:val=""/>
+      <w:lvlJc w:val="left"/>
+      <w:pPr>
+        <w:tabs>
+          <w:tab w:val="num" w:pos="4320"/>
+        </w:tabs>
+        <w:ind w:left="4320" w:hanging="360"/>
+      </w:pPr>
+      <w:rPr>
+        <w:rFonts w:ascii="Wingdings" w:hAnsi="Wingdings" w:hint="default"/>
+        <w:sz w:val="20"/>
+      </w:rPr>
+    </w:lvl>
+    <w:lvl w:ilvl="6" w:tentative="1">
+      <w:start w:val="1"/>
+      <w:numFmt w:val="bullet"/>
+      <w:lvlText w:val=""/>
+      <w:lvlJc w:val="left"/>
+      <w:pPr>
+        <w:tabs>
+          <w:tab w:val="num" w:pos="5040"/>
+        </w:tabs>
+        <w:ind w:left="5040" w:hanging="360"/>
+      </w:pPr>
+      <w:rPr>
+        <w:rFonts w:ascii="Wingdings" w:hAnsi="Wingdings" w:hint="default"/>
+        <w:sz w:val="20"/>
+      </w:rPr>
+    </w:lvl>
+    <w:lvl w:ilvl="7" w:tentative="1">
+      <w:start w:val="1"/>
+      <w:numFmt w:val="bullet"/>
+      <w:lvlText w:val=""/>
+      <w:lvlJc w:val="left"/>
+      <w:pPr>
+        <w:tabs>
+          <w:tab w:val="num" w:pos="5760"/>
+        </w:tabs>
+        <w:ind w:left="5760" w:hanging="360"/>
+      </w:pPr>
+      <w:rPr>
+        <w:rFonts w:ascii="Wingdings" w:hAnsi="Wingdings" w:hint="default"/>
+        <w:sz w:val="20"/>
+      </w:rPr>
+    </w:lvl>
+    <w:lvl w:ilvl="8" w:tentative="1">
+      <w:start w:val="1"/>
+      <w:numFmt w:val="bullet"/>
+      <w:lvlText w:val=""/>
+      <w:lvlJc w:val="left"/>
+      <w:pPr>
+        <w:tabs>
+          <w:tab w:val="num" w:pos="6480"/>
+        </w:tabs>
+        <w:ind w:left="6480" w:hanging="360"/>
+      </w:pPr>
+      <w:rPr>
+        <w:rFonts w:ascii="Wingdings" w:hAnsi="Wingdings" w:hint="default"/>
+        <w:sz w:val="20"/>
+      </w:rPr>
+    </w:lvl>
+  </w:abstractNum>
+  <w:abstractNum w:abstractNumId="6" w15:restartNumberingAfterBreak="0">
+    <w:nsid w:val="17B65EDC"/>
+    <w:multiLevelType w:val="multilevel"/>
+    <w:tmpl w:val="C2DE6FBA"/>
+    <w:lvl w:ilvl="0">
+      <w:start w:val="1"/>
+      <w:numFmt w:val="bullet"/>
+      <w:lvlText w:val=""/>
+      <w:lvlJc w:val="left"/>
+      <w:pPr>
+        <w:tabs>
+          <w:tab w:val="num" w:pos="720"/>
+        </w:tabs>
+        <w:ind w:left="720" w:hanging="360"/>
+      </w:pPr>
+      <w:rPr>
+        <w:rFonts w:ascii="Symbol" w:hAnsi="Symbol" w:hint="default"/>
+        <w:sz w:val="20"/>
+      </w:rPr>
+    </w:lvl>
+    <w:lvl w:ilvl="1" w:tentative="1">
+      <w:start w:val="1"/>
+      <w:numFmt w:val="bullet"/>
+      <w:lvlText w:val="o"/>
+      <w:lvlJc w:val="left"/>
+      <w:pPr>
+        <w:tabs>
+          <w:tab w:val="num" w:pos="1440"/>
+        </w:tabs>
+        <w:ind w:left="1440" w:hanging="360"/>
+      </w:pPr>
+      <w:rPr>
+        <w:rFonts w:ascii="Courier New" w:hAnsi="Courier New" w:hint="default"/>
+        <w:sz w:val="20"/>
+      </w:rPr>
+    </w:lvl>
+    <w:lvl w:ilvl="2" w:tentative="1">
+      <w:start w:val="1"/>
+      <w:numFmt w:val="bullet"/>
+      <w:lvlText w:val=""/>
+      <w:lvlJc w:val="left"/>
+      <w:pPr>
+        <w:tabs>
+          <w:tab w:val="num" w:pos="2160"/>
+        </w:tabs>
+        <w:ind w:left="2160" w:hanging="360"/>
+      </w:pPr>
+      <w:rPr>
+        <w:rFonts w:ascii="Wingdings" w:hAnsi="Wingdings" w:hint="default"/>
+        <w:sz w:val="20"/>
+      </w:rPr>
+    </w:lvl>
+    <w:lvl w:ilvl="3" w:tentative="1">
+      <w:start w:val="1"/>
+      <w:numFmt w:val="bullet"/>
+      <w:lvlText w:val=""/>
+      <w:lvlJc w:val="left"/>
+      <w:pPr>
+        <w:tabs>
+          <w:tab w:val="num" w:pos="2880"/>
+        </w:tabs>
+        <w:ind w:left="2880" w:hanging="360"/>
+      </w:pPr>
+      <w:rPr>
+        <w:rFonts w:ascii="Wingdings" w:hAnsi="Wingdings" w:hint="default"/>
+        <w:sz w:val="20"/>
+      </w:rPr>
+    </w:lvl>
+    <w:lvl w:ilvl="4" w:tentative="1">
+      <w:start w:val="1"/>
+      <w:numFmt w:val="bullet"/>
+      <w:lvlText w:val=""/>
+      <w:lvlJc w:val="left"/>
+      <w:pPr>
+        <w:tabs>
+          <w:tab w:val="num" w:pos="3600"/>
+        </w:tabs>
+        <w:ind w:left="3600" w:hanging="360"/>
+      </w:pPr>
+      <w:rPr>
+        <w:rFonts w:ascii="Wingdings" w:hAnsi="Wingdings" w:hint="default"/>
+        <w:sz w:val="20"/>
+      </w:rPr>
+    </w:lvl>
+    <w:lvl w:ilvl="5" w:tentative="1">
+      <w:start w:val="1"/>
+      <w:numFmt w:val="bullet"/>
+      <w:lvlText w:val=""/>
+      <w:lvlJc w:val="left"/>
+      <w:pPr>
+        <w:tabs>
+          <w:tab w:val="num" w:pos="4320"/>
+        </w:tabs>
+        <w:ind w:left="4320" w:hanging="360"/>
+      </w:pPr>
+      <w:rPr>
+        <w:rFonts w:ascii="Wingdings" w:hAnsi="Wingdings" w:hint="default"/>
+        <w:sz w:val="20"/>
+      </w:rPr>
+    </w:lvl>
+    <w:lvl w:ilvl="6" w:tentative="1">
+      <w:start w:val="1"/>
+      <w:numFmt w:val="bullet"/>
+      <w:lvlText w:val=""/>
+      <w:lvlJc w:val="left"/>
+      <w:pPr>
+        <w:tabs>
+          <w:tab w:val="num" w:pos="5040"/>
+        </w:tabs>
+        <w:ind w:left="5040" w:hanging="360"/>
+      </w:pPr>
+      <w:rPr>
+        <w:rFonts w:ascii="Wingdings" w:hAnsi="Wingdings" w:hint="default"/>
+        <w:sz w:val="20"/>
+      </w:rPr>
+    </w:lvl>
+    <w:lvl w:ilvl="7" w:tentative="1">
+      <w:start w:val="1"/>
+      <w:numFmt w:val="bullet"/>
+      <w:lvlText w:val=""/>
+      <w:lvlJc w:val="left"/>
+      <w:pPr>
+        <w:tabs>
+          <w:tab w:val="num" w:pos="5760"/>
+        </w:tabs>
+        <w:ind w:left="5760" w:hanging="360"/>
+      </w:pPr>
+      <w:rPr>
+        <w:rFonts w:ascii="Wingdings" w:hAnsi="Wingdings" w:hint="default"/>
+        <w:sz w:val="20"/>
+      </w:rPr>
+    </w:lvl>
+    <w:lvl w:ilvl="8" w:tentative="1">
+      <w:start w:val="1"/>
+      <w:numFmt w:val="bullet"/>
+      <w:lvlText w:val=""/>
+      <w:lvlJc w:val="left"/>
+      <w:pPr>
+        <w:tabs>
+          <w:tab w:val="num" w:pos="6480"/>
+        </w:tabs>
+        <w:ind w:left="6480" w:hanging="360"/>
+      </w:pPr>
+      <w:rPr>
+        <w:rFonts w:ascii="Wingdings" w:hAnsi="Wingdings" w:hint="default"/>
+        <w:sz w:val="20"/>
+      </w:rPr>
+    </w:lvl>
+  </w:abstractNum>
+  <w:abstractNum w:abstractNumId="7" w15:restartNumberingAfterBreak="0">
+    <w:nsid w:val="1B413BCC"/>
+    <w:multiLevelType w:val="multilevel"/>
+    <w:tmpl w:val="9C4CBF38"/>
+    <w:lvl w:ilvl="0">
+      <w:start w:val="1"/>
+      <w:numFmt w:val="bullet"/>
+      <w:lvlText w:val=""/>
+      <w:lvlJc w:val="left"/>
+      <w:pPr>
+        <w:tabs>
+          <w:tab w:val="num" w:pos="720"/>
+        </w:tabs>
+        <w:ind w:left="720" w:hanging="360"/>
+      </w:pPr>
+      <w:rPr>
+        <w:rFonts w:ascii="Symbol" w:hAnsi="Symbol" w:hint="default"/>
+        <w:sz w:val="20"/>
+      </w:rPr>
+    </w:lvl>
+    <w:lvl w:ilvl="1" w:tentative="1">
+      <w:start w:val="1"/>
+      <w:numFmt w:val="bullet"/>
+      <w:lvlText w:val="o"/>
+      <w:lvlJc w:val="left"/>
+      <w:pPr>
+        <w:tabs>
+          <w:tab w:val="num" w:pos="1440"/>
+        </w:tabs>
+        <w:ind w:left="1440" w:hanging="360"/>
+      </w:pPr>
+      <w:rPr>
+        <w:rFonts w:ascii="Courier New" w:hAnsi="Courier New" w:hint="default"/>
+        <w:sz w:val="20"/>
+      </w:rPr>
+    </w:lvl>
+    <w:lvl w:ilvl="2" w:tentative="1">
+      <w:start w:val="1"/>
+      <w:numFmt w:val="bullet"/>
+      <w:lvlText w:val=""/>
+      <w:lvlJc w:val="left"/>
+      <w:pPr>
+        <w:tabs>
+          <w:tab w:val="num" w:pos="2160"/>
+        </w:tabs>
+        <w:ind w:left="2160" w:hanging="360"/>
+      </w:pPr>
+      <w:rPr>
+        <w:rFonts w:ascii="Wingdings" w:hAnsi="Wingdings" w:hint="default"/>
+        <w:sz w:val="20"/>
+      </w:rPr>
+    </w:lvl>
+    <w:lvl w:ilvl="3" w:tentative="1">
+      <w:start w:val="1"/>
+      <w:numFmt w:val="bullet"/>
+      <w:lvlText w:val=""/>
+      <w:lvlJc w:val="left"/>
+      <w:pPr>
+        <w:tabs>
+          <w:tab w:val="num" w:pos="2880"/>
+        </w:tabs>
+        <w:ind w:left="2880" w:hanging="360"/>
+      </w:pPr>
+      <w:rPr>
+        <w:rFonts w:ascii="Wingdings" w:hAnsi="Wingdings" w:hint="default"/>
+        <w:sz w:val="20"/>
+      </w:rPr>
+    </w:lvl>
+    <w:lvl w:ilvl="4" w:tentative="1">
+      <w:start w:val="1"/>
+      <w:numFmt w:val="bullet"/>
+      <w:lvlText w:val=""/>
+      <w:lvlJc w:val="left"/>
+      <w:pPr>
+        <w:tabs>
+          <w:tab w:val="num" w:pos="3600"/>
+        </w:tabs>
+        <w:ind w:left="3600" w:hanging="360"/>
+      </w:pPr>
+      <w:rPr>
+        <w:rFonts w:ascii="Wingdings" w:hAnsi="Wingdings" w:hint="default"/>
+        <w:sz w:val="20"/>
+      </w:rPr>
+    </w:lvl>
+    <w:lvl w:ilvl="5" w:tentative="1">
+      <w:start w:val="1"/>
+      <w:numFmt w:val="bullet"/>
+      <w:lvlText w:val=""/>
+      <w:lvlJc w:val="left"/>
+      <w:pPr>
+        <w:tabs>
+          <w:tab w:val="num" w:pos="4320"/>
+        </w:tabs>
+        <w:ind w:left="4320" w:hanging="360"/>
+      </w:pPr>
+      <w:rPr>
+        <w:rFonts w:ascii="Wingdings" w:hAnsi="Wingdings" w:hint="default"/>
+        <w:sz w:val="20"/>
+      </w:rPr>
+    </w:lvl>
+    <w:lvl w:ilvl="6" w:tentative="1">
+      <w:start w:val="1"/>
+      <w:numFmt w:val="bullet"/>
+      <w:lvlText w:val=""/>
+      <w:lvlJc w:val="left"/>
+      <w:pPr>
+        <w:tabs>
+          <w:tab w:val="num" w:pos="5040"/>
+        </w:tabs>
+        <w:ind w:left="5040" w:hanging="360"/>
+      </w:pPr>
+      <w:rPr>
+        <w:rFonts w:ascii="Wingdings" w:hAnsi="Wingdings" w:hint="default"/>
+        <w:sz w:val="20"/>
+      </w:rPr>
+    </w:lvl>
+    <w:lvl w:ilvl="7" w:tentative="1">
+      <w:start w:val="1"/>
+      <w:numFmt w:val="bullet"/>
+      <w:lvlText w:val=""/>
+      <w:lvlJc w:val="left"/>
+      <w:pPr>
+        <w:tabs>
+          <w:tab w:val="num" w:pos="5760"/>
+        </w:tabs>
+        <w:ind w:left="5760" w:hanging="360"/>
+      </w:pPr>
+      <w:rPr>
+        <w:rFonts w:ascii="Wingdings" w:hAnsi="Wingdings" w:hint="default"/>
+        <w:sz w:val="20"/>
+      </w:rPr>
+    </w:lvl>
+    <w:lvl w:ilvl="8" w:tentative="1">
+      <w:start w:val="1"/>
+      <w:numFmt w:val="bullet"/>
+      <w:lvlText w:val=""/>
+      <w:lvlJc w:val="left"/>
+      <w:pPr>
+        <w:tabs>
+          <w:tab w:val="num" w:pos="6480"/>
+        </w:tabs>
+        <w:ind w:left="6480" w:hanging="360"/>
+      </w:pPr>
+      <w:rPr>
+        <w:rFonts w:ascii="Wingdings" w:hAnsi="Wingdings" w:hint="default"/>
+        <w:sz w:val="20"/>
+      </w:rPr>
+    </w:lvl>
+  </w:abstractNum>
+  <w:abstractNum w:abstractNumId="8" w15:restartNumberingAfterBreak="0">
+    <w:nsid w:val="1B891853"/>
+    <w:multiLevelType w:val="multilevel"/>
+    <w:tmpl w:val="BA12DF80"/>
+    <w:lvl w:ilvl="0">
+      <w:start w:val="1"/>
+      <w:numFmt w:val="bullet"/>
+      <w:lvlText w:val=""/>
+      <w:lvlJc w:val="left"/>
+      <w:pPr>
+        <w:tabs>
+          <w:tab w:val="num" w:pos="720"/>
+        </w:tabs>
+        <w:ind w:left="720" w:hanging="360"/>
+      </w:pPr>
+      <w:rPr>
+        <w:rFonts w:ascii="Symbol" w:hAnsi="Symbol" w:hint="default"/>
+        <w:sz w:val="20"/>
+      </w:rPr>
+    </w:lvl>
+    <w:lvl w:ilvl="1" w:tentative="1">
+      <w:start w:val="1"/>
+      <w:numFmt w:val="bullet"/>
+      <w:lvlText w:val="o"/>
+      <w:lvlJc w:val="left"/>
+      <w:pPr>
+        <w:tabs>
+          <w:tab w:val="num" w:pos="1440"/>
+        </w:tabs>
+        <w:ind w:left="1440" w:hanging="360"/>
+      </w:pPr>
+      <w:rPr>
+        <w:rFonts w:ascii="Courier New" w:hAnsi="Courier New" w:hint="default"/>
+        <w:sz w:val="20"/>
+      </w:rPr>
+    </w:lvl>
+    <w:lvl w:ilvl="2" w:tentative="1">
+      <w:start w:val="1"/>
+      <w:numFmt w:val="bullet"/>
+      <w:lvlText w:val=""/>
+      <w:lvlJc w:val="left"/>
+      <w:pPr>
+        <w:tabs>
+          <w:tab w:val="num" w:pos="2160"/>
+        </w:tabs>
+        <w:ind w:left="2160" w:hanging="360"/>
+      </w:pPr>
+      <w:rPr>
+        <w:rFonts w:ascii="Wingdings" w:hAnsi="Wingdings" w:hint="default"/>
+        <w:sz w:val="20"/>
+      </w:rPr>
+    </w:lvl>
+    <w:lvl w:ilvl="3" w:tentative="1">
+      <w:start w:val="1"/>
+      <w:numFmt w:val="bullet"/>
+      <w:lvlText w:val=""/>
+      <w:lvlJc w:val="left"/>
+      <w:pPr>
+        <w:tabs>
+          <w:tab w:val="num" w:pos="2880"/>
+        </w:tabs>
+        <w:ind w:left="2880" w:hanging="360"/>
+      </w:pPr>
+      <w:rPr>
+        <w:rFonts w:ascii="Wingdings" w:hAnsi="Wingdings" w:hint="default"/>
+        <w:sz w:val="20"/>
+      </w:rPr>
+    </w:lvl>
+    <w:lvl w:ilvl="4" w:tentative="1">
+      <w:start w:val="1"/>
+      <w:numFmt w:val="bullet"/>
+      <w:lvlText w:val=""/>
+      <w:lvlJc w:val="left"/>
+      <w:pPr>
+        <w:tabs>
+          <w:tab w:val="num" w:pos="3600"/>
+        </w:tabs>
+        <w:ind w:left="3600" w:hanging="360"/>
+      </w:pPr>
+      <w:rPr>
+        <w:rFonts w:ascii="Wingdings" w:hAnsi="Wingdings" w:hint="default"/>
+        <w:sz w:val="20"/>
+      </w:rPr>
+    </w:lvl>
+    <w:lvl w:ilvl="5" w:tentative="1">
+      <w:start w:val="1"/>
+      <w:numFmt w:val="bullet"/>
+      <w:lvlText w:val=""/>
+      <w:lvlJc w:val="left"/>
+      <w:pPr>
+        <w:tabs>
+          <w:tab w:val="num" w:pos="4320"/>
+        </w:tabs>
+        <w:ind w:left="4320" w:hanging="360"/>
+      </w:pPr>
+      <w:rPr>
+        <w:rFonts w:ascii="Wingdings" w:hAnsi="Wingdings" w:hint="default"/>
+        <w:sz w:val="20"/>
+      </w:rPr>
+    </w:lvl>
+    <w:lvl w:ilvl="6" w:tentative="1">
+      <w:start w:val="1"/>
+      <w:numFmt w:val="bullet"/>
+      <w:lvlText w:val=""/>
+      <w:lvlJc w:val="left"/>
+      <w:pPr>
+        <w:tabs>
+          <w:tab w:val="num" w:pos="5040"/>
+        </w:tabs>
+        <w:ind w:left="5040" w:hanging="360"/>
+      </w:pPr>
+      <w:rPr>
+        <w:rFonts w:ascii="Wingdings" w:hAnsi="Wingdings" w:hint="default"/>
+        <w:sz w:val="20"/>
+      </w:rPr>
+    </w:lvl>
+    <w:lvl w:ilvl="7" w:tentative="1">
+      <w:start w:val="1"/>
+      <w:numFmt w:val="bullet"/>
+      <w:lvlText w:val=""/>
+      <w:lvlJc w:val="left"/>
+      <w:pPr>
+        <w:tabs>
+          <w:tab w:val="num" w:pos="5760"/>
+        </w:tabs>
+        <w:ind w:left="5760" w:hanging="360"/>
+      </w:pPr>
+      <w:rPr>
+        <w:rFonts w:ascii="Wingdings" w:hAnsi="Wingdings" w:hint="default"/>
+        <w:sz w:val="20"/>
+      </w:rPr>
+    </w:lvl>
+    <w:lvl w:ilvl="8" w:tentative="1">
+      <w:start w:val="1"/>
+      <w:numFmt w:val="bullet"/>
+      <w:lvlText w:val=""/>
+      <w:lvlJc w:val="left"/>
+      <w:pPr>
+        <w:tabs>
+          <w:tab w:val="num" w:pos="6480"/>
+        </w:tabs>
+        <w:ind w:left="6480" w:hanging="360"/>
+      </w:pPr>
+      <w:rPr>
+        <w:rFonts w:ascii="Wingdings" w:hAnsi="Wingdings" w:hint="default"/>
+        <w:sz w:val="20"/>
+      </w:rPr>
+    </w:lvl>
+  </w:abstractNum>
+  <w:abstractNum w:abstractNumId="9" w15:restartNumberingAfterBreak="0">
+    <w:nsid w:val="1EE73FB7"/>
+    <w:multiLevelType w:val="multilevel"/>
+    <w:tmpl w:val="1A0C8AE0"/>
+    <w:lvl w:ilvl="0">
+      <w:start w:val="1"/>
+      <w:numFmt w:val="bullet"/>
+      <w:lvlText w:val=""/>
+      <w:lvlJc w:val="left"/>
+      <w:pPr>
+        <w:tabs>
+          <w:tab w:val="num" w:pos="720"/>
+        </w:tabs>
+        <w:ind w:left="720" w:hanging="360"/>
+      </w:pPr>
+      <w:rPr>
+        <w:rFonts w:ascii="Symbol" w:hAnsi="Symbol" w:hint="default"/>
+        <w:sz w:val="20"/>
+      </w:rPr>
+    </w:lvl>
+    <w:lvl w:ilvl="1" w:tentative="1">
+      <w:start w:val="1"/>
+      <w:numFmt w:val="bullet"/>
+      <w:lvlText w:val="o"/>
+      <w:lvlJc w:val="left"/>
+      <w:pPr>
+        <w:tabs>
+          <w:tab w:val="num" w:pos="1440"/>
+        </w:tabs>
+        <w:ind w:left="1440" w:hanging="360"/>
+      </w:pPr>
+      <w:rPr>
+        <w:rFonts w:ascii="Courier New" w:hAnsi="Courier New" w:hint="default"/>
+        <w:sz w:val="20"/>
+      </w:rPr>
+    </w:lvl>
+    <w:lvl w:ilvl="2" w:tentative="1">
+      <w:start w:val="1"/>
+      <w:numFmt w:val="bullet"/>
+      <w:lvlText w:val=""/>
+      <w:lvlJc w:val="left"/>
+      <w:pPr>
+        <w:tabs>
+          <w:tab w:val="num" w:pos="2160"/>
+        </w:tabs>
+        <w:ind w:left="2160" w:hanging="360"/>
+      </w:pPr>
+      <w:rPr>
+        <w:rFonts w:ascii="Wingdings" w:hAnsi="Wingdings" w:hint="default"/>
+        <w:sz w:val="20"/>
+      </w:rPr>
+    </w:lvl>
+    <w:lvl w:ilvl="3" w:tentative="1">
+      <w:start w:val="1"/>
+      <w:numFmt w:val="bullet"/>
+      <w:lvlText w:val=""/>
+      <w:lvlJc w:val="left"/>
+      <w:pPr>
+        <w:tabs>
+          <w:tab w:val="num" w:pos="2880"/>
+        </w:tabs>
+        <w:ind w:left="2880" w:hanging="360"/>
+      </w:pPr>
+      <w:rPr>
+        <w:rFonts w:ascii="Wingdings" w:hAnsi="Wingdings" w:hint="default"/>
+        <w:sz w:val="20"/>
+      </w:rPr>
+    </w:lvl>
+    <w:lvl w:ilvl="4" w:tentative="1">
+      <w:start w:val="1"/>
+      <w:numFmt w:val="bullet"/>
+      <w:lvlText w:val=""/>
+      <w:lvlJc w:val="left"/>
+      <w:pPr>
+        <w:tabs>
+          <w:tab w:val="num" w:pos="3600"/>
+        </w:tabs>
+        <w:ind w:left="3600" w:hanging="360"/>
+      </w:pPr>
+      <w:rPr>
+        <w:rFonts w:ascii="Wingdings" w:hAnsi="Wingdings" w:hint="default"/>
+        <w:sz w:val="20"/>
+      </w:rPr>
+    </w:lvl>
+    <w:lvl w:ilvl="5" w:tentative="1">
+      <w:start w:val="1"/>
+      <w:numFmt w:val="bullet"/>
+      <w:lvlText w:val=""/>
+      <w:lvlJc w:val="left"/>
+      <w:pPr>
+        <w:tabs>
+          <w:tab w:val="num" w:pos="4320"/>
+        </w:tabs>
+        <w:ind w:left="4320" w:hanging="360"/>
+      </w:pPr>
+      <w:rPr>
+        <w:rFonts w:ascii="Wingdings" w:hAnsi="Wingdings" w:hint="default"/>
+        <w:sz w:val="20"/>
+      </w:rPr>
+    </w:lvl>
+    <w:lvl w:ilvl="6" w:tentative="1">
+      <w:start w:val="1"/>
+      <w:numFmt w:val="bullet"/>
+      <w:lvlText w:val=""/>
+      <w:lvlJc w:val="left"/>
+      <w:pPr>
+        <w:tabs>
+          <w:tab w:val="num" w:pos="5040"/>
+        </w:tabs>
+        <w:ind w:left="5040" w:hanging="360"/>
+      </w:pPr>
+      <w:rPr>
+        <w:rFonts w:ascii="Wingdings" w:hAnsi="Wingdings" w:hint="default"/>
+        <w:sz w:val="20"/>
+      </w:rPr>
+    </w:lvl>
+    <w:lvl w:ilvl="7" w:tentative="1">
+      <w:start w:val="1"/>
+      <w:numFmt w:val="bullet"/>
+      <w:lvlText w:val=""/>
+      <w:lvlJc w:val="left"/>
+      <w:pPr>
+        <w:tabs>
+          <w:tab w:val="num" w:pos="5760"/>
+        </w:tabs>
+        <w:ind w:left="5760" w:hanging="360"/>
+      </w:pPr>
+      <w:rPr>
+        <w:rFonts w:ascii="Wingdings" w:hAnsi="Wingdings" w:hint="default"/>
+        <w:sz w:val="20"/>
+      </w:rPr>
+    </w:lvl>
+    <w:lvl w:ilvl="8" w:tentative="1">
+      <w:start w:val="1"/>
+      <w:numFmt w:val="bullet"/>
+      <w:lvlText w:val=""/>
+      <w:lvlJc w:val="left"/>
+      <w:pPr>
+        <w:tabs>
+          <w:tab w:val="num" w:pos="6480"/>
+        </w:tabs>
+        <w:ind w:left="6480" w:hanging="360"/>
+      </w:pPr>
+      <w:rPr>
+        <w:rFonts w:ascii="Wingdings" w:hAnsi="Wingdings" w:hint="default"/>
+        <w:sz w:val="20"/>
+      </w:rPr>
+    </w:lvl>
+  </w:abstractNum>
+  <w:abstractNum w:abstractNumId="10" w15:restartNumberingAfterBreak="0">
+    <w:nsid w:val="1F925215"/>
+    <w:multiLevelType w:val="multilevel"/>
+    <w:tmpl w:val="6BF075D8"/>
+    <w:lvl w:ilvl="0">
+      <w:start w:val="1"/>
+      <w:numFmt w:val="bullet"/>
+      <w:lvlText w:val=""/>
+      <w:lvlJc w:val="left"/>
+      <w:pPr>
+        <w:tabs>
+          <w:tab w:val="num" w:pos="720"/>
+        </w:tabs>
+        <w:ind w:left="720" w:hanging="360"/>
+      </w:pPr>
+      <w:rPr>
+        <w:rFonts w:ascii="Symbol" w:hAnsi="Symbol" w:hint="default"/>
+        <w:sz w:val="20"/>
+      </w:rPr>
+    </w:lvl>
+    <w:lvl w:ilvl="1" w:tentative="1">
+      <w:start w:val="1"/>
+      <w:numFmt w:val="bullet"/>
+      <w:lvlText w:val="o"/>
+      <w:lvlJc w:val="left"/>
+      <w:pPr>
+        <w:tabs>
+          <w:tab w:val="num" w:pos="1440"/>
+        </w:tabs>
+        <w:ind w:left="1440" w:hanging="360"/>
+      </w:pPr>
+      <w:rPr>
+        <w:rFonts w:ascii="Courier New" w:hAnsi="Courier New" w:hint="default"/>
+        <w:sz w:val="20"/>
+      </w:rPr>
+    </w:lvl>
+    <w:lvl w:ilvl="2" w:tentative="1">
+      <w:start w:val="1"/>
+      <w:numFmt w:val="bullet"/>
+      <w:lvlText w:val=""/>
+      <w:lvlJc w:val="left"/>
+      <w:pPr>
+        <w:tabs>
+          <w:tab w:val="num" w:pos="2160"/>
+        </w:tabs>
+        <w:ind w:left="2160" w:hanging="360"/>
+      </w:pPr>
+      <w:rPr>
+        <w:rFonts w:ascii="Wingdings" w:hAnsi="Wingdings" w:hint="default"/>
+        <w:sz w:val="20"/>
+      </w:rPr>
+    </w:lvl>
+    <w:lvl w:ilvl="3" w:tentative="1">
+      <w:start w:val="1"/>
+      <w:numFmt w:val="bullet"/>
+      <w:lvlText w:val=""/>
+      <w:lvlJc w:val="left"/>
+      <w:pPr>
+        <w:tabs>
+          <w:tab w:val="num" w:pos="2880"/>
+        </w:tabs>
+        <w:ind w:left="2880" w:hanging="360"/>
+      </w:pPr>
+      <w:rPr>
+        <w:rFonts w:ascii="Wingdings" w:hAnsi="Wingdings" w:hint="default"/>
+        <w:sz w:val="20"/>
+      </w:rPr>
+    </w:lvl>
+    <w:lvl w:ilvl="4" w:tentative="1">
+      <w:start w:val="1"/>
+      <w:numFmt w:val="bullet"/>
+      <w:lvlText w:val=""/>
+      <w:lvlJc w:val="left"/>
+      <w:pPr>
+        <w:tabs>
+          <w:tab w:val="num" w:pos="3600"/>
+        </w:tabs>
+        <w:ind w:left="3600" w:hanging="360"/>
+      </w:pPr>
+      <w:rPr>
+        <w:rFonts w:ascii="Wingdings" w:hAnsi="Wingdings" w:hint="default"/>
+        <w:sz w:val="20"/>
+      </w:rPr>
+    </w:lvl>
+    <w:lvl w:ilvl="5" w:tentative="1">
+      <w:start w:val="1"/>
+      <w:numFmt w:val="bullet"/>
+      <w:lvlText w:val=""/>
+      <w:lvlJc w:val="left"/>
+      <w:pPr>
+        <w:tabs>
+          <w:tab w:val="num" w:pos="4320"/>
+        </w:tabs>
+        <w:ind w:left="4320" w:hanging="360"/>
+      </w:pPr>
+      <w:rPr>
+        <w:rFonts w:ascii="Wingdings" w:hAnsi="Wingdings" w:hint="default"/>
+        <w:sz w:val="20"/>
+      </w:rPr>
+    </w:lvl>
+    <w:lvl w:ilvl="6" w:tentative="1">
+      <w:start w:val="1"/>
+      <w:numFmt w:val="bullet"/>
+      <w:lvlText w:val=""/>
+      <w:lvlJc w:val="left"/>
+      <w:pPr>
+        <w:tabs>
+          <w:tab w:val="num" w:pos="5040"/>
+        </w:tabs>
+        <w:ind w:left="5040" w:hanging="360"/>
+      </w:pPr>
+      <w:rPr>
+        <w:rFonts w:ascii="Wingdings" w:hAnsi="Wingdings" w:hint="default"/>
+        <w:sz w:val="20"/>
+      </w:rPr>
+    </w:lvl>
+    <w:lvl w:ilvl="7" w:tentative="1">
+      <w:start w:val="1"/>
+      <w:numFmt w:val="bullet"/>
+      <w:lvlText w:val=""/>
+      <w:lvlJc w:val="left"/>
+      <w:pPr>
+        <w:tabs>
+          <w:tab w:val="num" w:pos="5760"/>
+        </w:tabs>
+        <w:ind w:left="5760" w:hanging="360"/>
+      </w:pPr>
+      <w:rPr>
+        <w:rFonts w:ascii="Wingdings" w:hAnsi="Wingdings" w:hint="default"/>
+        <w:sz w:val="20"/>
+      </w:rPr>
+    </w:lvl>
+    <w:lvl w:ilvl="8" w:tentative="1">
+      <w:start w:val="1"/>
+      <w:numFmt w:val="bullet"/>
+      <w:lvlText w:val=""/>
+      <w:lvlJc w:val="left"/>
+      <w:pPr>
+        <w:tabs>
+          <w:tab w:val="num" w:pos="6480"/>
+        </w:tabs>
+        <w:ind w:left="6480" w:hanging="360"/>
+      </w:pPr>
+      <w:rPr>
+        <w:rFonts w:ascii="Wingdings" w:hAnsi="Wingdings" w:hint="default"/>
+        <w:sz w:val="20"/>
+      </w:rPr>
+    </w:lvl>
+  </w:abstractNum>
+  <w:abstractNum w:abstractNumId="11" w15:restartNumberingAfterBreak="0">
+    <w:nsid w:val="23C33BDD"/>
+    <w:multiLevelType w:val="multilevel"/>
+    <w:tmpl w:val="80081882"/>
+    <w:lvl w:ilvl="0">
+      <w:start w:val="1"/>
+      <w:numFmt w:val="bullet"/>
+      <w:lvlText w:val=""/>
+      <w:lvlJc w:val="left"/>
+      <w:pPr>
+        <w:tabs>
+          <w:tab w:val="num" w:pos="720"/>
+        </w:tabs>
+        <w:ind w:left="720" w:hanging="360"/>
+      </w:pPr>
+      <w:rPr>
+        <w:rFonts w:ascii="Symbol" w:hAnsi="Symbol" w:hint="default"/>
+        <w:sz w:val="20"/>
+      </w:rPr>
+    </w:lvl>
+    <w:lvl w:ilvl="1" w:tentative="1">
+      <w:start w:val="1"/>
+      <w:numFmt w:val="bullet"/>
+      <w:lvlText w:val="o"/>
+      <w:lvlJc w:val="left"/>
+      <w:pPr>
+        <w:tabs>
+          <w:tab w:val="num" w:pos="1440"/>
+        </w:tabs>
+        <w:ind w:left="1440" w:hanging="360"/>
+      </w:pPr>
+      <w:rPr>
+        <w:rFonts w:ascii="Courier New" w:hAnsi="Courier New" w:hint="default"/>
+        <w:sz w:val="20"/>
+      </w:rPr>
+    </w:lvl>
+    <w:lvl w:ilvl="2" w:tentative="1">
+      <w:start w:val="1"/>
+      <w:numFmt w:val="bullet"/>
+      <w:lvlText w:val=""/>
+      <w:lvlJc w:val="left"/>
+      <w:pPr>
+        <w:tabs>
+          <w:tab w:val="num" w:pos="2160"/>
+        </w:tabs>
+        <w:ind w:left="2160" w:hanging="360"/>
+      </w:pPr>
+      <w:rPr>
+        <w:rFonts w:ascii="Wingdings" w:hAnsi="Wingdings" w:hint="default"/>
+        <w:sz w:val="20"/>
+      </w:rPr>
+    </w:lvl>
+    <w:lvl w:ilvl="3" w:tentative="1">
+      <w:start w:val="1"/>
+      <w:numFmt w:val="bullet"/>
+      <w:lvlText w:val=""/>
+      <w:lvlJc w:val="left"/>
+      <w:pPr>
+        <w:tabs>
+          <w:tab w:val="num" w:pos="2880"/>
+        </w:tabs>
+        <w:ind w:left="2880" w:hanging="360"/>
+      </w:pPr>
+      <w:rPr>
+        <w:rFonts w:ascii="Wingdings" w:hAnsi="Wingdings" w:hint="default"/>
+        <w:sz w:val="20"/>
+      </w:rPr>
+    </w:lvl>
+    <w:lvl w:ilvl="4" w:tentative="1">
+      <w:start w:val="1"/>
+      <w:numFmt w:val="bullet"/>
+      <w:lvlText w:val=""/>
+      <w:lvlJc w:val="left"/>
+      <w:pPr>
+        <w:tabs>
+          <w:tab w:val="num" w:pos="3600"/>
+        </w:tabs>
+        <w:ind w:left="3600" w:hanging="360"/>
+      </w:pPr>
+      <w:rPr>
+        <w:rFonts w:ascii="Wingdings" w:hAnsi="Wingdings" w:hint="default"/>
+        <w:sz w:val="20"/>
+      </w:rPr>
+    </w:lvl>
+    <w:lvl w:ilvl="5" w:tentative="1">
+      <w:start w:val="1"/>
+      <w:numFmt w:val="bullet"/>
+      <w:lvlText w:val=""/>
+      <w:lvlJc w:val="left"/>
+      <w:pPr>
+        <w:tabs>
+          <w:tab w:val="num" w:pos="4320"/>
+        </w:tabs>
+        <w:ind w:left="4320" w:hanging="360"/>
+      </w:pPr>
+      <w:rPr>
+        <w:rFonts w:ascii="Wingdings" w:hAnsi="Wingdings" w:hint="default"/>
+        <w:sz w:val="20"/>
+      </w:rPr>
+    </w:lvl>
+    <w:lvl w:ilvl="6" w:tentative="1">
+      <w:start w:val="1"/>
+      <w:numFmt w:val="bullet"/>
+      <w:lvlText w:val=""/>
+      <w:lvlJc w:val="left"/>
+      <w:pPr>
+        <w:tabs>
+          <w:tab w:val="num" w:pos="5040"/>
+        </w:tabs>
+        <w:ind w:left="5040" w:hanging="360"/>
+      </w:pPr>
+      <w:rPr>
+        <w:rFonts w:ascii="Wingdings" w:hAnsi="Wingdings" w:hint="default"/>
+        <w:sz w:val="20"/>
+      </w:rPr>
+    </w:lvl>
+    <w:lvl w:ilvl="7" w:tentative="1">
+      <w:start w:val="1"/>
+      <w:numFmt w:val="bullet"/>
+      <w:lvlText w:val=""/>
+      <w:lvlJc w:val="left"/>
+      <w:pPr>
+        <w:tabs>
+          <w:tab w:val="num" w:pos="5760"/>
+        </w:tabs>
+        <w:ind w:left="5760" w:hanging="360"/>
+      </w:pPr>
+      <w:rPr>
+        <w:rFonts w:ascii="Wingdings" w:hAnsi="Wingdings" w:hint="default"/>
+        <w:sz w:val="20"/>
+      </w:rPr>
+    </w:lvl>
+    <w:lvl w:ilvl="8" w:tentative="1">
+      <w:start w:val="1"/>
+      <w:numFmt w:val="bullet"/>
+      <w:lvlText w:val=""/>
+      <w:lvlJc w:val="left"/>
+      <w:pPr>
+        <w:tabs>
+          <w:tab w:val="num" w:pos="6480"/>
+        </w:tabs>
+        <w:ind w:left="6480" w:hanging="360"/>
+      </w:pPr>
+      <w:rPr>
+        <w:rFonts w:ascii="Wingdings" w:hAnsi="Wingdings" w:hint="default"/>
+        <w:sz w:val="20"/>
+      </w:rPr>
+    </w:lvl>
+  </w:abstractNum>
+  <w:abstractNum w:abstractNumId="12" w15:restartNumberingAfterBreak="0">
+    <w:nsid w:val="2557271F"/>
+    <w:multiLevelType w:val="multilevel"/>
+    <w:tmpl w:val="234C9A96"/>
+    <w:lvl w:ilvl="0">
+      <w:start w:val="1"/>
+      <w:numFmt w:val="bullet"/>
+      <w:lvlText w:val=""/>
+      <w:lvlJc w:val="left"/>
+      <w:pPr>
+        <w:tabs>
+          <w:tab w:val="num" w:pos="720"/>
+        </w:tabs>
+        <w:ind w:left="720" w:hanging="360"/>
+      </w:pPr>
+      <w:rPr>
+        <w:rFonts w:ascii="Symbol" w:hAnsi="Symbol" w:hint="default"/>
+        <w:sz w:val="20"/>
+      </w:rPr>
+    </w:lvl>
+    <w:lvl w:ilvl="1" w:tentative="1">
+      <w:start w:val="1"/>
+      <w:numFmt w:val="bullet"/>
+      <w:lvlText w:val="o"/>
+      <w:lvlJc w:val="left"/>
+      <w:pPr>
+        <w:tabs>
+          <w:tab w:val="num" w:pos="1440"/>
+        </w:tabs>
+        <w:ind w:left="1440" w:hanging="360"/>
+      </w:pPr>
+      <w:rPr>
+        <w:rFonts w:ascii="Courier New" w:hAnsi="Courier New" w:hint="default"/>
+        <w:sz w:val="20"/>
+      </w:rPr>
+    </w:lvl>
+    <w:lvl w:ilvl="2" w:tentative="1">
+      <w:start w:val="1"/>
+      <w:numFmt w:val="bullet"/>
+      <w:lvlText w:val=""/>
+      <w:lvlJc w:val="left"/>
+      <w:pPr>
+        <w:tabs>
+          <w:tab w:val="num" w:pos="2160"/>
+        </w:tabs>
+        <w:ind w:left="2160" w:hanging="360"/>
+      </w:pPr>
+      <w:rPr>
+        <w:rFonts w:ascii="Wingdings" w:hAnsi="Wingdings" w:hint="default"/>
+        <w:sz w:val="20"/>
+      </w:rPr>
+    </w:lvl>
+    <w:lvl w:ilvl="3" w:tentative="1">
+      <w:start w:val="1"/>
+      <w:numFmt w:val="bullet"/>
+      <w:lvlText w:val=""/>
+      <w:lvlJc w:val="left"/>
+      <w:pPr>
+        <w:tabs>
+          <w:tab w:val="num" w:pos="2880"/>
+        </w:tabs>
+        <w:ind w:left="2880" w:hanging="360"/>
+      </w:pPr>
+      <w:rPr>
+        <w:rFonts w:ascii="Wingdings" w:hAnsi="Wingdings" w:hint="default"/>
+        <w:sz w:val="20"/>
+      </w:rPr>
+    </w:lvl>
+    <w:lvl w:ilvl="4" w:tentative="1">
+      <w:start w:val="1"/>
+      <w:numFmt w:val="bullet"/>
+      <w:lvlText w:val=""/>
+      <w:lvlJc w:val="left"/>
+      <w:pPr>
+        <w:tabs>
+          <w:tab w:val="num" w:pos="3600"/>
+        </w:tabs>
+        <w:ind w:left="3600" w:hanging="360"/>
+      </w:pPr>
+      <w:rPr>
+        <w:rFonts w:ascii="Wingdings" w:hAnsi="Wingdings" w:hint="default"/>
+        <w:sz w:val="20"/>
+      </w:rPr>
+    </w:lvl>
+    <w:lvl w:ilvl="5" w:tentative="1">
+      <w:start w:val="1"/>
+      <w:numFmt w:val="bullet"/>
+      <w:lvlText w:val=""/>
+      <w:lvlJc w:val="left"/>
+      <w:pPr>
+        <w:tabs>
+          <w:tab w:val="num" w:pos="4320"/>
+        </w:tabs>
+        <w:ind w:left="4320" w:hanging="360"/>
+      </w:pPr>
+      <w:rPr>
+        <w:rFonts w:ascii="Wingdings" w:hAnsi="Wingdings" w:hint="default"/>
+        <w:sz w:val="20"/>
+      </w:rPr>
+    </w:lvl>
+    <w:lvl w:ilvl="6" w:tentative="1">
+      <w:start w:val="1"/>
+      <w:numFmt w:val="bullet"/>
+      <w:lvlText w:val=""/>
+      <w:lvlJc w:val="left"/>
+      <w:pPr>
+        <w:tabs>
+          <w:tab w:val="num" w:pos="5040"/>
+        </w:tabs>
+        <w:ind w:left="5040" w:hanging="360"/>
+      </w:pPr>
+      <w:rPr>
+        <w:rFonts w:ascii="Wingdings" w:hAnsi="Wingdings" w:hint="default"/>
+        <w:sz w:val="20"/>
+      </w:rPr>
+    </w:lvl>
+    <w:lvl w:ilvl="7" w:tentative="1">
+      <w:start w:val="1"/>
+      <w:numFmt w:val="bullet"/>
+      <w:lvlText w:val=""/>
+      <w:lvlJc w:val="left"/>
+      <w:pPr>
+        <w:tabs>
+          <w:tab w:val="num" w:pos="5760"/>
+        </w:tabs>
+        <w:ind w:left="5760" w:hanging="360"/>
+      </w:pPr>
+      <w:rPr>
+        <w:rFonts w:ascii="Wingdings" w:hAnsi="Wingdings" w:hint="default"/>
+        <w:sz w:val="20"/>
+      </w:rPr>
+    </w:lvl>
+    <w:lvl w:ilvl="8" w:tentative="1">
+      <w:start w:val="1"/>
+      <w:numFmt w:val="bullet"/>
+      <w:lvlText w:val=""/>
+      <w:lvlJc w:val="left"/>
+      <w:pPr>
+        <w:tabs>
+          <w:tab w:val="num" w:pos="6480"/>
+        </w:tabs>
+        <w:ind w:left="6480" w:hanging="360"/>
+      </w:pPr>
+      <w:rPr>
+        <w:rFonts w:ascii="Wingdings" w:hAnsi="Wingdings" w:hint="default"/>
+        <w:sz w:val="20"/>
+      </w:rPr>
+    </w:lvl>
+  </w:abstractNum>
+  <w:abstractNum w:abstractNumId="13" w15:restartNumberingAfterBreak="0">
+    <w:nsid w:val="2696716A"/>
+    <w:multiLevelType w:val="multilevel"/>
+    <w:tmpl w:val="930C9AFC"/>
+    <w:lvl w:ilvl="0">
+      <w:start w:val="1"/>
+      <w:numFmt w:val="bullet"/>
+      <w:lvlText w:val=""/>
+      <w:lvlJc w:val="left"/>
+      <w:pPr>
+        <w:tabs>
+          <w:tab w:val="num" w:pos="720"/>
+        </w:tabs>
+        <w:ind w:left="720" w:hanging="360"/>
+      </w:pPr>
+      <w:rPr>
+        <w:rFonts w:ascii="Symbol" w:hAnsi="Symbol" w:hint="default"/>
+        <w:sz w:val="20"/>
+      </w:rPr>
+    </w:lvl>
+    <w:lvl w:ilvl="1" w:tentative="1">
+      <w:start w:val="1"/>
+      <w:numFmt w:val="bullet"/>
+      <w:lvlText w:val="o"/>
+      <w:lvlJc w:val="left"/>
+      <w:pPr>
+        <w:tabs>
+          <w:tab w:val="num" w:pos="1440"/>
+        </w:tabs>
+        <w:ind w:left="1440" w:hanging="360"/>
+      </w:pPr>
+      <w:rPr>
+        <w:rFonts w:ascii="Courier New" w:hAnsi="Courier New" w:hint="default"/>
+        <w:sz w:val="20"/>
+      </w:rPr>
+    </w:lvl>
+    <w:lvl w:ilvl="2" w:tentative="1">
+      <w:start w:val="1"/>
+      <w:numFmt w:val="bullet"/>
+      <w:lvlText w:val=""/>
+      <w:lvlJc w:val="left"/>
+      <w:pPr>
+        <w:tabs>
+          <w:tab w:val="num" w:pos="2160"/>
+        </w:tabs>
+        <w:ind w:left="2160" w:hanging="360"/>
+      </w:pPr>
+      <w:rPr>
+        <w:rFonts w:ascii="Wingdings" w:hAnsi="Wingdings" w:hint="default"/>
+        <w:sz w:val="20"/>
+      </w:rPr>
+    </w:lvl>
+    <w:lvl w:ilvl="3" w:tentative="1">
+      <w:start w:val="1"/>
+      <w:numFmt w:val="bullet"/>
+      <w:lvlText w:val=""/>
+      <w:lvlJc w:val="left"/>
+      <w:pPr>
+        <w:tabs>
+          <w:tab w:val="num" w:pos="2880"/>
+        </w:tabs>
+        <w:ind w:left="2880" w:hanging="360"/>
+      </w:pPr>
+      <w:rPr>
+        <w:rFonts w:ascii="Wingdings" w:hAnsi="Wingdings" w:hint="default"/>
+        <w:sz w:val="20"/>
+      </w:rPr>
+    </w:lvl>
+    <w:lvl w:ilvl="4" w:tentative="1">
+      <w:start w:val="1"/>
+      <w:numFmt w:val="bullet"/>
+      <w:lvlText w:val=""/>
+      <w:lvlJc w:val="left"/>
+      <w:pPr>
+        <w:tabs>
+          <w:tab w:val="num" w:pos="3600"/>
+        </w:tabs>
+        <w:ind w:left="3600" w:hanging="360"/>
+      </w:pPr>
+      <w:rPr>
+        <w:rFonts w:ascii="Wingdings" w:hAnsi="Wingdings" w:hint="default"/>
+        <w:sz w:val="20"/>
+      </w:rPr>
+    </w:lvl>
+    <w:lvl w:ilvl="5" w:tentative="1">
+      <w:start w:val="1"/>
+      <w:numFmt w:val="bullet"/>
+      <w:lvlText w:val=""/>
+      <w:lvlJc w:val="left"/>
+      <w:pPr>
+        <w:tabs>
+          <w:tab w:val="num" w:pos="4320"/>
+        </w:tabs>
+        <w:ind w:left="4320" w:hanging="360"/>
+      </w:pPr>
+      <w:rPr>
+        <w:rFonts w:ascii="Wingdings" w:hAnsi="Wingdings" w:hint="default"/>
+        <w:sz w:val="20"/>
+      </w:rPr>
+    </w:lvl>
+    <w:lvl w:ilvl="6" w:tentative="1">
+      <w:start w:val="1"/>
+      <w:numFmt w:val="bullet"/>
+      <w:lvlText w:val=""/>
+      <w:lvlJc w:val="left"/>
+      <w:pPr>
+        <w:tabs>
+          <w:tab w:val="num" w:pos="5040"/>
+        </w:tabs>
+        <w:ind w:left="5040" w:hanging="360"/>
+      </w:pPr>
+      <w:rPr>
+        <w:rFonts w:ascii="Wingdings" w:hAnsi="Wingdings" w:hint="default"/>
+        <w:sz w:val="20"/>
+      </w:rPr>
+    </w:lvl>
+    <w:lvl w:ilvl="7" w:tentative="1">
+      <w:start w:val="1"/>
+      <w:numFmt w:val="bullet"/>
+      <w:lvlText w:val=""/>
+      <w:lvlJc w:val="left"/>
+      <w:pPr>
+        <w:tabs>
+          <w:tab w:val="num" w:pos="5760"/>
+        </w:tabs>
+        <w:ind w:left="5760" w:hanging="360"/>
+      </w:pPr>
+      <w:rPr>
+        <w:rFonts w:ascii="Wingdings" w:hAnsi="Wingdings" w:hint="default"/>
+        <w:sz w:val="20"/>
+      </w:rPr>
+    </w:lvl>
+    <w:lvl w:ilvl="8" w:tentative="1">
+      <w:start w:val="1"/>
+      <w:numFmt w:val="bullet"/>
+      <w:lvlText w:val=""/>
+      <w:lvlJc w:val="left"/>
+      <w:pPr>
+        <w:tabs>
+          <w:tab w:val="num" w:pos="6480"/>
+        </w:tabs>
+        <w:ind w:left="6480" w:hanging="360"/>
+      </w:pPr>
+      <w:rPr>
+        <w:rFonts w:ascii="Wingdings" w:hAnsi="Wingdings" w:hint="default"/>
+        <w:sz w:val="20"/>
+      </w:rPr>
+    </w:lvl>
+  </w:abstractNum>
+  <w:abstractNum w:abstractNumId="14" w15:restartNumberingAfterBreak="0">
+    <w:nsid w:val="3ABB5968"/>
+    <w:multiLevelType w:val="multilevel"/>
+    <w:tmpl w:val="5B88D0CA"/>
+    <w:lvl w:ilvl="0">
+      <w:start w:val="1"/>
+      <w:numFmt w:val="bullet"/>
+      <w:lvlText w:val=""/>
+      <w:lvlJc w:val="left"/>
+      <w:pPr>
+        <w:tabs>
+          <w:tab w:val="num" w:pos="720"/>
+        </w:tabs>
+        <w:ind w:left="720" w:hanging="360"/>
+      </w:pPr>
+      <w:rPr>
+        <w:rFonts w:ascii="Symbol" w:hAnsi="Symbol" w:hint="default"/>
+        <w:sz w:val="20"/>
+      </w:rPr>
+    </w:lvl>
+    <w:lvl w:ilvl="1" w:tentative="1">
+      <w:start w:val="1"/>
+      <w:numFmt w:val="bullet"/>
+      <w:lvlText w:val="o"/>
+      <w:lvlJc w:val="left"/>
+      <w:pPr>
+        <w:tabs>
+          <w:tab w:val="num" w:pos="1440"/>
+        </w:tabs>
+        <w:ind w:left="1440" w:hanging="360"/>
+      </w:pPr>
+      <w:rPr>
+        <w:rFonts w:ascii="Courier New" w:hAnsi="Courier New" w:hint="default"/>
+        <w:sz w:val="20"/>
+      </w:rPr>
+    </w:lvl>
+    <w:lvl w:ilvl="2" w:tentative="1">
+      <w:start w:val="1"/>
+      <w:numFmt w:val="bullet"/>
+      <w:lvlText w:val=""/>
+      <w:lvlJc w:val="left"/>
+      <w:pPr>
+        <w:tabs>
+          <w:tab w:val="num" w:pos="2160"/>
+        </w:tabs>
+        <w:ind w:left="2160" w:hanging="360"/>
+      </w:pPr>
+      <w:rPr>
+        <w:rFonts w:ascii="Wingdings" w:hAnsi="Wingdings" w:hint="default"/>
+        <w:sz w:val="20"/>
+      </w:rPr>
+    </w:lvl>
+    <w:lvl w:ilvl="3" w:tentative="1">
+      <w:start w:val="1"/>
+      <w:numFmt w:val="bullet"/>
+      <w:lvlText w:val=""/>
+      <w:lvlJc w:val="left"/>
+      <w:pPr>
+        <w:tabs>
+          <w:tab w:val="num" w:pos="2880"/>
+        </w:tabs>
+        <w:ind w:left="2880" w:hanging="360"/>
+      </w:pPr>
+      <w:rPr>
+        <w:rFonts w:ascii="Wingdings" w:hAnsi="Wingdings" w:hint="default"/>
+        <w:sz w:val="20"/>
+      </w:rPr>
+    </w:lvl>
+    <w:lvl w:ilvl="4" w:tentative="1">
+      <w:start w:val="1"/>
+      <w:numFmt w:val="bullet"/>
+      <w:lvlText w:val=""/>
+      <w:lvlJc w:val="left"/>
+      <w:pPr>
+        <w:tabs>
+          <w:tab w:val="num" w:pos="3600"/>
+        </w:tabs>
+        <w:ind w:left="3600" w:hanging="360"/>
+      </w:pPr>
+      <w:rPr>
+        <w:rFonts w:ascii="Wingdings" w:hAnsi="Wingdings" w:hint="default"/>
+        <w:sz w:val="20"/>
+      </w:rPr>
+    </w:lvl>
+    <w:lvl w:ilvl="5" w:tentative="1">
+      <w:start w:val="1"/>
+      <w:numFmt w:val="bullet"/>
+      <w:lvlText w:val=""/>
+      <w:lvlJc w:val="left"/>
+      <w:pPr>
+        <w:tabs>
+          <w:tab w:val="num" w:pos="4320"/>
+        </w:tabs>
+        <w:ind w:left="4320" w:hanging="360"/>
+      </w:pPr>
+      <w:rPr>
+        <w:rFonts w:ascii="Wingdings" w:hAnsi="Wingdings" w:hint="default"/>
+        <w:sz w:val="20"/>
+      </w:rPr>
+    </w:lvl>
+    <w:lvl w:ilvl="6" w:tentative="1">
+      <w:start w:val="1"/>
+      <w:numFmt w:val="bullet"/>
+      <w:lvlText w:val=""/>
+      <w:lvlJc w:val="left"/>
+      <w:pPr>
+        <w:tabs>
+          <w:tab w:val="num" w:pos="5040"/>
+        </w:tabs>
+        <w:ind w:left="5040" w:hanging="360"/>
+      </w:pPr>
+      <w:rPr>
+        <w:rFonts w:ascii="Wingdings" w:hAnsi="Wingdings" w:hint="default"/>
+        <w:sz w:val="20"/>
+      </w:rPr>
+    </w:lvl>
+    <w:lvl w:ilvl="7" w:tentative="1">
+      <w:start w:val="1"/>
+      <w:numFmt w:val="bullet"/>
+      <w:lvlText w:val=""/>
+      <w:lvlJc w:val="left"/>
+      <w:pPr>
+        <w:tabs>
+          <w:tab w:val="num" w:pos="5760"/>
+        </w:tabs>
+        <w:ind w:left="5760" w:hanging="360"/>
+      </w:pPr>
+      <w:rPr>
+        <w:rFonts w:ascii="Wingdings" w:hAnsi="Wingdings" w:hint="default"/>
+        <w:sz w:val="20"/>
+      </w:rPr>
+    </w:lvl>
+    <w:lvl w:ilvl="8" w:tentative="1">
+      <w:start w:val="1"/>
+      <w:numFmt w:val="bullet"/>
+      <w:lvlText w:val=""/>
+      <w:lvlJc w:val="left"/>
+      <w:pPr>
+        <w:tabs>
+          <w:tab w:val="num" w:pos="6480"/>
+        </w:tabs>
+        <w:ind w:left="6480" w:hanging="360"/>
+      </w:pPr>
+      <w:rPr>
+        <w:rFonts w:ascii="Wingdings" w:hAnsi="Wingdings" w:hint="default"/>
+        <w:sz w:val="20"/>
+      </w:rPr>
+    </w:lvl>
+  </w:abstractNum>
+  <w:abstractNum w:abstractNumId="15" w15:restartNumberingAfterBreak="0">
+    <w:nsid w:val="3C93060B"/>
+    <w:multiLevelType w:val="multilevel"/>
+    <w:tmpl w:val="24CAAB3C"/>
+    <w:lvl w:ilvl="0">
+      <w:start w:val="1"/>
+      <w:numFmt w:val="bullet"/>
+      <w:lvlText w:val=""/>
+      <w:lvlJc w:val="left"/>
+      <w:pPr>
+        <w:tabs>
+          <w:tab w:val="num" w:pos="720"/>
+        </w:tabs>
+        <w:ind w:left="720" w:hanging="360"/>
+      </w:pPr>
+      <w:rPr>
+        <w:rFonts w:ascii="Symbol" w:hAnsi="Symbol" w:hint="default"/>
+        <w:sz w:val="20"/>
+      </w:rPr>
+    </w:lvl>
+    <w:lvl w:ilvl="1" w:tentative="1">
+      <w:start w:val="1"/>
+      <w:numFmt w:val="bullet"/>
+      <w:lvlText w:val="o"/>
+      <w:lvlJc w:val="left"/>
+      <w:pPr>
+        <w:tabs>
+          <w:tab w:val="num" w:pos="1440"/>
+        </w:tabs>
+        <w:ind w:left="1440" w:hanging="360"/>
+      </w:pPr>
+      <w:rPr>
+        <w:rFonts w:ascii="Courier New" w:hAnsi="Courier New" w:hint="default"/>
+        <w:sz w:val="20"/>
+      </w:rPr>
+    </w:lvl>
+    <w:lvl w:ilvl="2" w:tentative="1">
+      <w:start w:val="1"/>
+      <w:numFmt w:val="bullet"/>
+      <w:lvlText w:val=""/>
+      <w:lvlJc w:val="left"/>
+      <w:pPr>
+        <w:tabs>
+          <w:tab w:val="num" w:pos="2160"/>
+        </w:tabs>
+        <w:ind w:left="2160" w:hanging="360"/>
+      </w:pPr>
+      <w:rPr>
+        <w:rFonts w:ascii="Wingdings" w:hAnsi="Wingdings" w:hint="default"/>
+        <w:sz w:val="20"/>
+      </w:rPr>
+    </w:lvl>
+    <w:lvl w:ilvl="3" w:tentative="1">
+      <w:start w:val="1"/>
+      <w:numFmt w:val="bullet"/>
+      <w:lvlText w:val=""/>
+      <w:lvlJc w:val="left"/>
+      <w:pPr>
+        <w:tabs>
+          <w:tab w:val="num" w:pos="2880"/>
+        </w:tabs>
+        <w:ind w:left="2880" w:hanging="360"/>
+      </w:pPr>
+      <w:rPr>
+        <w:rFonts w:ascii="Wingdings" w:hAnsi="Wingdings" w:hint="default"/>
+        <w:sz w:val="20"/>
+      </w:rPr>
+    </w:lvl>
+    <w:lvl w:ilvl="4" w:tentative="1">
+      <w:start w:val="1"/>
+      <w:numFmt w:val="bullet"/>
+      <w:lvlText w:val=""/>
+      <w:lvlJc w:val="left"/>
+      <w:pPr>
+        <w:tabs>
+          <w:tab w:val="num" w:pos="3600"/>
+        </w:tabs>
+        <w:ind w:left="3600" w:hanging="360"/>
+      </w:pPr>
+      <w:rPr>
+        <w:rFonts w:ascii="Wingdings" w:hAnsi="Wingdings" w:hint="default"/>
+        <w:sz w:val="20"/>
+      </w:rPr>
+    </w:lvl>
+    <w:lvl w:ilvl="5" w:tentative="1">
+      <w:start w:val="1"/>
+      <w:numFmt w:val="bullet"/>
+      <w:lvlText w:val=""/>
+      <w:lvlJc w:val="left"/>
+      <w:pPr>
+        <w:tabs>
+          <w:tab w:val="num" w:pos="4320"/>
+        </w:tabs>
+        <w:ind w:left="4320" w:hanging="360"/>
+      </w:pPr>
+      <w:rPr>
+        <w:rFonts w:ascii="Wingdings" w:hAnsi="Wingdings" w:hint="default"/>
+        <w:sz w:val="20"/>
+      </w:rPr>
+    </w:lvl>
+    <w:lvl w:ilvl="6" w:tentative="1">
+      <w:start w:val="1"/>
+      <w:numFmt w:val="bullet"/>
+      <w:lvlText w:val=""/>
+      <w:lvlJc w:val="left"/>
+      <w:pPr>
+        <w:tabs>
+          <w:tab w:val="num" w:pos="5040"/>
+        </w:tabs>
+        <w:ind w:left="5040" w:hanging="360"/>
+      </w:pPr>
+      <w:rPr>
+        <w:rFonts w:ascii="Wingdings" w:hAnsi="Wingdings" w:hint="default"/>
+        <w:sz w:val="20"/>
+      </w:rPr>
+    </w:lvl>
+    <w:lvl w:ilvl="7" w:tentative="1">
+      <w:start w:val="1"/>
+      <w:numFmt w:val="bullet"/>
+      <w:lvlText w:val=""/>
+      <w:lvlJc w:val="left"/>
+      <w:pPr>
+        <w:tabs>
+          <w:tab w:val="num" w:pos="5760"/>
+        </w:tabs>
+        <w:ind w:left="5760" w:hanging="360"/>
+      </w:pPr>
+      <w:rPr>
+        <w:rFonts w:ascii="Wingdings" w:hAnsi="Wingdings" w:hint="default"/>
+        <w:sz w:val="20"/>
+      </w:rPr>
+    </w:lvl>
+    <w:lvl w:ilvl="8" w:tentative="1">
+      <w:start w:val="1"/>
+      <w:numFmt w:val="bullet"/>
+      <w:lvlText w:val=""/>
+      <w:lvlJc w:val="left"/>
+      <w:pPr>
+        <w:tabs>
+          <w:tab w:val="num" w:pos="6480"/>
+        </w:tabs>
+        <w:ind w:left="6480" w:hanging="360"/>
+      </w:pPr>
+      <w:rPr>
+        <w:rFonts w:ascii="Wingdings" w:hAnsi="Wingdings" w:hint="default"/>
+        <w:sz w:val="20"/>
+      </w:rPr>
+    </w:lvl>
+  </w:abstractNum>
+  <w:abstractNum w:abstractNumId="16" w15:restartNumberingAfterBreak="0">
+    <w:nsid w:val="3CF9660A"/>
+    <w:multiLevelType w:val="multilevel"/>
+    <w:tmpl w:val="C5389AB6"/>
+    <w:lvl w:ilvl="0">
+      <w:start w:val="1"/>
+      <w:numFmt w:val="bullet"/>
+      <w:lvlText w:val=""/>
+      <w:lvlJc w:val="left"/>
+      <w:pPr>
+        <w:tabs>
+          <w:tab w:val="num" w:pos="720"/>
+        </w:tabs>
+        <w:ind w:left="720" w:hanging="360"/>
+      </w:pPr>
+      <w:rPr>
+        <w:rFonts w:ascii="Symbol" w:hAnsi="Symbol" w:hint="default"/>
+        <w:sz w:val="20"/>
+      </w:rPr>
+    </w:lvl>
+    <w:lvl w:ilvl="1" w:tentative="1">
+      <w:start w:val="1"/>
+      <w:numFmt w:val="bullet"/>
+      <w:lvlText w:val="o"/>
+      <w:lvlJc w:val="left"/>
+      <w:pPr>
+        <w:tabs>
+          <w:tab w:val="num" w:pos="1440"/>
+        </w:tabs>
+        <w:ind w:left="1440" w:hanging="360"/>
+      </w:pPr>
+      <w:rPr>
+        <w:rFonts w:ascii="Courier New" w:hAnsi="Courier New" w:hint="default"/>
+        <w:sz w:val="20"/>
+      </w:rPr>
+    </w:lvl>
+    <w:lvl w:ilvl="2" w:tentative="1">
+      <w:start w:val="1"/>
+      <w:numFmt w:val="bullet"/>
+      <w:lvlText w:val=""/>
+      <w:lvlJc w:val="left"/>
+      <w:pPr>
+        <w:tabs>
+          <w:tab w:val="num" w:pos="2160"/>
+        </w:tabs>
+        <w:ind w:left="2160" w:hanging="360"/>
+      </w:pPr>
+      <w:rPr>
+        <w:rFonts w:ascii="Wingdings" w:hAnsi="Wingdings" w:hint="default"/>
+        <w:sz w:val="20"/>
+      </w:rPr>
+    </w:lvl>
+    <w:lvl w:ilvl="3" w:tentative="1">
+      <w:start w:val="1"/>
+      <w:numFmt w:val="bullet"/>
+      <w:lvlText w:val=""/>
+      <w:lvlJc w:val="left"/>
+      <w:pPr>
+        <w:tabs>
+          <w:tab w:val="num" w:pos="2880"/>
+        </w:tabs>
+        <w:ind w:left="2880" w:hanging="360"/>
+      </w:pPr>
+      <w:rPr>
+        <w:rFonts w:ascii="Wingdings" w:hAnsi="Wingdings" w:hint="default"/>
+        <w:sz w:val="20"/>
+      </w:rPr>
+    </w:lvl>
+    <w:lvl w:ilvl="4" w:tentative="1">
+      <w:start w:val="1"/>
+      <w:numFmt w:val="bullet"/>
+      <w:lvlText w:val=""/>
+      <w:lvlJc w:val="left"/>
+      <w:pPr>
+        <w:tabs>
+          <w:tab w:val="num" w:pos="3600"/>
+        </w:tabs>
+        <w:ind w:left="3600" w:hanging="360"/>
+      </w:pPr>
+      <w:rPr>
+        <w:rFonts w:ascii="Wingdings" w:hAnsi="Wingdings" w:hint="default"/>
+        <w:sz w:val="20"/>
+      </w:rPr>
+    </w:lvl>
+    <w:lvl w:ilvl="5" w:tentative="1">
+      <w:start w:val="1"/>
+      <w:numFmt w:val="bullet"/>
+      <w:lvlText w:val=""/>
+      <w:lvlJc w:val="left"/>
+      <w:pPr>
+        <w:tabs>
+          <w:tab w:val="num" w:pos="4320"/>
+        </w:tabs>
+        <w:ind w:left="4320" w:hanging="360"/>
+      </w:pPr>
+      <w:rPr>
+        <w:rFonts w:ascii="Wingdings" w:hAnsi="Wingdings" w:hint="default"/>
+        <w:sz w:val="20"/>
+      </w:rPr>
+    </w:lvl>
+    <w:lvl w:ilvl="6" w:tentative="1">
+      <w:start w:val="1"/>
+      <w:numFmt w:val="bullet"/>
+      <w:lvlText w:val=""/>
+      <w:lvlJc w:val="left"/>
+      <w:pPr>
+        <w:tabs>
+          <w:tab w:val="num" w:pos="5040"/>
+        </w:tabs>
+        <w:ind w:left="5040" w:hanging="360"/>
+      </w:pPr>
+      <w:rPr>
+        <w:rFonts w:ascii="Wingdings" w:hAnsi="Wingdings" w:hint="default"/>
+        <w:sz w:val="20"/>
+      </w:rPr>
+    </w:lvl>
+    <w:lvl w:ilvl="7" w:tentative="1">
+      <w:start w:val="1"/>
+      <w:numFmt w:val="bullet"/>
+      <w:lvlText w:val=""/>
+      <w:lvlJc w:val="left"/>
+      <w:pPr>
+        <w:tabs>
+          <w:tab w:val="num" w:pos="5760"/>
+        </w:tabs>
+        <w:ind w:left="5760" w:hanging="360"/>
+      </w:pPr>
+      <w:rPr>
+        <w:rFonts w:ascii="Wingdings" w:hAnsi="Wingdings" w:hint="default"/>
+        <w:sz w:val="20"/>
+      </w:rPr>
+    </w:lvl>
+    <w:lvl w:ilvl="8" w:tentative="1">
+      <w:start w:val="1"/>
+      <w:numFmt w:val="bullet"/>
+      <w:lvlText w:val=""/>
+      <w:lvlJc w:val="left"/>
+      <w:pPr>
+        <w:tabs>
+          <w:tab w:val="num" w:pos="6480"/>
+        </w:tabs>
+        <w:ind w:left="6480" w:hanging="360"/>
+      </w:pPr>
+      <w:rPr>
+        <w:rFonts w:ascii="Wingdings" w:hAnsi="Wingdings" w:hint="default"/>
+        <w:sz w:val="20"/>
+      </w:rPr>
+    </w:lvl>
+  </w:abstractNum>
+  <w:abstractNum w:abstractNumId="17" w15:restartNumberingAfterBreak="0">
+    <w:nsid w:val="3FF26492"/>
+    <w:multiLevelType w:val="multilevel"/>
+    <w:tmpl w:val="FCF633C4"/>
+    <w:lvl w:ilvl="0">
+      <w:start w:val="1"/>
+      <w:numFmt w:val="bullet"/>
+      <w:lvlText w:val=""/>
+      <w:lvlJc w:val="left"/>
+      <w:pPr>
+        <w:tabs>
+          <w:tab w:val="num" w:pos="720"/>
+        </w:tabs>
+        <w:ind w:left="720" w:hanging="360"/>
+      </w:pPr>
+      <w:rPr>
+        <w:rFonts w:ascii="Symbol" w:hAnsi="Symbol" w:hint="default"/>
+        <w:sz w:val="20"/>
+      </w:rPr>
+    </w:lvl>
+    <w:lvl w:ilvl="1" w:tentative="1">
+      <w:start w:val="1"/>
+      <w:numFmt w:val="bullet"/>
+      <w:lvlText w:val="o"/>
+      <w:lvlJc w:val="left"/>
+      <w:pPr>
+        <w:tabs>
+          <w:tab w:val="num" w:pos="1440"/>
+        </w:tabs>
+        <w:ind w:left="1440" w:hanging="360"/>
+      </w:pPr>
+      <w:rPr>
+        <w:rFonts w:ascii="Courier New" w:hAnsi="Courier New" w:hint="default"/>
+        <w:sz w:val="20"/>
+      </w:rPr>
+    </w:lvl>
+    <w:lvl w:ilvl="2" w:tentative="1">
+      <w:start w:val="1"/>
+      <w:numFmt w:val="bullet"/>
+      <w:lvlText w:val=""/>
+      <w:lvlJc w:val="left"/>
+      <w:pPr>
+        <w:tabs>
+          <w:tab w:val="num" w:pos="2160"/>
+        </w:tabs>
+        <w:ind w:left="2160" w:hanging="360"/>
+      </w:pPr>
+      <w:rPr>
+        <w:rFonts w:ascii="Wingdings" w:hAnsi="Wingdings" w:hint="default"/>
+        <w:sz w:val="20"/>
+      </w:rPr>
+    </w:lvl>
+    <w:lvl w:ilvl="3" w:tentative="1">
+      <w:start w:val="1"/>
+      <w:numFmt w:val="bullet"/>
+      <w:lvlText w:val=""/>
+      <w:lvlJc w:val="left"/>
+      <w:pPr>
+        <w:tabs>
+          <w:tab w:val="num" w:pos="2880"/>
+        </w:tabs>
+        <w:ind w:left="2880" w:hanging="360"/>
+      </w:pPr>
+      <w:rPr>
+        <w:rFonts w:ascii="Wingdings" w:hAnsi="Wingdings" w:hint="default"/>
+        <w:sz w:val="20"/>
+      </w:rPr>
+    </w:lvl>
+    <w:lvl w:ilvl="4" w:tentative="1">
+      <w:start w:val="1"/>
+      <w:numFmt w:val="bullet"/>
+      <w:lvlText w:val=""/>
+      <w:lvlJc w:val="left"/>
+      <w:pPr>
+        <w:tabs>
+          <w:tab w:val="num" w:pos="3600"/>
+        </w:tabs>
+        <w:ind w:left="3600" w:hanging="360"/>
+      </w:pPr>
+      <w:rPr>
+        <w:rFonts w:ascii="Wingdings" w:hAnsi="Wingdings" w:hint="default"/>
+        <w:sz w:val="20"/>
+      </w:rPr>
+    </w:lvl>
+    <w:lvl w:ilvl="5" w:tentative="1">
+      <w:start w:val="1"/>
+      <w:numFmt w:val="bullet"/>
+      <w:lvlText w:val=""/>
+      <w:lvlJc w:val="left"/>
+      <w:pPr>
+        <w:tabs>
+          <w:tab w:val="num" w:pos="4320"/>
+        </w:tabs>
+        <w:ind w:left="4320" w:hanging="360"/>
+      </w:pPr>
+      <w:rPr>
+        <w:rFonts w:ascii="Wingdings" w:hAnsi="Wingdings" w:hint="default"/>
+        <w:sz w:val="20"/>
+      </w:rPr>
+    </w:lvl>
+    <w:lvl w:ilvl="6" w:tentative="1">
+      <w:start w:val="1"/>
+      <w:numFmt w:val="bullet"/>
+      <w:lvlText w:val=""/>
+      <w:lvlJc w:val="left"/>
+      <w:pPr>
+        <w:tabs>
+          <w:tab w:val="num" w:pos="5040"/>
+        </w:tabs>
+        <w:ind w:left="5040" w:hanging="360"/>
+      </w:pPr>
+      <w:rPr>
+        <w:rFonts w:ascii="Wingdings" w:hAnsi="Wingdings" w:hint="default"/>
+        <w:sz w:val="20"/>
+      </w:rPr>
+    </w:lvl>
+    <w:lvl w:ilvl="7" w:tentative="1">
+      <w:start w:val="1"/>
+      <w:numFmt w:val="bullet"/>
+      <w:lvlText w:val=""/>
+      <w:lvlJc w:val="left"/>
+      <w:pPr>
+        <w:tabs>
+          <w:tab w:val="num" w:pos="5760"/>
+        </w:tabs>
+        <w:ind w:left="5760" w:hanging="360"/>
+      </w:pPr>
+      <w:rPr>
+        <w:rFonts w:ascii="Wingdings" w:hAnsi="Wingdings" w:hint="default"/>
+        <w:sz w:val="20"/>
+      </w:rPr>
+    </w:lvl>
+    <w:lvl w:ilvl="8" w:tentative="1">
+      <w:start w:val="1"/>
+      <w:numFmt w:val="bullet"/>
+      <w:lvlText w:val=""/>
+      <w:lvlJc w:val="left"/>
+      <w:pPr>
+        <w:tabs>
+          <w:tab w:val="num" w:pos="6480"/>
+        </w:tabs>
+        <w:ind w:left="6480" w:hanging="360"/>
+      </w:pPr>
+      <w:rPr>
+        <w:rFonts w:ascii="Wingdings" w:hAnsi="Wingdings" w:hint="default"/>
+        <w:sz w:val="20"/>
+      </w:rPr>
+    </w:lvl>
+  </w:abstractNum>
+  <w:abstractNum w:abstractNumId="18" w15:restartNumberingAfterBreak="0">
+    <w:nsid w:val="4554720C"/>
+    <w:multiLevelType w:val="multilevel"/>
+    <w:tmpl w:val="0F8A8C7A"/>
+    <w:lvl w:ilvl="0">
+      <w:start w:val="1"/>
+      <w:numFmt w:val="bullet"/>
+      <w:lvlText w:val=""/>
+      <w:lvlJc w:val="left"/>
+      <w:pPr>
+        <w:tabs>
+          <w:tab w:val="num" w:pos="720"/>
+        </w:tabs>
+        <w:ind w:left="720" w:hanging="360"/>
+      </w:pPr>
+      <w:rPr>
+        <w:rFonts w:ascii="Symbol" w:hAnsi="Symbol" w:hint="default"/>
+        <w:sz w:val="20"/>
+      </w:rPr>
+    </w:lvl>
+    <w:lvl w:ilvl="1" w:tentative="1">
+      <w:start w:val="1"/>
+      <w:numFmt w:val="bullet"/>
+      <w:lvlText w:val="o"/>
+      <w:lvlJc w:val="left"/>
+      <w:pPr>
+        <w:tabs>
+          <w:tab w:val="num" w:pos="1440"/>
+        </w:tabs>
+        <w:ind w:left="1440" w:hanging="360"/>
+      </w:pPr>
+      <w:rPr>
+        <w:rFonts w:ascii="Courier New" w:hAnsi="Courier New" w:hint="default"/>
+        <w:sz w:val="20"/>
+      </w:rPr>
+    </w:lvl>
+    <w:lvl w:ilvl="2" w:tentative="1">
+      <w:start w:val="1"/>
+      <w:numFmt w:val="bullet"/>
+      <w:lvlText w:val=""/>
+      <w:lvlJc w:val="left"/>
+      <w:pPr>
+        <w:tabs>
+          <w:tab w:val="num" w:pos="2160"/>
+        </w:tabs>
+        <w:ind w:left="2160" w:hanging="360"/>
+      </w:pPr>
+      <w:rPr>
+        <w:rFonts w:ascii="Wingdings" w:hAnsi="Wingdings" w:hint="default"/>
+        <w:sz w:val="20"/>
+      </w:rPr>
+    </w:lvl>
+    <w:lvl w:ilvl="3" w:tentative="1">
+      <w:start w:val="1"/>
+      <w:numFmt w:val="bullet"/>
+      <w:lvlText w:val=""/>
+      <w:lvlJc w:val="left"/>
+      <w:pPr>
+        <w:tabs>
+          <w:tab w:val="num" w:pos="2880"/>
+        </w:tabs>
+        <w:ind w:left="2880" w:hanging="360"/>
+      </w:pPr>
+      <w:rPr>
+        <w:rFonts w:ascii="Wingdings" w:hAnsi="Wingdings" w:hint="default"/>
+        <w:sz w:val="20"/>
+      </w:rPr>
+    </w:lvl>
+    <w:lvl w:ilvl="4" w:tentative="1">
+      <w:start w:val="1"/>
+      <w:numFmt w:val="bullet"/>
+      <w:lvlText w:val=""/>
+      <w:lvlJc w:val="left"/>
+      <w:pPr>
+        <w:tabs>
+          <w:tab w:val="num" w:pos="3600"/>
+        </w:tabs>
+        <w:ind w:left="3600" w:hanging="360"/>
+      </w:pPr>
+      <w:rPr>
+        <w:rFonts w:ascii="Wingdings" w:hAnsi="Wingdings" w:hint="default"/>
+        <w:sz w:val="20"/>
+      </w:rPr>
+    </w:lvl>
+    <w:lvl w:ilvl="5" w:tentative="1">
+      <w:start w:val="1"/>
+      <w:numFmt w:val="bullet"/>
+      <w:lvlText w:val=""/>
+      <w:lvlJc w:val="left"/>
+      <w:pPr>
+        <w:tabs>
+          <w:tab w:val="num" w:pos="4320"/>
+        </w:tabs>
+        <w:ind w:left="4320" w:hanging="360"/>
+      </w:pPr>
+      <w:rPr>
+        <w:rFonts w:ascii="Wingdings" w:hAnsi="Wingdings" w:hint="default"/>
+        <w:sz w:val="20"/>
+      </w:rPr>
+    </w:lvl>
+    <w:lvl w:ilvl="6" w:tentative="1">
+      <w:start w:val="1"/>
+      <w:numFmt w:val="bullet"/>
+      <w:lvlText w:val=""/>
+      <w:lvlJc w:val="left"/>
+      <w:pPr>
+        <w:tabs>
+          <w:tab w:val="num" w:pos="5040"/>
+        </w:tabs>
+        <w:ind w:left="5040" w:hanging="360"/>
+      </w:pPr>
+      <w:rPr>
+        <w:rFonts w:ascii="Wingdings" w:hAnsi="Wingdings" w:hint="default"/>
+        <w:sz w:val="20"/>
+      </w:rPr>
+    </w:lvl>
+    <w:lvl w:ilvl="7" w:tentative="1">
+      <w:start w:val="1"/>
+      <w:numFmt w:val="bullet"/>
+      <w:lvlText w:val=""/>
+      <w:lvlJc w:val="left"/>
+      <w:pPr>
+        <w:tabs>
+          <w:tab w:val="num" w:pos="5760"/>
+        </w:tabs>
+        <w:ind w:left="5760" w:hanging="360"/>
+      </w:pPr>
+      <w:rPr>
+        <w:rFonts w:ascii="Wingdings" w:hAnsi="Wingdings" w:hint="default"/>
+        <w:sz w:val="20"/>
+      </w:rPr>
+    </w:lvl>
+    <w:lvl w:ilvl="8" w:tentative="1">
+      <w:start w:val="1"/>
+      <w:numFmt w:val="bullet"/>
+      <w:lvlText w:val=""/>
+      <w:lvlJc w:val="left"/>
+      <w:pPr>
+        <w:tabs>
+          <w:tab w:val="num" w:pos="6480"/>
+        </w:tabs>
+        <w:ind w:left="6480" w:hanging="360"/>
+      </w:pPr>
+      <w:rPr>
+        <w:rFonts w:ascii="Wingdings" w:hAnsi="Wingdings" w:hint="default"/>
+        <w:sz w:val="20"/>
+      </w:rPr>
+    </w:lvl>
+  </w:abstractNum>
+  <w:abstractNum w:abstractNumId="19" w15:restartNumberingAfterBreak="0">
+    <w:nsid w:val="462F3B9E"/>
+    <w:multiLevelType w:val="multilevel"/>
+    <w:tmpl w:val="B4941342"/>
+    <w:lvl w:ilvl="0">
+      <w:start w:val="1"/>
+      <w:numFmt w:val="bullet"/>
+      <w:lvlText w:val=""/>
+      <w:lvlJc w:val="left"/>
+      <w:pPr>
+        <w:tabs>
+          <w:tab w:val="num" w:pos="720"/>
+        </w:tabs>
+        <w:ind w:left="720" w:hanging="360"/>
+      </w:pPr>
+      <w:rPr>
+        <w:rFonts w:ascii="Symbol" w:hAnsi="Symbol" w:hint="default"/>
+        <w:sz w:val="20"/>
+      </w:rPr>
+    </w:lvl>
+    <w:lvl w:ilvl="1" w:tentative="1">
+      <w:start w:val="1"/>
+      <w:numFmt w:val="bullet"/>
+      <w:lvlText w:val="o"/>
+      <w:lvlJc w:val="left"/>
+      <w:pPr>
+        <w:tabs>
+          <w:tab w:val="num" w:pos="1440"/>
+        </w:tabs>
+        <w:ind w:left="1440" w:hanging="360"/>
+      </w:pPr>
+      <w:rPr>
+        <w:rFonts w:ascii="Courier New" w:hAnsi="Courier New" w:hint="default"/>
+        <w:sz w:val="20"/>
+      </w:rPr>
+    </w:lvl>
+    <w:lvl w:ilvl="2" w:tentative="1">
+      <w:start w:val="1"/>
+      <w:numFmt w:val="bullet"/>
+      <w:lvlText w:val=""/>
+      <w:lvlJc w:val="left"/>
+      <w:pPr>
+        <w:tabs>
+          <w:tab w:val="num" w:pos="2160"/>
+        </w:tabs>
+        <w:ind w:left="2160" w:hanging="360"/>
+      </w:pPr>
+      <w:rPr>
+        <w:rFonts w:ascii="Wingdings" w:hAnsi="Wingdings" w:hint="default"/>
+        <w:sz w:val="20"/>
+      </w:rPr>
+    </w:lvl>
+    <w:lvl w:ilvl="3" w:tentative="1">
+      <w:start w:val="1"/>
+      <w:numFmt w:val="bullet"/>
+      <w:lvlText w:val=""/>
+      <w:lvlJc w:val="left"/>
+      <w:pPr>
+        <w:tabs>
+          <w:tab w:val="num" w:pos="2880"/>
+        </w:tabs>
+        <w:ind w:left="2880" w:hanging="360"/>
+      </w:pPr>
+      <w:rPr>
+        <w:rFonts w:ascii="Wingdings" w:hAnsi="Wingdings" w:hint="default"/>
+        <w:sz w:val="20"/>
+      </w:rPr>
+    </w:lvl>
+    <w:lvl w:ilvl="4" w:tentative="1">
+      <w:start w:val="1"/>
+      <w:numFmt w:val="bullet"/>
+      <w:lvlText w:val=""/>
+      <w:lvlJc w:val="left"/>
+      <w:pPr>
+        <w:tabs>
+          <w:tab w:val="num" w:pos="3600"/>
+        </w:tabs>
+        <w:ind w:left="3600" w:hanging="360"/>
+      </w:pPr>
+      <w:rPr>
+        <w:rFonts w:ascii="Wingdings" w:hAnsi="Wingdings" w:hint="default"/>
+        <w:sz w:val="20"/>
+      </w:rPr>
+    </w:lvl>
+    <w:lvl w:ilvl="5" w:tentative="1">
+      <w:start w:val="1"/>
+      <w:numFmt w:val="bullet"/>
+      <w:lvlText w:val=""/>
+      <w:lvlJc w:val="left"/>
+      <w:pPr>
+        <w:tabs>
+          <w:tab w:val="num" w:pos="4320"/>
+        </w:tabs>
+        <w:ind w:left="4320" w:hanging="360"/>
+      </w:pPr>
+      <w:rPr>
+        <w:rFonts w:ascii="Wingdings" w:hAnsi="Wingdings" w:hint="default"/>
+        <w:sz w:val="20"/>
+      </w:rPr>
+    </w:lvl>
+    <w:lvl w:ilvl="6" w:tentative="1">
+      <w:start w:val="1"/>
+      <w:numFmt w:val="bullet"/>
+      <w:lvlText w:val=""/>
+      <w:lvlJc w:val="left"/>
+      <w:pPr>
+        <w:tabs>
+          <w:tab w:val="num" w:pos="5040"/>
+        </w:tabs>
+        <w:ind w:left="5040" w:hanging="360"/>
+      </w:pPr>
+      <w:rPr>
+        <w:rFonts w:ascii="Wingdings" w:hAnsi="Wingdings" w:hint="default"/>
+        <w:sz w:val="20"/>
+      </w:rPr>
+    </w:lvl>
+    <w:lvl w:ilvl="7" w:tentative="1">
+      <w:start w:val="1"/>
+      <w:numFmt w:val="bullet"/>
+      <w:lvlText w:val=""/>
+      <w:lvlJc w:val="left"/>
+      <w:pPr>
+        <w:tabs>
+          <w:tab w:val="num" w:pos="5760"/>
+        </w:tabs>
+        <w:ind w:left="5760" w:hanging="360"/>
+      </w:pPr>
+      <w:rPr>
+        <w:rFonts w:ascii="Wingdings" w:hAnsi="Wingdings" w:hint="default"/>
+        <w:sz w:val="20"/>
+      </w:rPr>
+    </w:lvl>
+    <w:lvl w:ilvl="8" w:tentative="1">
+      <w:start w:val="1"/>
+      <w:numFmt w:val="bullet"/>
+      <w:lvlText w:val=""/>
+      <w:lvlJc w:val="left"/>
+      <w:pPr>
+        <w:tabs>
+          <w:tab w:val="num" w:pos="6480"/>
+        </w:tabs>
+        <w:ind w:left="6480" w:hanging="360"/>
+      </w:pPr>
+      <w:rPr>
+        <w:rFonts w:ascii="Wingdings" w:hAnsi="Wingdings" w:hint="default"/>
+        <w:sz w:val="20"/>
+      </w:rPr>
+    </w:lvl>
+  </w:abstractNum>
+  <w:abstractNum w:abstractNumId="20" w15:restartNumberingAfterBreak="0">
+    <w:nsid w:val="54046E17"/>
+    <w:multiLevelType w:val="multilevel"/>
+    <w:tmpl w:val="65D89D82"/>
+    <w:lvl w:ilvl="0">
+      <w:start w:val="1"/>
+      <w:numFmt w:val="bullet"/>
+      <w:lvlText w:val=""/>
+      <w:lvlJc w:val="left"/>
+      <w:pPr>
+        <w:tabs>
+          <w:tab w:val="num" w:pos="720"/>
+        </w:tabs>
+        <w:ind w:left="720" w:hanging="360"/>
+      </w:pPr>
+      <w:rPr>
+        <w:rFonts w:ascii="Symbol" w:hAnsi="Symbol" w:hint="default"/>
+        <w:sz w:val="20"/>
+      </w:rPr>
+    </w:lvl>
+    <w:lvl w:ilvl="1" w:tentative="1">
+      <w:start w:val="1"/>
+      <w:numFmt w:val="bullet"/>
+      <w:lvlText w:val="o"/>
+      <w:lvlJc w:val="left"/>
+      <w:pPr>
+        <w:tabs>
+          <w:tab w:val="num" w:pos="1440"/>
+        </w:tabs>
+        <w:ind w:left="1440" w:hanging="360"/>
+      </w:pPr>
+      <w:rPr>
+        <w:rFonts w:ascii="Courier New" w:hAnsi="Courier New" w:hint="default"/>
+        <w:sz w:val="20"/>
+      </w:rPr>
+    </w:lvl>
+    <w:lvl w:ilvl="2" w:tentative="1">
+      <w:start w:val="1"/>
+      <w:numFmt w:val="bullet"/>
+      <w:lvlText w:val=""/>
+      <w:lvlJc w:val="left"/>
+      <w:pPr>
+        <w:tabs>
+          <w:tab w:val="num" w:pos="2160"/>
+        </w:tabs>
+        <w:ind w:left="2160" w:hanging="360"/>
+      </w:pPr>
+      <w:rPr>
+        <w:rFonts w:ascii="Wingdings" w:hAnsi="Wingdings" w:hint="default"/>
+        <w:sz w:val="20"/>
+      </w:rPr>
+    </w:lvl>
+    <w:lvl w:ilvl="3" w:tentative="1">
+      <w:start w:val="1"/>
+      <w:numFmt w:val="bullet"/>
+      <w:lvlText w:val=""/>
+      <w:lvlJc w:val="left"/>
+      <w:pPr>
+        <w:tabs>
+          <w:tab w:val="num" w:pos="2880"/>
+        </w:tabs>
+        <w:ind w:left="2880" w:hanging="360"/>
+      </w:pPr>
+      <w:rPr>
+        <w:rFonts w:ascii="Wingdings" w:hAnsi="Wingdings" w:hint="default"/>
+        <w:sz w:val="20"/>
+      </w:rPr>
+    </w:lvl>
+    <w:lvl w:ilvl="4" w:tentative="1">
+      <w:start w:val="1"/>
+      <w:numFmt w:val="bullet"/>
+      <w:lvlText w:val=""/>
+      <w:lvlJc w:val="left"/>
+      <w:pPr>
+        <w:tabs>
+          <w:tab w:val="num" w:pos="3600"/>
+        </w:tabs>
+        <w:ind w:left="3600" w:hanging="360"/>
+      </w:pPr>
+      <w:rPr>
+        <w:rFonts w:ascii="Wingdings" w:hAnsi="Wingdings" w:hint="default"/>
+        <w:sz w:val="20"/>
+      </w:rPr>
+    </w:lvl>
+    <w:lvl w:ilvl="5" w:tentative="1">
+      <w:start w:val="1"/>
+      <w:numFmt w:val="bullet"/>
+      <w:lvlText w:val=""/>
+      <w:lvlJc w:val="left"/>
+      <w:pPr>
+        <w:tabs>
+          <w:tab w:val="num" w:pos="4320"/>
+        </w:tabs>
+        <w:ind w:left="4320" w:hanging="360"/>
+      </w:pPr>
+      <w:rPr>
+        <w:rFonts w:ascii="Wingdings" w:hAnsi="Wingdings" w:hint="default"/>
+        <w:sz w:val="20"/>
+      </w:rPr>
+    </w:lvl>
+    <w:lvl w:ilvl="6" w:tentative="1">
+      <w:start w:val="1"/>
+      <w:numFmt w:val="bullet"/>
+      <w:lvlText w:val=""/>
+      <w:lvlJc w:val="left"/>
+      <w:pPr>
+        <w:tabs>
+          <w:tab w:val="num" w:pos="5040"/>
+        </w:tabs>
+        <w:ind w:left="5040" w:hanging="360"/>
+      </w:pPr>
+      <w:rPr>
+        <w:rFonts w:ascii="Wingdings" w:hAnsi="Wingdings" w:hint="default"/>
+        <w:sz w:val="20"/>
+      </w:rPr>
+    </w:lvl>
+    <w:lvl w:ilvl="7" w:tentative="1">
+      <w:start w:val="1"/>
+      <w:numFmt w:val="bullet"/>
+      <w:lvlText w:val=""/>
+      <w:lvlJc w:val="left"/>
+      <w:pPr>
+        <w:tabs>
+          <w:tab w:val="num" w:pos="5760"/>
+        </w:tabs>
+        <w:ind w:left="5760" w:hanging="360"/>
+      </w:pPr>
+      <w:rPr>
+        <w:rFonts w:ascii="Wingdings" w:hAnsi="Wingdings" w:hint="default"/>
+        <w:sz w:val="20"/>
+      </w:rPr>
+    </w:lvl>
+    <w:lvl w:ilvl="8" w:tentative="1">
+      <w:start w:val="1"/>
+      <w:numFmt w:val="bullet"/>
+      <w:lvlText w:val=""/>
+      <w:lvlJc w:val="left"/>
+      <w:pPr>
+        <w:tabs>
+          <w:tab w:val="num" w:pos="6480"/>
+        </w:tabs>
+        <w:ind w:left="6480" w:hanging="360"/>
+      </w:pPr>
+      <w:rPr>
+        <w:rFonts w:ascii="Wingdings" w:hAnsi="Wingdings" w:hint="default"/>
+        <w:sz w:val="20"/>
+      </w:rPr>
+    </w:lvl>
+  </w:abstractNum>
+  <w:abstractNum w:abstractNumId="21" w15:restartNumberingAfterBreak="0">
+    <w:nsid w:val="542019FC"/>
+    <w:multiLevelType w:val="multilevel"/>
+    <w:tmpl w:val="1D7CA978"/>
+    <w:lvl w:ilvl="0">
+      <w:start w:val="1"/>
+      <w:numFmt w:val="bullet"/>
+      <w:lvlText w:val=""/>
+      <w:lvlJc w:val="left"/>
+      <w:pPr>
+        <w:tabs>
+          <w:tab w:val="num" w:pos="720"/>
+        </w:tabs>
+        <w:ind w:left="720" w:hanging="360"/>
+      </w:pPr>
+      <w:rPr>
+        <w:rFonts w:ascii="Symbol" w:hAnsi="Symbol" w:hint="default"/>
+        <w:sz w:val="20"/>
+      </w:rPr>
+    </w:lvl>
+    <w:lvl w:ilvl="1" w:tentative="1">
+      <w:start w:val="1"/>
+      <w:numFmt w:val="bullet"/>
+      <w:lvlText w:val="o"/>
+      <w:lvlJc w:val="left"/>
+      <w:pPr>
+        <w:tabs>
+          <w:tab w:val="num" w:pos="1440"/>
+        </w:tabs>
+        <w:ind w:left="1440" w:hanging="360"/>
+      </w:pPr>
+      <w:rPr>
+        <w:rFonts w:ascii="Courier New" w:hAnsi="Courier New" w:hint="default"/>
+        <w:sz w:val="20"/>
+      </w:rPr>
+    </w:lvl>
+    <w:lvl w:ilvl="2" w:tentative="1">
+      <w:start w:val="1"/>
+      <w:numFmt w:val="bullet"/>
+      <w:lvlText w:val=""/>
+      <w:lvlJc w:val="left"/>
+      <w:pPr>
+        <w:tabs>
+          <w:tab w:val="num" w:pos="2160"/>
+        </w:tabs>
+        <w:ind w:left="2160" w:hanging="360"/>
+      </w:pPr>
+      <w:rPr>
+        <w:rFonts w:ascii="Wingdings" w:hAnsi="Wingdings" w:hint="default"/>
+        <w:sz w:val="20"/>
+      </w:rPr>
+    </w:lvl>
+    <w:lvl w:ilvl="3" w:tentative="1">
+      <w:start w:val="1"/>
+      <w:numFmt w:val="bullet"/>
+      <w:lvlText w:val=""/>
+      <w:lvlJc w:val="left"/>
+      <w:pPr>
+        <w:tabs>
+          <w:tab w:val="num" w:pos="2880"/>
+        </w:tabs>
+        <w:ind w:left="2880" w:hanging="360"/>
+      </w:pPr>
+      <w:rPr>
+        <w:rFonts w:ascii="Wingdings" w:hAnsi="Wingdings" w:hint="default"/>
+        <w:sz w:val="20"/>
+      </w:rPr>
+    </w:lvl>
+    <w:lvl w:ilvl="4" w:tentative="1">
+      <w:start w:val="1"/>
+      <w:numFmt w:val="bullet"/>
+      <w:lvlText w:val=""/>
+      <w:lvlJc w:val="left"/>
+      <w:pPr>
+        <w:tabs>
+          <w:tab w:val="num" w:pos="3600"/>
+        </w:tabs>
+        <w:ind w:left="3600" w:hanging="360"/>
+      </w:pPr>
+      <w:rPr>
+        <w:rFonts w:ascii="Wingdings" w:hAnsi="Wingdings" w:hint="default"/>
+        <w:sz w:val="20"/>
+      </w:rPr>
+    </w:lvl>
+    <w:lvl w:ilvl="5" w:tentative="1">
+      <w:start w:val="1"/>
+      <w:numFmt w:val="bullet"/>
+      <w:lvlText w:val=""/>
+      <w:lvlJc w:val="left"/>
+      <w:pPr>
+        <w:tabs>
+          <w:tab w:val="num" w:pos="4320"/>
+        </w:tabs>
+        <w:ind w:left="4320" w:hanging="360"/>
+      </w:pPr>
+      <w:rPr>
+        <w:rFonts w:ascii="Wingdings" w:hAnsi="Wingdings" w:hint="default"/>
+        <w:sz w:val="20"/>
+      </w:rPr>
+    </w:lvl>
+    <w:lvl w:ilvl="6" w:tentative="1">
+      <w:start w:val="1"/>
+      <w:numFmt w:val="bullet"/>
+      <w:lvlText w:val=""/>
+      <w:lvlJc w:val="left"/>
+      <w:pPr>
+        <w:tabs>
+          <w:tab w:val="num" w:pos="5040"/>
+        </w:tabs>
+        <w:ind w:left="5040" w:hanging="360"/>
+      </w:pPr>
+      <w:rPr>
+        <w:rFonts w:ascii="Wingdings" w:hAnsi="Wingdings" w:hint="default"/>
+        <w:sz w:val="20"/>
+      </w:rPr>
+    </w:lvl>
+    <w:lvl w:ilvl="7" w:tentative="1">
+      <w:start w:val="1"/>
+      <w:numFmt w:val="bullet"/>
+      <w:lvlText w:val=""/>
+      <w:lvlJc w:val="left"/>
+      <w:pPr>
+        <w:tabs>
+          <w:tab w:val="num" w:pos="5760"/>
+        </w:tabs>
+        <w:ind w:left="5760" w:hanging="360"/>
+      </w:pPr>
+      <w:rPr>
+        <w:rFonts w:ascii="Wingdings" w:hAnsi="Wingdings" w:hint="default"/>
+        <w:sz w:val="20"/>
+      </w:rPr>
+    </w:lvl>
+    <w:lvl w:ilvl="8" w:tentative="1">
+      <w:start w:val="1"/>
+      <w:numFmt w:val="bullet"/>
+      <w:lvlText w:val=""/>
+      <w:lvlJc w:val="left"/>
+      <w:pPr>
+        <w:tabs>
+          <w:tab w:val="num" w:pos="6480"/>
+        </w:tabs>
+        <w:ind w:left="6480" w:hanging="360"/>
+      </w:pPr>
+      <w:rPr>
+        <w:rFonts w:ascii="Wingdings" w:hAnsi="Wingdings" w:hint="default"/>
+        <w:sz w:val="20"/>
+      </w:rPr>
+    </w:lvl>
+  </w:abstractNum>
+  <w:abstractNum w:abstractNumId="22" w15:restartNumberingAfterBreak="0">
+    <w:nsid w:val="578261B9"/>
+    <w:multiLevelType w:val="multilevel"/>
+    <w:tmpl w:val="9C1EA0EE"/>
+    <w:lvl w:ilvl="0">
+      <w:start w:val="1"/>
+      <w:numFmt w:val="bullet"/>
+      <w:lvlText w:val=""/>
+      <w:lvlJc w:val="left"/>
+      <w:pPr>
+        <w:tabs>
+          <w:tab w:val="num" w:pos="720"/>
+        </w:tabs>
+        <w:ind w:left="720" w:hanging="360"/>
+      </w:pPr>
+      <w:rPr>
+        <w:rFonts w:ascii="Symbol" w:hAnsi="Symbol" w:hint="default"/>
+        <w:sz w:val="20"/>
+      </w:rPr>
+    </w:lvl>
+    <w:lvl w:ilvl="1" w:tentative="1">
+      <w:start w:val="1"/>
+      <w:numFmt w:val="bullet"/>
+      <w:lvlText w:val="o"/>
+      <w:lvlJc w:val="left"/>
+      <w:pPr>
+        <w:tabs>
+          <w:tab w:val="num" w:pos="1440"/>
+        </w:tabs>
+        <w:ind w:left="1440" w:hanging="360"/>
+      </w:pPr>
+      <w:rPr>
+        <w:rFonts w:ascii="Courier New" w:hAnsi="Courier New" w:hint="default"/>
+        <w:sz w:val="20"/>
+      </w:rPr>
+    </w:lvl>
+    <w:lvl w:ilvl="2" w:tentative="1">
+      <w:start w:val="1"/>
+      <w:numFmt w:val="bullet"/>
+      <w:lvlText w:val=""/>
+      <w:lvlJc w:val="left"/>
+      <w:pPr>
+        <w:tabs>
+          <w:tab w:val="num" w:pos="2160"/>
+        </w:tabs>
+        <w:ind w:left="2160" w:hanging="360"/>
+      </w:pPr>
+      <w:rPr>
+        <w:rFonts w:ascii="Wingdings" w:hAnsi="Wingdings" w:hint="default"/>
+        <w:sz w:val="20"/>
+      </w:rPr>
+    </w:lvl>
+    <w:lvl w:ilvl="3" w:tentative="1">
+      <w:start w:val="1"/>
+      <w:numFmt w:val="bullet"/>
+      <w:lvlText w:val=""/>
+      <w:lvlJc w:val="left"/>
+      <w:pPr>
+        <w:tabs>
+          <w:tab w:val="num" w:pos="2880"/>
+        </w:tabs>
+        <w:ind w:left="2880" w:hanging="360"/>
+      </w:pPr>
+      <w:rPr>
+        <w:rFonts w:ascii="Wingdings" w:hAnsi="Wingdings" w:hint="default"/>
+        <w:sz w:val="20"/>
+      </w:rPr>
+    </w:lvl>
+    <w:lvl w:ilvl="4" w:tentative="1">
+      <w:start w:val="1"/>
+      <w:numFmt w:val="bullet"/>
+      <w:lvlText w:val=""/>
+      <w:lvlJc w:val="left"/>
+      <w:pPr>
+        <w:tabs>
+          <w:tab w:val="num" w:pos="3600"/>
+        </w:tabs>
+        <w:ind w:left="3600" w:hanging="360"/>
+      </w:pPr>
+      <w:rPr>
+        <w:rFonts w:ascii="Wingdings" w:hAnsi="Wingdings" w:hint="default"/>
+        <w:sz w:val="20"/>
+      </w:rPr>
+    </w:lvl>
+    <w:lvl w:ilvl="5" w:tentative="1">
+      <w:start w:val="1"/>
+      <w:numFmt w:val="bullet"/>
+      <w:lvlText w:val=""/>
+      <w:lvlJc w:val="left"/>
+      <w:pPr>
+        <w:tabs>
+          <w:tab w:val="num" w:pos="4320"/>
+        </w:tabs>
+        <w:ind w:left="4320" w:hanging="360"/>
+      </w:pPr>
+      <w:rPr>
+        <w:rFonts w:ascii="Wingdings" w:hAnsi="Wingdings" w:hint="default"/>
+        <w:sz w:val="20"/>
+      </w:rPr>
+    </w:lvl>
+    <w:lvl w:ilvl="6" w:tentative="1">
+      <w:start w:val="1"/>
+      <w:numFmt w:val="bullet"/>
+      <w:lvlText w:val=""/>
+      <w:lvlJc w:val="left"/>
+      <w:pPr>
+        <w:tabs>
+          <w:tab w:val="num" w:pos="5040"/>
+        </w:tabs>
+        <w:ind w:left="5040" w:hanging="360"/>
+      </w:pPr>
+      <w:rPr>
+        <w:rFonts w:ascii="Wingdings" w:hAnsi="Wingdings" w:hint="default"/>
+        <w:sz w:val="20"/>
+      </w:rPr>
+    </w:lvl>
+    <w:lvl w:ilvl="7" w:tentative="1">
+      <w:start w:val="1"/>
+      <w:numFmt w:val="bullet"/>
+      <w:lvlText w:val=""/>
+      <w:lvlJc w:val="left"/>
+      <w:pPr>
+        <w:tabs>
+          <w:tab w:val="num" w:pos="5760"/>
+        </w:tabs>
+        <w:ind w:left="5760" w:hanging="360"/>
+      </w:pPr>
+      <w:rPr>
+        <w:rFonts w:ascii="Wingdings" w:hAnsi="Wingdings" w:hint="default"/>
+        <w:sz w:val="20"/>
+      </w:rPr>
+    </w:lvl>
+    <w:lvl w:ilvl="8" w:tentative="1">
+      <w:start w:val="1"/>
+      <w:numFmt w:val="bullet"/>
+      <w:lvlText w:val=""/>
+      <w:lvlJc w:val="left"/>
+      <w:pPr>
+        <w:tabs>
+          <w:tab w:val="num" w:pos="6480"/>
+        </w:tabs>
+        <w:ind w:left="6480" w:hanging="360"/>
+      </w:pPr>
+      <w:rPr>
+        <w:rFonts w:ascii="Wingdings" w:hAnsi="Wingdings" w:hint="default"/>
+        <w:sz w:val="20"/>
+      </w:rPr>
+    </w:lvl>
+  </w:abstractNum>
+  <w:abstractNum w:abstractNumId="23" w15:restartNumberingAfterBreak="0">
+    <w:nsid w:val="641547A7"/>
+    <w:multiLevelType w:val="multilevel"/>
+    <w:tmpl w:val="4F7CA03E"/>
+    <w:lvl w:ilvl="0">
+      <w:start w:val="1"/>
+      <w:numFmt w:val="bullet"/>
+      <w:lvlText w:val=""/>
+      <w:lvlJc w:val="left"/>
+      <w:pPr>
+        <w:tabs>
+          <w:tab w:val="num" w:pos="720"/>
+        </w:tabs>
+        <w:ind w:left="720" w:hanging="360"/>
+      </w:pPr>
+      <w:rPr>
+        <w:rFonts w:ascii="Symbol" w:hAnsi="Symbol" w:hint="default"/>
+        <w:sz w:val="20"/>
+      </w:rPr>
+    </w:lvl>
+    <w:lvl w:ilvl="1" w:tentative="1">
+      <w:start w:val="1"/>
+      <w:numFmt w:val="bullet"/>
+      <w:lvlText w:val="o"/>
+      <w:lvlJc w:val="left"/>
+      <w:pPr>
+        <w:tabs>
+          <w:tab w:val="num" w:pos="1440"/>
+        </w:tabs>
+        <w:ind w:left="1440" w:hanging="360"/>
+      </w:pPr>
+      <w:rPr>
+        <w:rFonts w:ascii="Courier New" w:hAnsi="Courier New" w:hint="default"/>
+        <w:sz w:val="20"/>
+      </w:rPr>
+    </w:lvl>
+    <w:lvl w:ilvl="2" w:tentative="1">
+      <w:start w:val="1"/>
+      <w:numFmt w:val="bullet"/>
+      <w:lvlText w:val=""/>
+      <w:lvlJc w:val="left"/>
+      <w:pPr>
+        <w:tabs>
+          <w:tab w:val="num" w:pos="2160"/>
+        </w:tabs>
+        <w:ind w:left="2160" w:hanging="360"/>
+      </w:pPr>
+      <w:rPr>
+        <w:rFonts w:ascii="Wingdings" w:hAnsi="Wingdings" w:hint="default"/>
+        <w:sz w:val="20"/>
+      </w:rPr>
+    </w:lvl>
+    <w:lvl w:ilvl="3" w:tentative="1">
+      <w:start w:val="1"/>
+      <w:numFmt w:val="bullet"/>
+      <w:lvlText w:val=""/>
+      <w:lvlJc w:val="left"/>
+      <w:pPr>
+        <w:tabs>
+          <w:tab w:val="num" w:pos="2880"/>
+        </w:tabs>
+        <w:ind w:left="2880" w:hanging="360"/>
+      </w:pPr>
+      <w:rPr>
+        <w:rFonts w:ascii="Wingdings" w:hAnsi="Wingdings" w:hint="default"/>
+        <w:sz w:val="20"/>
+      </w:rPr>
+    </w:lvl>
+    <w:lvl w:ilvl="4" w:tentative="1">
+      <w:start w:val="1"/>
+      <w:numFmt w:val="bullet"/>
+      <w:lvlText w:val=""/>
+      <w:lvlJc w:val="left"/>
+      <w:pPr>
+        <w:tabs>
+          <w:tab w:val="num" w:pos="3600"/>
+        </w:tabs>
+        <w:ind w:left="3600" w:hanging="360"/>
+      </w:pPr>
+      <w:rPr>
+        <w:rFonts w:ascii="Wingdings" w:hAnsi="Wingdings" w:hint="default"/>
+        <w:sz w:val="20"/>
+      </w:rPr>
+    </w:lvl>
+    <w:lvl w:ilvl="5" w:tentative="1">
+      <w:start w:val="1"/>
+      <w:numFmt w:val="bullet"/>
+      <w:lvlText w:val=""/>
+      <w:lvlJc w:val="left"/>
+      <w:pPr>
+        <w:tabs>
+          <w:tab w:val="num" w:pos="4320"/>
+        </w:tabs>
+        <w:ind w:left="4320" w:hanging="360"/>
+      </w:pPr>
+      <w:rPr>
+        <w:rFonts w:ascii="Wingdings" w:hAnsi="Wingdings" w:hint="default"/>
+        <w:sz w:val="20"/>
+      </w:rPr>
+    </w:lvl>
+    <w:lvl w:ilvl="6" w:tentative="1">
+      <w:start w:val="1"/>
+      <w:numFmt w:val="bullet"/>
+      <w:lvlText w:val=""/>
+      <w:lvlJc w:val="left"/>
+      <w:pPr>
+        <w:tabs>
+          <w:tab w:val="num" w:pos="5040"/>
+        </w:tabs>
+        <w:ind w:left="5040" w:hanging="360"/>
+      </w:pPr>
+      <w:rPr>
+        <w:rFonts w:ascii="Wingdings" w:hAnsi="Wingdings" w:hint="default"/>
+        <w:sz w:val="20"/>
+      </w:rPr>
+    </w:lvl>
+    <w:lvl w:ilvl="7" w:tentative="1">
+      <w:start w:val="1"/>
+      <w:numFmt w:val="bullet"/>
+      <w:lvlText w:val=""/>
+      <w:lvlJc w:val="left"/>
+      <w:pPr>
+        <w:tabs>
+          <w:tab w:val="num" w:pos="5760"/>
+        </w:tabs>
+        <w:ind w:left="5760" w:hanging="360"/>
+      </w:pPr>
+      <w:rPr>
+        <w:rFonts w:ascii="Wingdings" w:hAnsi="Wingdings" w:hint="default"/>
+        <w:sz w:val="20"/>
+      </w:rPr>
+    </w:lvl>
+    <w:lvl w:ilvl="8" w:tentative="1">
+      <w:start w:val="1"/>
+      <w:numFmt w:val="bullet"/>
+      <w:lvlText w:val=""/>
+      <w:lvlJc w:val="left"/>
+      <w:pPr>
+        <w:tabs>
+          <w:tab w:val="num" w:pos="6480"/>
+        </w:tabs>
+        <w:ind w:left="6480" w:hanging="360"/>
+      </w:pPr>
+      <w:rPr>
+        <w:rFonts w:ascii="Wingdings" w:hAnsi="Wingdings" w:hint="default"/>
+        <w:sz w:val="20"/>
+      </w:rPr>
+    </w:lvl>
+  </w:abstractNum>
+  <w:abstractNum w:abstractNumId="24" w15:restartNumberingAfterBreak="0">
+    <w:nsid w:val="69DF4CC3"/>
+    <w:multiLevelType w:val="multilevel"/>
+    <w:tmpl w:val="4CE2DFE8"/>
+    <w:lvl w:ilvl="0">
+      <w:start w:val="1"/>
+      <w:numFmt w:val="bullet"/>
+      <w:lvlText w:val=""/>
+      <w:lvlJc w:val="left"/>
+      <w:pPr>
+        <w:tabs>
+          <w:tab w:val="num" w:pos="720"/>
+        </w:tabs>
+        <w:ind w:left="720" w:hanging="360"/>
+      </w:pPr>
+      <w:rPr>
+        <w:rFonts w:ascii="Symbol" w:hAnsi="Symbol" w:hint="default"/>
+        <w:sz w:val="20"/>
+      </w:rPr>
+    </w:lvl>
+    <w:lvl w:ilvl="1" w:tentative="1">
+      <w:start w:val="1"/>
+      <w:numFmt w:val="bullet"/>
+      <w:lvlText w:val="o"/>
+      <w:lvlJc w:val="left"/>
+      <w:pPr>
+        <w:tabs>
+          <w:tab w:val="num" w:pos="1440"/>
+        </w:tabs>
+        <w:ind w:left="1440" w:hanging="360"/>
+      </w:pPr>
+      <w:rPr>
+        <w:rFonts w:ascii="Courier New" w:hAnsi="Courier New" w:hint="default"/>
+        <w:sz w:val="20"/>
+      </w:rPr>
+    </w:lvl>
+    <w:lvl w:ilvl="2" w:tentative="1">
+      <w:start w:val="1"/>
+      <w:numFmt w:val="bullet"/>
+      <w:lvlText w:val=""/>
+      <w:lvlJc w:val="left"/>
+      <w:pPr>
+        <w:tabs>
+          <w:tab w:val="num" w:pos="2160"/>
+        </w:tabs>
+        <w:ind w:left="2160" w:hanging="360"/>
+      </w:pPr>
+      <w:rPr>
+        <w:rFonts w:ascii="Wingdings" w:hAnsi="Wingdings" w:hint="default"/>
+        <w:sz w:val="20"/>
+      </w:rPr>
+    </w:lvl>
+    <w:lvl w:ilvl="3" w:tentative="1">
+      <w:start w:val="1"/>
+      <w:numFmt w:val="bullet"/>
+      <w:lvlText w:val=""/>
+      <w:lvlJc w:val="left"/>
+      <w:pPr>
+        <w:tabs>
+          <w:tab w:val="num" w:pos="2880"/>
+        </w:tabs>
+        <w:ind w:left="2880" w:hanging="360"/>
+      </w:pPr>
+      <w:rPr>
+        <w:rFonts w:ascii="Wingdings" w:hAnsi="Wingdings" w:hint="default"/>
+        <w:sz w:val="20"/>
+      </w:rPr>
+    </w:lvl>
+    <w:lvl w:ilvl="4" w:tentative="1">
+      <w:start w:val="1"/>
+      <w:numFmt w:val="bullet"/>
+      <w:lvlText w:val=""/>
+      <w:lvlJc w:val="left"/>
+      <w:pPr>
+        <w:tabs>
+          <w:tab w:val="num" w:pos="3600"/>
+        </w:tabs>
+        <w:ind w:left="3600" w:hanging="360"/>
+      </w:pPr>
+      <w:rPr>
+        <w:rFonts w:ascii="Wingdings" w:hAnsi="Wingdings" w:hint="default"/>
+        <w:sz w:val="20"/>
+      </w:rPr>
+    </w:lvl>
+    <w:lvl w:ilvl="5" w:tentative="1">
+      <w:start w:val="1"/>
+      <w:numFmt w:val="bullet"/>
+      <w:lvlText w:val=""/>
+      <w:lvlJc w:val="left"/>
+      <w:pPr>
+        <w:tabs>
+          <w:tab w:val="num" w:pos="4320"/>
+        </w:tabs>
+        <w:ind w:left="4320" w:hanging="360"/>
+      </w:pPr>
+      <w:rPr>
+        <w:rFonts w:ascii="Wingdings" w:hAnsi="Wingdings" w:hint="default"/>
+        <w:sz w:val="20"/>
+      </w:rPr>
+    </w:lvl>
+    <w:lvl w:ilvl="6" w:tentative="1">
+      <w:start w:val="1"/>
+      <w:numFmt w:val="bullet"/>
+      <w:lvlText w:val=""/>
+      <w:lvlJc w:val="left"/>
+      <w:pPr>
+        <w:tabs>
+          <w:tab w:val="num" w:pos="5040"/>
+        </w:tabs>
+        <w:ind w:left="5040" w:hanging="360"/>
+      </w:pPr>
+      <w:rPr>
+        <w:rFonts w:ascii="Wingdings" w:hAnsi="Wingdings" w:hint="default"/>
+        <w:sz w:val="20"/>
+      </w:rPr>
+    </w:lvl>
+    <w:lvl w:ilvl="7" w:tentative="1">
+      <w:start w:val="1"/>
+      <w:numFmt w:val="bullet"/>
+      <w:lvlText w:val=""/>
+      <w:lvlJc w:val="left"/>
+      <w:pPr>
+        <w:tabs>
+          <w:tab w:val="num" w:pos="5760"/>
+        </w:tabs>
+        <w:ind w:left="5760" w:hanging="360"/>
+      </w:pPr>
+      <w:rPr>
+        <w:rFonts w:ascii="Wingdings" w:hAnsi="Wingdings" w:hint="default"/>
+        <w:sz w:val="20"/>
+      </w:rPr>
+    </w:lvl>
+    <w:lvl w:ilvl="8" w:tentative="1">
+      <w:start w:val="1"/>
+      <w:numFmt w:val="bullet"/>
+      <w:lvlText w:val=""/>
+      <w:lvlJc w:val="left"/>
+      <w:pPr>
+        <w:tabs>
+          <w:tab w:val="num" w:pos="6480"/>
+        </w:tabs>
+        <w:ind w:left="6480" w:hanging="360"/>
+      </w:pPr>
+      <w:rPr>
+        <w:rFonts w:ascii="Wingdings" w:hAnsi="Wingdings" w:hint="default"/>
+        <w:sz w:val="20"/>
+      </w:rPr>
+    </w:lvl>
+  </w:abstractNum>
+  <w:abstractNum w:abstractNumId="25" w15:restartNumberingAfterBreak="0">
+    <w:nsid w:val="6C6B0BD8"/>
+    <w:multiLevelType w:val="multilevel"/>
+    <w:tmpl w:val="441C57FC"/>
+    <w:lvl w:ilvl="0">
+      <w:start w:val="1"/>
+      <w:numFmt w:val="bullet"/>
+      <w:lvlText w:val=""/>
+      <w:lvlJc w:val="left"/>
+      <w:pPr>
+        <w:tabs>
+          <w:tab w:val="num" w:pos="720"/>
+        </w:tabs>
+        <w:ind w:left="720" w:hanging="360"/>
+      </w:pPr>
+      <w:rPr>
+        <w:rFonts w:ascii="Symbol" w:hAnsi="Symbol" w:hint="default"/>
+        <w:sz w:val="20"/>
+      </w:rPr>
+    </w:lvl>
+    <w:lvl w:ilvl="1" w:tentative="1">
+      <w:start w:val="1"/>
+      <w:numFmt w:val="bullet"/>
+      <w:lvlText w:val="o"/>
+      <w:lvlJc w:val="left"/>
+      <w:pPr>
+        <w:tabs>
+          <w:tab w:val="num" w:pos="1440"/>
+        </w:tabs>
+        <w:ind w:left="1440" w:hanging="360"/>
+      </w:pPr>
+      <w:rPr>
+        <w:rFonts w:ascii="Courier New" w:hAnsi="Courier New" w:hint="default"/>
+        <w:sz w:val="20"/>
+      </w:rPr>
+    </w:lvl>
+    <w:lvl w:ilvl="2" w:tentative="1">
+      <w:start w:val="1"/>
+      <w:numFmt w:val="bullet"/>
+      <w:lvlText w:val=""/>
+      <w:lvlJc w:val="left"/>
+      <w:pPr>
+        <w:tabs>
+          <w:tab w:val="num" w:pos="2160"/>
+        </w:tabs>
+        <w:ind w:left="2160" w:hanging="360"/>
+      </w:pPr>
+      <w:rPr>
+        <w:rFonts w:ascii="Wingdings" w:hAnsi="Wingdings" w:hint="default"/>
+        <w:sz w:val="20"/>
+      </w:rPr>
+    </w:lvl>
+    <w:lvl w:ilvl="3" w:tentative="1">
+      <w:start w:val="1"/>
+      <w:numFmt w:val="bullet"/>
+      <w:lvlText w:val=""/>
+      <w:lvlJc w:val="left"/>
+      <w:pPr>
+        <w:tabs>
+          <w:tab w:val="num" w:pos="2880"/>
+        </w:tabs>
+        <w:ind w:left="2880" w:hanging="360"/>
+      </w:pPr>
+      <w:rPr>
+        <w:rFonts w:ascii="Wingdings" w:hAnsi="Wingdings" w:hint="default"/>
+        <w:sz w:val="20"/>
+      </w:rPr>
+    </w:lvl>
+    <w:lvl w:ilvl="4" w:tentative="1">
+      <w:start w:val="1"/>
+      <w:numFmt w:val="bullet"/>
+      <w:lvlText w:val=""/>
+      <w:lvlJc w:val="left"/>
+      <w:pPr>
+        <w:tabs>
+          <w:tab w:val="num" w:pos="3600"/>
+        </w:tabs>
+        <w:ind w:left="3600" w:hanging="360"/>
+      </w:pPr>
+      <w:rPr>
+        <w:rFonts w:ascii="Wingdings" w:hAnsi="Wingdings" w:hint="default"/>
+        <w:sz w:val="20"/>
+      </w:rPr>
+    </w:lvl>
+    <w:lvl w:ilvl="5" w:tentative="1">
+      <w:start w:val="1"/>
+      <w:numFmt w:val="bullet"/>
+      <w:lvlText w:val=""/>
+      <w:lvlJc w:val="left"/>
+      <w:pPr>
+        <w:tabs>
+          <w:tab w:val="num" w:pos="4320"/>
+        </w:tabs>
+        <w:ind w:left="4320" w:hanging="360"/>
+      </w:pPr>
+      <w:rPr>
+        <w:rFonts w:ascii="Wingdings" w:hAnsi="Wingdings" w:hint="default"/>
+        <w:sz w:val="20"/>
+      </w:rPr>
+    </w:lvl>
+    <w:lvl w:ilvl="6" w:tentative="1">
+      <w:start w:val="1"/>
+      <w:numFmt w:val="bullet"/>
+      <w:lvlText w:val=""/>
+      <w:lvlJc w:val="left"/>
+      <w:pPr>
+        <w:tabs>
+          <w:tab w:val="num" w:pos="5040"/>
+        </w:tabs>
+        <w:ind w:left="5040" w:hanging="360"/>
+      </w:pPr>
+      <w:rPr>
+        <w:rFonts w:ascii="Wingdings" w:hAnsi="Wingdings" w:hint="default"/>
+        <w:sz w:val="20"/>
+      </w:rPr>
+    </w:lvl>
+    <w:lvl w:ilvl="7" w:tentative="1">
+      <w:start w:val="1"/>
+      <w:numFmt w:val="bullet"/>
+      <w:lvlText w:val=""/>
+      <w:lvlJc w:val="left"/>
+      <w:pPr>
+        <w:tabs>
+          <w:tab w:val="num" w:pos="5760"/>
+        </w:tabs>
+        <w:ind w:left="5760" w:hanging="360"/>
+      </w:pPr>
+      <w:rPr>
+        <w:rFonts w:ascii="Wingdings" w:hAnsi="Wingdings" w:hint="default"/>
+        <w:sz w:val="20"/>
+      </w:rPr>
+    </w:lvl>
+    <w:lvl w:ilvl="8" w:tentative="1">
+      <w:start w:val="1"/>
+      <w:numFmt w:val="bullet"/>
+      <w:lvlText w:val=""/>
+      <w:lvlJc w:val="left"/>
+      <w:pPr>
+        <w:tabs>
+          <w:tab w:val="num" w:pos="6480"/>
+        </w:tabs>
+        <w:ind w:left="6480" w:hanging="360"/>
+      </w:pPr>
+      <w:rPr>
+        <w:rFonts w:ascii="Wingdings" w:hAnsi="Wingdings" w:hint="default"/>
+        <w:sz w:val="20"/>
+      </w:rPr>
+    </w:lvl>
+  </w:abstractNum>
+  <w:abstractNum w:abstractNumId="26" w15:restartNumberingAfterBreak="0">
+    <w:nsid w:val="7C0C248B"/>
+    <w:multiLevelType w:val="multilevel"/>
+    <w:tmpl w:val="5F3E41D8"/>
+    <w:lvl w:ilvl="0">
+      <w:start w:val="1"/>
+      <w:numFmt w:val="bullet"/>
+      <w:lvlText w:val=""/>
+      <w:lvlJc w:val="left"/>
+      <w:pPr>
+        <w:tabs>
+          <w:tab w:val="num" w:pos="720"/>
+        </w:tabs>
+        <w:ind w:left="720" w:hanging="360"/>
+      </w:pPr>
+      <w:rPr>
+        <w:rFonts w:ascii="Symbol" w:hAnsi="Symbol" w:hint="default"/>
+        <w:sz w:val="20"/>
+      </w:rPr>
+    </w:lvl>
+    <w:lvl w:ilvl="1" w:tentative="1">
+      <w:start w:val="1"/>
+      <w:numFmt w:val="bullet"/>
+      <w:lvlText w:val="o"/>
+      <w:lvlJc w:val="left"/>
+      <w:pPr>
+        <w:tabs>
+          <w:tab w:val="num" w:pos="1440"/>
+        </w:tabs>
+        <w:ind w:left="1440" w:hanging="360"/>
+      </w:pPr>
+      <w:rPr>
+        <w:rFonts w:ascii="Courier New" w:hAnsi="Courier New" w:hint="default"/>
+        <w:sz w:val="20"/>
+      </w:rPr>
+    </w:lvl>
+    <w:lvl w:ilvl="2" w:tentative="1">
+      <w:start w:val="1"/>
+      <w:numFmt w:val="bullet"/>
+      <w:lvlText w:val=""/>
+      <w:lvlJc w:val="left"/>
+      <w:pPr>
+        <w:tabs>
+          <w:tab w:val="num" w:pos="2160"/>
+        </w:tabs>
+        <w:ind w:left="2160" w:hanging="360"/>
+      </w:pPr>
+      <w:rPr>
+        <w:rFonts w:ascii="Wingdings" w:hAnsi="Wingdings" w:hint="default"/>
+        <w:sz w:val="20"/>
+      </w:rPr>
+    </w:lvl>
+    <w:lvl w:ilvl="3" w:tentative="1">
+      <w:start w:val="1"/>
+      <w:numFmt w:val="bullet"/>
+      <w:lvlText w:val=""/>
+      <w:lvlJc w:val="left"/>
+      <w:pPr>
+        <w:tabs>
+          <w:tab w:val="num" w:pos="2880"/>
+        </w:tabs>
+        <w:ind w:left="2880" w:hanging="360"/>
+      </w:pPr>
+      <w:rPr>
+        <w:rFonts w:ascii="Wingdings" w:hAnsi="Wingdings" w:hint="default"/>
+        <w:sz w:val="20"/>
+      </w:rPr>
+    </w:lvl>
+    <w:lvl w:ilvl="4" w:tentative="1">
+      <w:start w:val="1"/>
+      <w:numFmt w:val="bullet"/>
+      <w:lvlText w:val=""/>
+      <w:lvlJc w:val="left"/>
+      <w:pPr>
+        <w:tabs>
+          <w:tab w:val="num" w:pos="3600"/>
+        </w:tabs>
+        <w:ind w:left="3600" w:hanging="360"/>
+      </w:pPr>
+      <w:rPr>
+        <w:rFonts w:ascii="Wingdings" w:hAnsi="Wingdings" w:hint="default"/>
+        <w:sz w:val="20"/>
+      </w:rPr>
+    </w:lvl>
+    <w:lvl w:ilvl="5" w:tentative="1">
+      <w:start w:val="1"/>
+      <w:numFmt w:val="bullet"/>
+      <w:lvlText w:val=""/>
+      <w:lvlJc w:val="left"/>
+      <w:pPr>
+        <w:tabs>
+          <w:tab w:val="num" w:pos="4320"/>
+        </w:tabs>
+        <w:ind w:left="4320" w:hanging="360"/>
+      </w:pPr>
+      <w:rPr>
+        <w:rFonts w:ascii="Wingdings" w:hAnsi="Wingdings" w:hint="default"/>
+        <w:sz w:val="20"/>
+      </w:rPr>
+    </w:lvl>
+    <w:lvl w:ilvl="6" w:tentative="1">
+      <w:start w:val="1"/>
+      <w:numFmt w:val="bullet"/>
+      <w:lvlText w:val=""/>
+      <w:lvlJc w:val="left"/>
+      <w:pPr>
+        <w:tabs>
+          <w:tab w:val="num" w:pos="5040"/>
+        </w:tabs>
+        <w:ind w:left="5040" w:hanging="360"/>
+      </w:pPr>
+      <w:rPr>
+        <w:rFonts w:ascii="Wingdings" w:hAnsi="Wingdings" w:hint="default"/>
+        <w:sz w:val="20"/>
+      </w:rPr>
+    </w:lvl>
+    <w:lvl w:ilvl="7" w:tentative="1">
+      <w:start w:val="1"/>
+      <w:numFmt w:val="bullet"/>
+      <w:lvlText w:val=""/>
+      <w:lvlJc w:val="left"/>
+      <w:pPr>
+        <w:tabs>
+          <w:tab w:val="num" w:pos="5760"/>
+        </w:tabs>
+        <w:ind w:left="5760" w:hanging="360"/>
+      </w:pPr>
+      <w:rPr>
+        <w:rFonts w:ascii="Wingdings" w:hAnsi="Wingdings" w:hint="default"/>
+        <w:sz w:val="20"/>
+      </w:rPr>
+    </w:lvl>
+    <w:lvl w:ilvl="8" w:tentative="1">
+      <w:start w:val="1"/>
+      <w:numFmt w:val="bullet"/>
+      <w:lvlText w:val=""/>
+      <w:lvlJc w:val="left"/>
+      <w:pPr>
+        <w:tabs>
+          <w:tab w:val="num" w:pos="6480"/>
+        </w:tabs>
+        <w:ind w:left="6480" w:hanging="360"/>
+      </w:pPr>
+      <w:rPr>
+        <w:rFonts w:ascii="Wingdings" w:hAnsi="Wingdings" w:hint="default"/>
+        <w:sz w:val="20"/>
+      </w:rPr>
+    </w:lvl>
+  </w:abstractNum>
+  <w:abstractNum w:abstractNumId="27" w15:restartNumberingAfterBreak="0">
+    <w:nsid w:val="7C2D1A85"/>
+    <w:multiLevelType w:val="multilevel"/>
+    <w:tmpl w:val="2A9E5644"/>
+    <w:lvl w:ilvl="0">
+      <w:start w:val="1"/>
+      <w:numFmt w:val="bullet"/>
+      <w:lvlText w:val=""/>
+      <w:lvlJc w:val="left"/>
+      <w:pPr>
+        <w:tabs>
+          <w:tab w:val="num" w:pos="720"/>
+        </w:tabs>
+        <w:ind w:left="720" w:hanging="360"/>
+      </w:pPr>
+      <w:rPr>
+        <w:rFonts w:ascii="Symbol" w:hAnsi="Symbol" w:hint="default"/>
+        <w:sz w:val="20"/>
+      </w:rPr>
+    </w:lvl>
+    <w:lvl w:ilvl="1" w:tentative="1">
+      <w:start w:val="1"/>
+      <w:numFmt w:val="bullet"/>
+      <w:lvlText w:val="o"/>
+      <w:lvlJc w:val="left"/>
+      <w:pPr>
+        <w:tabs>
+          <w:tab w:val="num" w:pos="1440"/>
+        </w:tabs>
+        <w:ind w:left="1440" w:hanging="360"/>
+      </w:pPr>
+      <w:rPr>
+        <w:rFonts w:ascii="Courier New" w:hAnsi="Courier New" w:hint="default"/>
+        <w:sz w:val="20"/>
+      </w:rPr>
+    </w:lvl>
+    <w:lvl w:ilvl="2" w:tentative="1">
+      <w:start w:val="1"/>
+      <w:numFmt w:val="bullet"/>
+      <w:lvlText w:val=""/>
+      <w:lvlJc w:val="left"/>
+      <w:pPr>
+        <w:tabs>
+          <w:tab w:val="num" w:pos="2160"/>
+        </w:tabs>
+        <w:ind w:left="2160" w:hanging="360"/>
+      </w:pPr>
+      <w:rPr>
+        <w:rFonts w:ascii="Wingdings" w:hAnsi="Wingdings" w:hint="default"/>
+        <w:sz w:val="20"/>
+      </w:rPr>
+    </w:lvl>
+    <w:lvl w:ilvl="3" w:tentative="1">
+      <w:start w:val="1"/>
+      <w:numFmt w:val="bullet"/>
+      <w:lvlText w:val=""/>
+      <w:lvlJc w:val="left"/>
+      <w:pPr>
+        <w:tabs>
+          <w:tab w:val="num" w:pos="2880"/>
+        </w:tabs>
+        <w:ind w:left="2880" w:hanging="360"/>
+      </w:pPr>
+      <w:rPr>
+        <w:rFonts w:ascii="Wingdings" w:hAnsi="Wingdings" w:hint="default"/>
+        <w:sz w:val="20"/>
+      </w:rPr>
+    </w:lvl>
+    <w:lvl w:ilvl="4" w:tentative="1">
+      <w:start w:val="1"/>
+      <w:numFmt w:val="bullet"/>
+      <w:lvlText w:val=""/>
+      <w:lvlJc w:val="left"/>
+      <w:pPr>
+        <w:tabs>
+          <w:tab w:val="num" w:pos="3600"/>
+        </w:tabs>
+        <w:ind w:left="3600" w:hanging="360"/>
+      </w:pPr>
+      <w:rPr>
+        <w:rFonts w:ascii="Wingdings" w:hAnsi="Wingdings" w:hint="default"/>
+        <w:sz w:val="20"/>
+      </w:rPr>
+    </w:lvl>
+    <w:lvl w:ilvl="5" w:tentative="1">
+      <w:start w:val="1"/>
+      <w:numFmt w:val="bullet"/>
+      <w:lvlText w:val=""/>
+      <w:lvlJc w:val="left"/>
+      <w:pPr>
+        <w:tabs>
+          <w:tab w:val="num" w:pos="4320"/>
+        </w:tabs>
+        <w:ind w:left="4320" w:hanging="360"/>
+      </w:pPr>
+      <w:rPr>
+        <w:rFonts w:ascii="Wingdings" w:hAnsi="Wingdings" w:hint="default"/>
+        <w:sz w:val="20"/>
+      </w:rPr>
+    </w:lvl>
+    <w:lvl w:ilvl="6" w:tentative="1">
+      <w:start w:val="1"/>
+      <w:numFmt w:val="bullet"/>
+      <w:lvlText w:val=""/>
+      <w:lvlJc w:val="left"/>
+      <w:pPr>
+        <w:tabs>
+          <w:tab w:val="num" w:pos="5040"/>
+        </w:tabs>
+        <w:ind w:left="5040" w:hanging="360"/>
+      </w:pPr>
+      <w:rPr>
+        <w:rFonts w:ascii="Wingdings" w:hAnsi="Wingdings" w:hint="default"/>
+        <w:sz w:val="20"/>
+      </w:rPr>
+    </w:lvl>
+    <w:lvl w:ilvl="7" w:tentative="1">
+      <w:start w:val="1"/>
+      <w:numFmt w:val="bullet"/>
+      <w:lvlText w:val=""/>
+      <w:lvlJc w:val="left"/>
+      <w:pPr>
+        <w:tabs>
+          <w:tab w:val="num" w:pos="5760"/>
+        </w:tabs>
+        <w:ind w:left="5760" w:hanging="360"/>
+      </w:pPr>
+      <w:rPr>
+        <w:rFonts w:ascii="Wingdings" w:hAnsi="Wingdings" w:hint="default"/>
+        <w:sz w:val="20"/>
+      </w:rPr>
+    </w:lvl>
+    <w:lvl w:ilvl="8" w:tentative="1">
+      <w:start w:val="1"/>
+      <w:numFmt w:val="bullet"/>
+      <w:lvlText w:val=""/>
+      <w:lvlJc w:val="left"/>
+      <w:pPr>
+        <w:tabs>
+          <w:tab w:val="num" w:pos="6480"/>
+        </w:tabs>
+        <w:ind w:left="6480" w:hanging="360"/>
+      </w:pPr>
+      <w:rPr>
+        <w:rFonts w:ascii="Wingdings" w:hAnsi="Wingdings" w:hint="default"/>
+        <w:sz w:val="20"/>
+      </w:rPr>
+    </w:lvl>
+  </w:abstractNum>
+  <w:num w:numId="1" w16cid:durableId="98919488">
+    <w:abstractNumId w:val="19"/>
+  </w:num>
+  <w:num w:numId="2" w16cid:durableId="1459840388">
+    <w:abstractNumId w:val="18"/>
+  </w:num>
+  <w:num w:numId="3" w16cid:durableId="869028827">
+    <w:abstractNumId w:val="17"/>
+  </w:num>
+  <w:num w:numId="4" w16cid:durableId="1101222794">
+    <w:abstractNumId w:val="14"/>
+  </w:num>
+  <w:num w:numId="5" w16cid:durableId="1244339564">
+    <w:abstractNumId w:val="11"/>
+  </w:num>
+  <w:num w:numId="6" w16cid:durableId="1736928483">
+    <w:abstractNumId w:val="25"/>
+  </w:num>
+  <w:num w:numId="7" w16cid:durableId="1820682211">
+    <w:abstractNumId w:val="27"/>
+  </w:num>
+  <w:num w:numId="8" w16cid:durableId="1472093168">
+    <w:abstractNumId w:val="15"/>
+  </w:num>
+  <w:num w:numId="9" w16cid:durableId="1967078391">
+    <w:abstractNumId w:val="20"/>
+  </w:num>
+  <w:num w:numId="10" w16cid:durableId="588973026">
+    <w:abstractNumId w:val="13"/>
+  </w:num>
+  <w:num w:numId="11" w16cid:durableId="585067717">
+    <w:abstractNumId w:val="7"/>
+  </w:num>
+  <w:num w:numId="12" w16cid:durableId="1452556839">
+    <w:abstractNumId w:val="1"/>
+  </w:num>
+  <w:num w:numId="13" w16cid:durableId="832725749">
+    <w:abstractNumId w:val="4"/>
+  </w:num>
+  <w:num w:numId="14" w16cid:durableId="2015372050">
     <w:abstractNumId w:val="3"/>
   </w:num>
-  <w:num w:numId="2" w16cid:durableId="1786852775">
-    <w:abstractNumId w:val="4"/>
+  <w:num w:numId="15" w16cid:durableId="1191411635">
+    <w:abstractNumId w:val="6"/>
   </w:num>
-  <w:num w:numId="3" w16cid:durableId="672338166">
-    <w:abstractNumId w:val="0"/>
+  <w:num w:numId="16" w16cid:durableId="1857847268">
+    <w:abstractNumId w:val="16"/>
   </w:num>
-  <w:num w:numId="4" w16cid:durableId="1834418353">
+  <w:num w:numId="17" w16cid:durableId="1488087561">
+    <w:abstractNumId w:val="8"/>
+  </w:num>
+  <w:num w:numId="18" w16cid:durableId="740911989">
+    <w:abstractNumId w:val="9"/>
+  </w:num>
+  <w:num w:numId="19" w16cid:durableId="1787309335">
+    <w:abstractNumId w:val="12"/>
+  </w:num>
+  <w:num w:numId="20" w16cid:durableId="845369395">
+    <w:abstractNumId w:val="5"/>
+  </w:num>
+  <w:num w:numId="21" w16cid:durableId="1113939622">
+    <w:abstractNumId w:val="24"/>
+  </w:num>
+  <w:num w:numId="22" w16cid:durableId="926616825">
+    <w:abstractNumId w:val="22"/>
+  </w:num>
+  <w:num w:numId="23" w16cid:durableId="1786071481">
+    <w:abstractNumId w:val="23"/>
+  </w:num>
+  <w:num w:numId="24" w16cid:durableId="385420669">
     <w:abstractNumId w:val="2"/>
   </w:num>
-  <w:num w:numId="5" w16cid:durableId="1041974292">
-    <w:abstractNumId w:val="1"/>
+  <w:num w:numId="25" w16cid:durableId="749347010">
+    <w:abstractNumId w:val="10"/>
+  </w:num>
+  <w:num w:numId="26" w16cid:durableId="1096707644">
+    <w:abstractNumId w:val="26"/>
+  </w:num>
+  <w:num w:numId="27" w16cid:durableId="163740309">
+    <w:abstractNumId w:val="21"/>
+  </w:num>
+  <w:num w:numId="28" w16cid:durableId="782307967">
+    <w:abstractNumId w:val="0"/>
   </w:num>
 </w:numbering>
 </file>
@@ -1708,7 +5491,7 @@
     <w:link w:val="Heading1Char"/>
     <w:uiPriority w:val="9"/>
     <w:qFormat/>
-    <w:rsid w:val="003402DE"/>
+    <w:rsid w:val="00601F7D"/>
     <w:pPr>
       <w:keepNext/>
       <w:keepLines/>
@@ -1731,7 +5514,7 @@
     <w:semiHidden/>
     <w:unhideWhenUsed/>
     <w:qFormat/>
-    <w:rsid w:val="003402DE"/>
+    <w:rsid w:val="00601F7D"/>
     <w:pPr>
       <w:keepNext/>
       <w:keepLines/>
@@ -1754,7 +5537,7 @@
     <w:semiHidden/>
     <w:unhideWhenUsed/>
     <w:qFormat/>
-    <w:rsid w:val="003402DE"/>
+    <w:rsid w:val="00601F7D"/>
     <w:pPr>
       <w:keepNext/>
       <w:keepLines/>
@@ -1777,7 +5560,7 @@
     <w:semiHidden/>
     <w:unhideWhenUsed/>
     <w:qFormat/>
-    <w:rsid w:val="003402DE"/>
+    <w:rsid w:val="00601F7D"/>
     <w:pPr>
       <w:keepNext/>
       <w:keepLines/>
@@ -1800,7 +5583,7 @@
     <w:semiHidden/>
     <w:unhideWhenUsed/>
     <w:qFormat/>
-    <w:rsid w:val="003402DE"/>
+    <w:rsid w:val="00601F7D"/>
     <w:pPr>
       <w:keepNext/>
       <w:keepLines/>
@@ -1821,7 +5604,7 @@
     <w:semiHidden/>
     <w:unhideWhenUsed/>
     <w:qFormat/>
-    <w:rsid w:val="003402DE"/>
+    <w:rsid w:val="00601F7D"/>
     <w:pPr>
       <w:keepNext/>
       <w:keepLines/>
@@ -1844,7 +5627,7 @@
     <w:semiHidden/>
     <w:unhideWhenUsed/>
     <w:qFormat/>
-    <w:rsid w:val="003402DE"/>
+    <w:rsid w:val="00601F7D"/>
     <w:pPr>
       <w:keepNext/>
       <w:keepLines/>
@@ -1865,7 +5648,7 @@
     <w:semiHidden/>
     <w:unhideWhenUsed/>
     <w:qFormat/>
-    <w:rsid w:val="003402DE"/>
+    <w:rsid w:val="00601F7D"/>
     <w:pPr>
       <w:keepNext/>
       <w:keepLines/>
@@ -1888,7 +5671,7 @@
     <w:semiHidden/>
     <w:unhideWhenUsed/>
     <w:qFormat/>
-    <w:rsid w:val="003402DE"/>
+    <w:rsid w:val="00601F7D"/>
     <w:pPr>
       <w:keepNext/>
       <w:keepLines/>
@@ -1931,7 +5714,7 @@
     <w:basedOn w:val="DefaultParagraphFont"/>
     <w:link w:val="Heading1"/>
     <w:uiPriority w:val="9"/>
-    <w:rsid w:val="003402DE"/>
+    <w:rsid w:val="00601F7D"/>
     <w:rPr>
       <w:rFonts w:asciiTheme="majorHAnsi" w:eastAsiaTheme="majorEastAsia" w:hAnsiTheme="majorHAnsi" w:cstheme="majorBidi"/>
       <w:color w:val="2F5496" w:themeColor="accent1" w:themeShade="BF"/>
@@ -1945,7 +5728,7 @@
     <w:link w:val="Heading2"/>
     <w:uiPriority w:val="9"/>
     <w:semiHidden/>
-    <w:rsid w:val="003402DE"/>
+    <w:rsid w:val="00601F7D"/>
     <w:rPr>
       <w:rFonts w:asciiTheme="majorHAnsi" w:eastAsiaTheme="majorEastAsia" w:hAnsiTheme="majorHAnsi" w:cstheme="majorBidi"/>
       <w:color w:val="2F5496" w:themeColor="accent1" w:themeShade="BF"/>
@@ -1959,7 +5742,7 @@
     <w:link w:val="Heading3"/>
     <w:uiPriority w:val="9"/>
     <w:semiHidden/>
-    <w:rsid w:val="003402DE"/>
+    <w:rsid w:val="00601F7D"/>
     <w:rPr>
       <w:rFonts w:eastAsiaTheme="majorEastAsia" w:cstheme="majorBidi"/>
       <w:color w:val="2F5496" w:themeColor="accent1" w:themeShade="BF"/>
@@ -1973,7 +5756,7 @@
     <w:link w:val="Heading4"/>
     <w:uiPriority w:val="9"/>
     <w:semiHidden/>
-    <w:rsid w:val="003402DE"/>
+    <w:rsid w:val="00601F7D"/>
     <w:rPr>
       <w:rFonts w:eastAsiaTheme="majorEastAsia" w:cstheme="majorBidi"/>
       <w:i/>
@@ -1987,7 +5770,7 @@
     <w:link w:val="Heading5"/>
     <w:uiPriority w:val="9"/>
     <w:semiHidden/>
-    <w:rsid w:val="003402DE"/>
+    <w:rsid w:val="00601F7D"/>
     <w:rPr>
       <w:rFonts w:eastAsiaTheme="majorEastAsia" w:cstheme="majorBidi"/>
       <w:color w:val="2F5496" w:themeColor="accent1" w:themeShade="BF"/>
@@ -1999,7 +5782,7 @@
     <w:link w:val="Heading6"/>
     <w:uiPriority w:val="9"/>
     <w:semiHidden/>
-    <w:rsid w:val="003402DE"/>
+    <w:rsid w:val="00601F7D"/>
     <w:rPr>
       <w:rFonts w:eastAsiaTheme="majorEastAsia" w:cstheme="majorBidi"/>
       <w:i/>
@@ -2013,7 +5796,7 @@
     <w:link w:val="Heading7"/>
     <w:uiPriority w:val="9"/>
     <w:semiHidden/>
-    <w:rsid w:val="003402DE"/>
+    <w:rsid w:val="00601F7D"/>
     <w:rPr>
       <w:rFonts w:eastAsiaTheme="majorEastAsia" w:cstheme="majorBidi"/>
       <w:color w:val="595959" w:themeColor="text1" w:themeTint="A6"/>
@@ -2025,7 +5808,7 @@
     <w:link w:val="Heading8"/>
     <w:uiPriority w:val="9"/>
     <w:semiHidden/>
-    <w:rsid w:val="003402DE"/>
+    <w:rsid w:val="00601F7D"/>
     <w:rPr>
       <w:rFonts w:eastAsiaTheme="majorEastAsia" w:cstheme="majorBidi"/>
       <w:i/>
@@ -2039,7 +5822,7 @@
     <w:link w:val="Heading9"/>
     <w:uiPriority w:val="9"/>
     <w:semiHidden/>
-    <w:rsid w:val="003402DE"/>
+    <w:rsid w:val="00601F7D"/>
     <w:rPr>
       <w:rFonts w:eastAsiaTheme="majorEastAsia" w:cstheme="majorBidi"/>
       <w:color w:val="272727" w:themeColor="text1" w:themeTint="D8"/>
@@ -2052,7 +5835,7 @@
     <w:link w:val="TitleChar"/>
     <w:uiPriority w:val="10"/>
     <w:qFormat/>
-    <w:rsid w:val="003402DE"/>
+    <w:rsid w:val="00601F7D"/>
     <w:pPr>
       <w:spacing w:after="80" w:line="240" w:lineRule="auto"/>
       <w:contextualSpacing/>
@@ -2070,7 +5853,7 @@
     <w:basedOn w:val="DefaultParagraphFont"/>
     <w:link w:val="Title"/>
     <w:uiPriority w:val="10"/>
-    <w:rsid w:val="003402DE"/>
+    <w:rsid w:val="00601F7D"/>
     <w:rPr>
       <w:rFonts w:asciiTheme="majorHAnsi" w:eastAsiaTheme="majorEastAsia" w:hAnsiTheme="majorHAnsi" w:cstheme="majorBidi"/>
       <w:spacing w:val="-10"/>
@@ -2086,7 +5869,7 @@
     <w:link w:val="SubtitleChar"/>
     <w:uiPriority w:val="11"/>
     <w:qFormat/>
-    <w:rsid w:val="003402DE"/>
+    <w:rsid w:val="00601F7D"/>
     <w:pPr>
       <w:numPr>
         <w:ilvl w:val="1"/>
@@ -2105,7 +5888,7 @@
     <w:basedOn w:val="DefaultParagraphFont"/>
     <w:link w:val="Subtitle"/>
     <w:uiPriority w:val="11"/>
-    <w:rsid w:val="003402DE"/>
+    <w:rsid w:val="00601F7D"/>
     <w:rPr>
       <w:rFonts w:eastAsiaTheme="majorEastAsia" w:cstheme="majorBidi"/>
       <w:color w:val="595959" w:themeColor="text1" w:themeTint="A6"/>
@@ -2121,7 +5904,7 @@
     <w:link w:val="QuoteChar"/>
     <w:uiPriority w:val="29"/>
     <w:qFormat/>
-    <w:rsid w:val="003402DE"/>
+    <w:rsid w:val="00601F7D"/>
     <w:pPr>
       <w:spacing w:before="160"/>
       <w:jc w:val="center"/>
@@ -2137,7 +5920,7 @@
     <w:basedOn w:val="DefaultParagraphFont"/>
     <w:link w:val="Quote"/>
     <w:uiPriority w:val="29"/>
-    <w:rsid w:val="003402DE"/>
+    <w:rsid w:val="00601F7D"/>
     <w:rPr>
       <w:i/>
       <w:iCs/>
@@ -2149,7 +5932,7 @@
     <w:basedOn w:val="Normal"/>
     <w:uiPriority w:val="34"/>
     <w:qFormat/>
-    <w:rsid w:val="003402DE"/>
+    <w:rsid w:val="00601F7D"/>
     <w:pPr>
       <w:ind w:left="720"/>
       <w:contextualSpacing/>
@@ -2160,7 +5943,7 @@
     <w:basedOn w:val="DefaultParagraphFont"/>
     <w:uiPriority w:val="21"/>
     <w:qFormat/>
-    <w:rsid w:val="003402DE"/>
+    <w:rsid w:val="00601F7D"/>
     <w:rPr>
       <w:i/>
       <w:iCs/>
@@ -2174,7 +5957,7 @@
     <w:link w:val="IntenseQuoteChar"/>
     <w:uiPriority w:val="30"/>
     <w:qFormat/>
-    <w:rsid w:val="003402DE"/>
+    <w:rsid w:val="00601F7D"/>
     <w:pPr>
       <w:pBdr>
         <w:top w:val="single" w:sz="4" w:space="10" w:color="2F5496" w:themeColor="accent1" w:themeShade="BF"/>
@@ -2195,7 +5978,7 @@
     <w:basedOn w:val="DefaultParagraphFont"/>
     <w:link w:val="IntenseQuote"/>
     <w:uiPriority w:val="30"/>
-    <w:rsid w:val="003402DE"/>
+    <w:rsid w:val="00601F7D"/>
     <w:rPr>
       <w:i/>
       <w:iCs/>
@@ -2207,13 +5990,36 @@
     <w:basedOn w:val="DefaultParagraphFont"/>
     <w:uiPriority w:val="32"/>
     <w:qFormat/>
-    <w:rsid w:val="003402DE"/>
+    <w:rsid w:val="00601F7D"/>
     <w:rPr>
       <w:b/>
       <w:bCs/>
       <w:smallCaps/>
       <w:color w:val="2F5496" w:themeColor="accent1" w:themeShade="BF"/>
       <w:spacing w:val="5"/>
+    </w:rPr>
+  </w:style>
+  <w:style w:type="character" w:styleId="Hyperlink">
+    <w:name w:val="Hyperlink"/>
+    <w:basedOn w:val="DefaultParagraphFont"/>
+    <w:uiPriority w:val="99"/>
+    <w:unhideWhenUsed/>
+    <w:rsid w:val="002802B7"/>
+    <w:rPr>
+      <w:color w:val="0563C1" w:themeColor="hyperlink"/>
+      <w:u w:val="single"/>
+    </w:rPr>
+  </w:style>
+  <w:style w:type="character" w:styleId="UnresolvedMention">
+    <w:name w:val="Unresolved Mention"/>
+    <w:basedOn w:val="DefaultParagraphFont"/>
+    <w:uiPriority w:val="99"/>
+    <w:semiHidden/>
+    <w:unhideWhenUsed/>
+    <w:rsid w:val="002802B7"/>
+    <w:rPr>
+      <w:color w:val="605E5C"/>
+      <w:shd w:val="clear" w:color="auto" w:fill="E1DFDD"/>
     </w:rPr>
   </w:style>
 </w:styles>

</xml_diff>